<commit_message>
Adiciona autor, iD ORCID e classificacao (v2.1)
- Bloco de autor com icone iD oficial (verde), formatos inline e completo,
  com link para https://orcid.org/0009-0002-9776-4906
- Classificacao: artigo cientifico de revisao; pesquisa bibliografica e
  documental; abordagem qualitativa; objetivo exploratorio
- Secao 9 ajustada para nao contradizer a classificacao
- Versao em PDF gerada a partir do mesmo texto

Co-Authored-By: Claude Opus 5.5 <noreply@anthropic.com>
Claude-Session: https://claude.ai/code/session_0169tbWs2aNNwTNJK7v1DKMj
</commit_message>
<xml_diff>
--- a/Da_lampada_ao_token_v2_CONSOLIDADO.docx
+++ b/Da_lampada_ao_token_v2_CONSOLIDADO.docx
@@ -23,33 +23,136 @@
         <w:pStyle w:val="Author"/>
       </w:pPr>
       <w:r>
-        <w:t xml:space="preserve">[Nome do autor]</w:t>
-      </w:r>
-    </w:p>
-    <w:p>
-      <w:pPr>
-        <w:pStyle w:val="Date"/>
-      </w:pPr>
-      <w:r>
-        <w:t xml:space="preserve">Versão 2.0 - consolidada em 04/10/2026</w:t>
-      </w:r>
-    </w:p>
-    <w:p>
-      <w:pPr>
-        <w:pStyle w:val="FirstParagraph"/>
-      </w:pPr>
-      <w:r>
         <w:rPr>
           <w:b/>
           <w:bCs/>
         </w:rPr>
-        <w:t xml:space="preserve">Tipo de texto:</w:t>
-      </w:r>
-      <w:r>
-        <w:t xml:space="preserve"> </w:t>
-      </w:r>
-      <w:r>
-        <w:t xml:space="preserve">ensaio analítico (revisão e posicionamento)</w:t>
+        <w:t xml:space="preserve">Ricardo Junqueira Malhão</w:t>
+      </w:r>
+      <w:r>
+        <w:t xml:space="preserve">  </w:t>
+      </w:r>
+      <w:hyperlink r:id="rId12">
+        <w:r>
+          <w:drawing>
+            <wp:inline>
+              <wp:extent cx="127000" cy="127000"/>
+              <wp:effectExtent b="0" l="0" r="0" t="0"/>
+              <wp:docPr descr="ORCID iD" title="" id="10" name="Picture"/>
+              <a:graphic>
+                <a:graphicData uri="http://schemas.openxmlformats.org/drawingml/2006/picture">
+                  <pic:pic>
+                    <pic:nvPicPr>
+                      <pic:cNvPr descr="assets/orcid_id_icon.png" id="11" name="Picture"/>
+                      <pic:cNvPicPr>
+                        <a:picLocks noChangeArrowheads="1" noChangeAspect="1"/>
+                      </pic:cNvPicPr>
+                    </pic:nvPicPr>
+                    <pic:blipFill>
+                      <a:blip r:embed="rId9"/>
+                      <a:stretch>
+                        <a:fillRect/>
+                      </a:stretch>
+                    </pic:blipFill>
+                    <pic:spPr bwMode="auto">
+                      <a:xfrm>
+                        <a:off x="0" y="0"/>
+                        <a:ext cx="127000" cy="127000"/>
+                      </a:xfrm>
+                      <a:prstGeom prst="rect">
+                        <a:avLst/>
+                      </a:prstGeom>
+                      <a:noFill/>
+                      <a:ln w="9525">
+                        <a:noFill/>
+                        <a:headEnd/>
+                        <a:tailEnd/>
+                      </a:ln>
+                    </pic:spPr>
+                  </pic:pic>
+                </a:graphicData>
+              </a:graphic>
+            </wp:inline>
+          </w:drawing>
+        </w:r>
+      </w:hyperlink>
+    </w:p>
+    <w:p>
+      <w:pPr>
+        <w:pStyle w:val="Author"/>
+      </w:pPr>
+      <w:hyperlink r:id="rId12">
+        <w:r>
+          <w:drawing>
+            <wp:inline>
+              <wp:extent cx="127000" cy="127000"/>
+              <wp:effectExtent b="0" l="0" r="0" t="0"/>
+              <wp:docPr descr="ORCID iD" title="" id="13" name="Picture"/>
+              <a:graphic>
+                <a:graphicData uri="http://schemas.openxmlformats.org/drawingml/2006/picture">
+                  <pic:pic>
+                    <pic:nvPicPr>
+                      <pic:cNvPr descr="assets/orcid_id_icon.png" id="14" name="Picture"/>
+                      <pic:cNvPicPr>
+                        <a:picLocks noChangeArrowheads="1" noChangeAspect="1"/>
+                      </pic:cNvPicPr>
+                    </pic:nvPicPr>
+                    <pic:blipFill>
+                      <a:blip r:embed="rId9"/>
+                      <a:stretch>
+                        <a:fillRect/>
+                      </a:stretch>
+                    </pic:blipFill>
+                    <pic:spPr bwMode="auto">
+                      <a:xfrm>
+                        <a:off x="0" y="0"/>
+                        <a:ext cx="127000" cy="127000"/>
+                      </a:xfrm>
+                      <a:prstGeom prst="rect">
+                        <a:avLst/>
+                      </a:prstGeom>
+                      <a:noFill/>
+                      <a:ln w="9525">
+                        <a:noFill/>
+                        <a:headEnd/>
+                        <a:tailEnd/>
+                      </a:ln>
+                    </pic:spPr>
+                  </pic:pic>
+                </a:graphicData>
+              </a:graphic>
+            </wp:inline>
+          </w:drawing>
+        </w:r>
+      </w:hyperlink>
+      <w:r>
+        <w:t xml:space="preserve">  </w:t>
+      </w:r>
+      <w:hyperlink r:id="rId12">
+        <w:r>
+          <w:rPr>
+            <w:rStyle w:val="Hyperlink"/>
+          </w:rPr>
+          <w:t xml:space="preserve">https://orcid.org/0009-0002-9776-4906</w:t>
+        </w:r>
+      </w:hyperlink>
+    </w:p>
+    <w:p>
+      <w:pPr>
+        <w:pStyle w:val="BodyText"/>
+      </w:pPr>
+      <w:r>
+        <w:rPr>
+          <w:b/>
+          <w:bCs/>
+        </w:rPr>
+        <w:t xml:space="preserve">Classificação:</w:t>
+      </w:r>
+      <w:r>
+        <w:t xml:space="preserve"> </w:t>
+      </w:r>
+      <w:r>
+        <w:t xml:space="preserve">artigo científico de revisão (ensaio teórico); pesquisa bibliográfica e documental; abordagem qualitativa; objetivo exploratório.</w:t>
       </w:r>
     </w:p>
     <w:p>
@@ -67,10 +170,10 @@
         <w:t xml:space="preserve"> </w:t>
       </w:r>
       <w:r>
-        <w:t xml:space="preserve">2.0, consolidada a partir de 7 arquivos. Os 39 fatos da versão 1.0 (congelada em 25/09/2026) foram mantidos sem alteração. Acréscimos da v2.0 estão listados no Registro de Fatos v2 e na Nota sobre o estado de verificação.</w:t>
-      </w:r>
-    </w:p>
-    <w:bookmarkStart w:id="9" w:name="resumo"/>
+        <w:t xml:space="preserve">2.1, de 05/10/2026, consolidada a partir de 7 arquivos. Os 39 fatos da versão 1.0 (congelada em 25/09/2026) foram mantidos sem alteração. Acréscimos da v2.0 estão listados no Registro de Fatos v2 e na Nota sobre o estado de verificação.</w:t>
+      </w:r>
+    </w:p>
+    <w:bookmarkStart w:id="15" w:name="resumo"/>
     <w:p>
       <w:pPr>
         <w:pStyle w:val="Heading1"/>
@@ -117,8 +220,8 @@
         <w:t xml:space="preserve">obsolescência programada; assimetria de informação; enshittification; quantização; padrões obscuros; auditoria capturada; bajulação; modelos de linguagem; custo de inferência.</w:t>
       </w:r>
     </w:p>
-    <w:bookmarkEnd w:id="9"/>
-    <w:bookmarkStart w:id="10" w:name="introdução"/>
+    <w:bookmarkEnd w:id="15"/>
+    <w:bookmarkStart w:id="16" w:name="introdução"/>
     <w:p>
       <w:pPr>
         <w:pStyle w:val="Heading1"/>
@@ -167,8 +270,8 @@
         <w:t xml:space="preserve">Este ensaio não adere à acusação nem a refuta por reflexo. Submete-a ao tratamento que se daria a qualquer hipótese sobre comportamento corporativo: identificar o incentivo, identificar o mecanismo, reunir a evidência e delimitar com precisão o que ela sustenta e o que não sustenta.</w:t>
       </w:r>
     </w:p>
-    <w:bookmarkEnd w:id="10"/>
-    <w:bookmarkStart w:id="11" w:name="pergunta-de-pesquisa-e-recorte"/>
+    <w:bookmarkEnd w:id="16"/>
+    <w:bookmarkStart w:id="17" w:name="pergunta-de-pesquisa-e-recorte"/>
     <w:p>
       <w:pPr>
         <w:pStyle w:val="Heading1"/>
@@ -225,8 +328,8 @@
         <w:t xml:space="preserve">Terceira: o ensaio distingue o que está documentado por fonte primária, o que está medido por terceiros e o que é inferência. Essa separação é o que diferencia argumento de convicção.</w:t>
       </w:r>
     </w:p>
-    <w:bookmarkEnd w:id="11"/>
-    <w:bookmarkStart w:id="19" w:name="referencial-teórico"/>
+    <w:bookmarkEnd w:id="17"/>
+    <w:bookmarkStart w:id="25" w:name="referencial-teórico"/>
     <w:p>
       <w:pPr>
         <w:pStyle w:val="Heading1"/>
@@ -235,7 +338,7 @@
         <w:t xml:space="preserve">3. Referencial teórico</w:t>
       </w:r>
     </w:p>
-    <w:bookmarkStart w:id="12" w:name="obsolescência-programada"/>
+    <w:bookmarkStart w:id="18" w:name="obsolescência-programada"/>
     <w:p>
       <w:pPr>
         <w:pStyle w:val="Heading2"/>
@@ -276,8 +379,8 @@
         <w:t xml:space="preserve">A transposição para serviços de IA exige cuidado. O modelo de Bulow descreve venda repetida de bem durável. Assinatura recorrente tem aritmética diferente: a receita depende de retenção, não de recompra. Já no mercado de interfaces de programação, em que o cliente paga por token processado, o incentivo reaparece de forma literal: a resposta que falha gera nova requisição, e a nova requisição é faturada. A seção 6.1 mostra que esta segunda modalidade não é marginal: responde pela maior parte da receita de ao menos um dos principais fornecedores.</w:t>
       </w:r>
     </w:p>
-    <w:bookmarkEnd w:id="12"/>
-    <w:bookmarkStart w:id="13" w:name="incentivos-perversos"/>
+    <w:bookmarkEnd w:id="18"/>
+    <w:bookmarkStart w:id="19" w:name="incentivos-perversos"/>
     <w:p>
       <w:pPr>
         <w:pStyle w:val="Heading2"/>
@@ -294,8 +397,8 @@
         <w:t xml:space="preserve">O conceito, associado ao economista Horst Siebert e popularizado como efeito cobra, descreve políticas que recompensam o comportamento que pretendiam suprimir. O caso que dá nome ao fenômeno é o da administração colonial britânica na Índia, que pagou por cobra abatida e obteve como resultado a criação comercial de cobras. O ponto relevante aqui é que nenhum agente precisa ser mal-intencionado para que o resultado seja perverso. Basta que a métrica premiada não coincida com o objetivo declarado.</w:t>
       </w:r>
     </w:p>
-    <w:bookmarkEnd w:id="13"/>
-    <w:bookmarkStart w:id="14" w:name="assimetria-de-informação"/>
+    <w:bookmarkEnd w:id="19"/>
+    <w:bookmarkStart w:id="20" w:name="assimetria-de-informação"/>
     <w:p>
       <w:pPr>
         <w:pStyle w:val="Heading2"/>
@@ -336,8 +439,8 @@
         <w:t xml:space="preserve">Este referencial encaixa no objeto deste ensaio com mais precisão do que Bulow. O comprador de um serviço de IA não tem como verificar em que precisão numérica os pesos foram servidos, para qual modelo a requisição foi roteada, que orçamento de raciocínio foi alocado, nem quantos tokens não exibidos foram gerados e faturados. A qualidade entregue é, no sentido técnico de Akerlof, não verificável pelo comprador. A seção 5.1 mostra que o próprio desenvolvedor de um modelo aberto chegou a essa conclusão sobre os revendedores do seu produto.</w:t>
       </w:r>
     </w:p>
-    <w:bookmarkEnd w:id="14"/>
-    <w:bookmarkStart w:id="15" w:name="padrões-obscuros"/>
+    <w:bookmarkEnd w:id="20"/>
+    <w:bookmarkStart w:id="21" w:name="padrões-obscuros"/>
     <w:p>
       <w:pPr>
         <w:pStyle w:val="Heading2"/>
@@ -370,8 +473,8 @@
         <w:t xml:space="preserve">para designar escolhas de projeto de interface que dificultam a vida do usuário em benefício do operador. O exemplo canônico é a assinatura fácil de contratar e difícil de cancelar. Um mecanismo central nesses padrões é o valor padrão: a maioria dos usuários não altera o que vem configurado de fábrica. A seção 6.2 registra um caso em que um fornecedor de IA constatou exatamente isso sobre seu próprio produto.</w:t>
       </w:r>
     </w:p>
-    <w:bookmarkEnd w:id="15"/>
-    <w:bookmarkStart w:id="16" w:name="lei-de-goodhart-e-reward-hacking"/>
+    <w:bookmarkEnd w:id="21"/>
+    <w:bookmarkStart w:id="22" w:name="lei-de-goodhart-e-reward-hacking"/>
     <w:p>
       <w:pPr>
         <w:pStyle w:val="Heading2"/>
@@ -409,8 +512,8 @@
         <w:t xml:space="preserve">Este é o elo menos especulativo da cadeia argumentativa, porque não depende de hipótese alguma sobre a conduta das empresas. Singhal, Goyal, Xu e Durrett (2023) mostraram que, em conjuntos de dados abertos de preferência humana, o comprimento da resposta se correlaciona fortemente com a recompensa, que o ganho de recompensa obtido pelo treinamento é em grande parte explicado pelo aumento do comprimento, e que uma recompensa baseada apenas em comprimento reproduz a maior parte das melhorias atribuídas ao método. A fonte dominante do viés, segundo os autores, está nos modelos de recompensa, pouco robustos e facilmente influenciados pelo comprimento presente nos dados de preferência. Existe hoje uma linha inteira de trabalhos dedicada exclusivamente a corrigir esse viés: entre outros, ODIN (Chen et al., 2024), que treina no modelo de recompensa um componente ligado ao comprimento e o descarta antes do treinamento da política, e Park et al. (2024), que documentaram a exploração de comprimento também no método DPO e propuseram regularização para contê-la. Ninguém desenvolve correção para um defeito inexistente.</w:t>
       </w:r>
     </w:p>
-    <w:bookmarkEnd w:id="16"/>
-    <w:bookmarkStart w:id="17" w:name="enshittification"/>
+    <w:bookmarkEnd w:id="22"/>
+    <w:bookmarkStart w:id="23" w:name="enshittification"/>
     <w:p>
       <w:pPr>
         <w:pStyle w:val="Heading2"/>
@@ -435,8 +538,8 @@
         <w:t xml:space="preserve">Sua contribuição para este ensaio é descritiva, não probatória: fornece o formato esperado da degradação, que é gradual, silenciosa e posterior à conquista do mercado.</w:t>
       </w:r>
     </w:p>
-    <w:bookmarkEnd w:id="17"/>
-    <w:bookmarkStart w:id="18" w:name="bajulação"/>
+    <w:bookmarkEnd w:id="23"/>
+    <w:bookmarkStart w:id="24" w:name="bajulação"/>
     <w:p>
       <w:pPr>
         <w:pStyle w:val="Heading2"/>
@@ -471,9 +574,9 @@
         <w:t xml:space="preserve">A consequência é direta: um assistente treinado assim tende a ceder à insistência do interlocutor. O que ele diz sob pressão informa sobre a pressão, não sobre o fato.</w:t>
       </w:r>
     </w:p>
-    <w:bookmarkEnd w:id="18"/>
-    <w:bookmarkEnd w:id="19"/>
-    <w:bookmarkStart w:id="26" w:name="precedentes-históricos"/>
+    <w:bookmarkEnd w:id="24"/>
+    <w:bookmarkEnd w:id="25"/>
+    <w:bookmarkStart w:id="32" w:name="precedentes-históricos"/>
     <w:p>
       <w:pPr>
         <w:pStyle w:val="Heading1"/>
@@ -490,7 +593,7 @@
         <w:t xml:space="preserve">A força do argumento examinado não vem da teoria, e sim do histórico. Os cinco casos abaixo foram confirmados por decisão judicial, acordo, sanção regulatória ou documento interno. Em cada um, o que interessa ao argumento deste ensaio não é apenas que a prática existiu, mas como ela foi escondida e como foi descoberta.</w:t>
       </w:r>
     </w:p>
-    <w:bookmarkStart w:id="20" w:name="o-cartel-phoebus-1925-a-1939"/>
+    <w:bookmarkStart w:id="26" w:name="o-cartel-phoebus-1925-a-1939"/>
     <w:p>
       <w:pPr>
         <w:pStyle w:val="Heading2"/>
@@ -523,8 +626,8 @@
         <w:t xml:space="preserve">Parte da documentação interna só veio a público décadas depois, em pesquisa nos arquivos das empresas. Numa correspondência de 1927 localizada dessa forma, um dos membros relatou ao cartel ter encurtado a vida de suas lâmpadas e, com isso, aumentado as vendas. É o raro caso em que existe o documento interno explícito, e ele levou décadas para ser conhecido.</w:t>
       </w:r>
     </w:p>
-    <w:bookmarkEnd w:id="20"/>
-    <w:bookmarkStart w:id="21" w:name="batterygate-2016-a-2020"/>
+    <w:bookmarkEnd w:id="26"/>
+    <w:bookmarkStart w:id="27" w:name="batterygate-2016-a-2020"/>
     <w:p>
       <w:pPr>
         <w:pStyle w:val="Heading2"/>
@@ -549,8 +652,8 @@
         <w:t xml:space="preserve">As consequências vieram em 2020: multa de 25 milhões de euros aplicada pela autoridade francesa de defesa do consumidor em fevereiro; acordo de até 500 milhões de dólares em ação coletiva nos Estados Unidos no mesmo mês, sem admissão de culpa; e acordo de 113 milhões de dólares com 34 estados americanos e o Distrito de Colúmbia em novembro. A procuradoria do Arizona registrou em sua petição que muitos consumidores concluíram que a única forma de recuperar desempenho era comprar um aparelho novo, e que a empresa compreendia perfeitamente esse efeito sobre suas vendas.</w:t>
       </w:r>
     </w:p>
-    <w:bookmarkEnd w:id="21"/>
-    <w:bookmarkStart w:id="22" w:name="impressoras-e-cartuchos-2017-a-2027"/>
+    <w:bookmarkEnd w:id="27"/>
+    <w:bookmarkStart w:id="28" w:name="impressoras-e-cartuchos-2017-a-2027"/>
     <w:p>
       <w:pPr>
         <w:pStyle w:val="Heading2"/>
@@ -583,8 +686,8 @@
         <w:t xml:space="preserve">Dois pontos importam aqui. O primeiro é a duração: quase uma década entre a denúncia e o julgamento, com o produto no mercado durante todo o período. O segundo é o texto da lei francesa de 2015 que tipifica o crime: ela abrange expressamente as técnicas, inclusive de software, pelas quais o responsável pela colocação de um produto no mercado busca reduzir deliberadamente sua vida útil. A degradação por software já é, portanto, categoria jurídica existente.</w:t>
       </w:r>
     </w:p>
-    <w:bookmarkEnd w:id="22"/>
-    <w:bookmarkStart w:id="23" w:name="dieselgate-2009-a-2015"/>
+    <w:bookmarkEnd w:id="28"/>
+    <w:bookmarkStart w:id="29" w:name="dieselgate-2009-a-2015"/>
     <w:p>
       <w:pPr>
         <w:pStyle w:val="Heading2"/>
@@ -609,8 +712,8 @@
         <w:t xml:space="preserve">Os veículos em questão haviam sido aprovados em certificação oficial durante anos. O software identificava a condição de teste de laboratório, a partir de variáveis como posição do volante, velocidade e tempo de funcionamento, e ativava o controle de emissões apenas durante a medição. Informado dos resultados em 2014, o fabricante contestou os dados e realizou um recall voluntário que não resolveu o problema. Em 18 de setembro de 2015, a agência ambiental americana emitiu notificação formal de violação. A fraude atingiu cerca de 11 milhões de veículos no mundo.</w:t>
       </w:r>
     </w:p>
-    <w:bookmarkEnd w:id="23"/>
-    <w:bookmarkStart w:id="24" w:name="Xc56e7dc16fadbd39fd4f6cb9cd44f0a53d67a36"/>
+    <w:bookmarkEnd w:id="29"/>
+    <w:bookmarkStart w:id="30" w:name="Xc56e7dc16fadbd39fd4f6cb9cd44f0a53d67a36"/>
     <w:p>
       <w:pPr>
         <w:pStyle w:val="Heading2"/>
@@ -627,8 +730,8 @@
         <w:t xml:space="preserve">O ácido perfluorooctanoico foi utilizado na fabricação de revestimentos antiaderentes desde os anos 1950 até 2013. Litígios iniciados em 1998 trouxeram a público estudos internos da própria empresa sobre a toxicidade do composto, que foi lançado por décadas no ambiente ao redor de uma planta industrial. Em 2005, a agência ambiental americana aplicou penalidade de 16,5 milhões de dólares especificamente por falha em divulgar riscos à saúde. Um painel científico criado por acordo judicial associou a exposição a doenças graves, incluindo câncer de rim e de testículo. Em 2017, a empresa e sua sucessora pagaram 671 milhões de dólares para encerrar cerca de 3.550 ações, negando irregularidade.</w:t>
       </w:r>
     </w:p>
-    <w:bookmarkEnd w:id="24"/>
-    <w:bookmarkStart w:id="25" w:name="o-padrão-comum"/>
+    <w:bookmarkEnd w:id="30"/>
+    <w:bookmarkStart w:id="31" w:name="o-padrão-comum"/>
     <w:p>
       <w:pPr>
         <w:pStyle w:val="Heading2"/>
@@ -732,9 +835,9 @@
         <w:t xml:space="preserve">A seção 6 examina se essas quatro constantes aparecem no mercado de modelos de linguagem.</w:t>
       </w:r>
     </w:p>
-    <w:bookmarkEnd w:id="25"/>
-    <w:bookmarkEnd w:id="26"/>
-    <w:bookmarkStart w:id="33" w:name="Xb5283d670a36eb4827d3a30bdfe3b4c98f60fb2"/>
+    <w:bookmarkEnd w:id="31"/>
+    <w:bookmarkEnd w:id="32"/>
+    <w:bookmarkStart w:id="39" w:name="Xb5283d670a36eb4827d3a30bdfe3b4c98f60fb2"/>
     <w:p>
       <w:pPr>
         <w:pStyle w:val="Heading1"/>
@@ -751,7 +854,7 @@
         <w:t xml:space="preserve">A pergunta prática é se existe, tecnicamente, um botão. Existem vários. Todos são invisíveis para o cliente.</w:t>
       </w:r>
     </w:p>
-    <w:bookmarkStart w:id="27" w:name="quantização"/>
+    <w:bookmarkStart w:id="33" w:name="quantização"/>
     <w:p>
       <w:pPr>
         <w:pStyle w:val="Heading2"/>
@@ -784,8 +887,8 @@
         <w:t xml:space="preserve">Há evidência direta de que essa escolha afeta o que o cliente recebe. Em 2025, a desenvolvedora de um modelo de pesos abertos criou uma ferramenta pública de verificação de revendedores, após constatar diferenças consideráveis de desempenho entre provedores que ofereciam o mesmo modelo pelo mesmo nome. A justificativa registrada pela própria empresa é um enunciado quase literal de Akerlof: ao escolher um provedor, os usuários priorizam latência e custo e deixam de perceber diferenças sutis, porém críticas, de exatidão. O verificador compara cada revendedor com a interface oficial em 4.000 requisições. Ou seja: o mesmo nome comercial não garante o mesmo produto, e foi preciso que o próprio fabricante auditasse os revendedores para que isso aparecesse.</w:t>
       </w:r>
     </w:p>
-    <w:bookmarkEnd w:id="27"/>
-    <w:bookmarkStart w:id="28" w:name="roteamento-entre-modelos-e-servidores"/>
+    <w:bookmarkEnd w:id="33"/>
+    <w:bookmarkStart w:id="34" w:name="roteamento-entre-modelos-e-servidores"/>
     <w:p>
       <w:pPr>
         <w:pStyle w:val="Heading2"/>
@@ -802,8 +905,8 @@
         <w:t xml:space="preserve">Sistemas comerciais podem direcionar requisições para modelos ou configurações de servidor distintos conforme complexidade estimada, custo ou carga. Onde isso é anunciado, é recurso. Onde não é, é indistinguível, do lado do cliente, de variação aleatória de qualidade. A seção 6.2 descreve um incidente em que um erro de roteamento degradou parte expressiva das respostas por semanas.</w:t>
       </w:r>
     </w:p>
-    <w:bookmarkEnd w:id="28"/>
-    <w:bookmarkStart w:id="29" w:name="esforço-de-raciocínio"/>
+    <w:bookmarkEnd w:id="34"/>
+    <w:bookmarkStart w:id="35" w:name="esforço-de-raciocínio"/>
     <w:p>
       <w:pPr>
         <w:pStyle w:val="Heading2"/>
@@ -828,8 +931,8 @@
         <w:t xml:space="preserve">Registra-se aqui uma correção que o argumento popular costuma precisar: cabeças de atenção não são reguláveis por requisição, são fixas na arquitetura treinada. Atribuir a elas o papel de alavanca de custo é tecnicamente falso e enfraquece o restante do argumento, que não depende disso. Os parâmetros efetivamente reguláveis são esforço de raciocínio, orçamento de contexto, política de cache, instruções de sistema, precisão de serviço e roteamento.</w:t>
       </w:r>
     </w:p>
-    <w:bookmarkEnd w:id="29"/>
-    <w:bookmarkStart w:id="30" w:name="política-de-cache"/>
+    <w:bookmarkEnd w:id="35"/>
+    <w:bookmarkStart w:id="36" w:name="política-de-cache"/>
     <w:p>
       <w:pPr>
         <w:pStyle w:val="Heading2"/>
@@ -846,8 +949,8 @@
         <w:t xml:space="preserve">Reaproveitar o estado já computado de uma conversa reduz custo de forma significativa. Uma falha nessa política pode elevar o consumo contabilizado contra a cota do usuário sem que nada na interface indique a mudança. A seção 6.2 registra exatamente esse caso.</w:t>
       </w:r>
     </w:p>
-    <w:bookmarkEnd w:id="30"/>
-    <w:bookmarkStart w:id="31" w:name="tokens-não-exibidos"/>
+    <w:bookmarkEnd w:id="36"/>
+    <w:bookmarkStart w:id="37" w:name="tokens-não-exibidos"/>
     <w:p>
       <w:pPr>
         <w:pStyle w:val="Heading2"/>
@@ -872,8 +975,8 @@
         <w:t xml:space="preserve">É importante ler esses trabalhos corretamente. Eles não demonstram que algum fornecedor inflou a cobrança. Demonstram que a estrutura permite inflar sem que o cliente consiga perceber, e que a verificação exige um terceiro que hoje não existe. Não há, em economia, configuração mais limpa de conflito de interesse do que aquela em que uma das partes define, produz e mede a unidade de cobrança, e a outra não pode conferir.</w:t>
       </w:r>
     </w:p>
-    <w:bookmarkEnd w:id="31"/>
-    <w:bookmarkStart w:id="32" w:name="viés-de-comprimento-no-treinamento"/>
+    <w:bookmarkEnd w:id="37"/>
+    <w:bookmarkStart w:id="38" w:name="viés-de-comprimento-no-treinamento"/>
     <w:p>
       <w:pPr>
         <w:pStyle w:val="Heading2"/>
@@ -890,9 +993,9 @@
         <w:t xml:space="preserve">Independentemente de qualquer decisão de infraestrutura, o treinamento por preferência humana introduz preferência sistemática por respostas longas, conforme a seção 3.5. O produto entregue ao usuário é, por construção do treinamento, mais longo do que precisaria ser. Em serviço faturado por token, mais longo significa mais caro. Um fornecedor admitiu publicamente, em 2026, que seu modelo mais recente era notavelmente verborrágico e que isso produzia mais tokens de saída.</w:t>
       </w:r>
     </w:p>
-    <w:bookmarkEnd w:id="32"/>
-    <w:bookmarkEnd w:id="33"/>
-    <w:bookmarkStart w:id="46" w:name="a-evidência-disponível"/>
+    <w:bookmarkEnd w:id="38"/>
+    <w:bookmarkEnd w:id="39"/>
+    <w:bookmarkStart w:id="52" w:name="a-evidência-disponível"/>
     <w:p>
       <w:pPr>
         <w:pStyle w:val="Heading1"/>
@@ -901,7 +1004,7 @@
         <w:t xml:space="preserve">6. A evidência disponível</w:t>
       </w:r>
     </w:p>
-    <w:bookmarkStart w:id="34" w:name="X41d356d8dbcd60a25f86cfedd5dad83f56ff730"/>
+    <w:bookmarkStart w:id="40" w:name="X41d356d8dbcd60a25f86cfedd5dad83f56ff730"/>
     <w:p>
       <w:pPr>
         <w:pStyle w:val="Heading2"/>
@@ -942,8 +1045,8 @@
         <w:t xml:space="preserve">Nenhum desses dados prova degradação. Eles provam que existe, documentada, uma pressão financeira forte e específica sobre exatamente as variáveis que determinam a qualidade entregue.</w:t>
       </w:r>
     </w:p>
-    <w:bookmarkEnd w:id="34"/>
-    <w:bookmarkStart w:id="39" w:name="X7f27fdd2819f80c4b0f9b2f1406c13fe6af8623"/>
+    <w:bookmarkEnd w:id="40"/>
+    <w:bookmarkStart w:id="45" w:name="X7f27fdd2819f80c4b0f9b2f1406c13fe6af8623"/>
     <w:p>
       <w:pPr>
         <w:pStyle w:val="Heading2"/>
@@ -960,7 +1063,7 @@
         <w:t xml:space="preserve">A evidência mais forte sobre degradação silenciosa não vem de usuários nem de pesquisadores: vem de relatórios técnicos que os próprios fornecedores publicaram depois que as reclamações se acumularam. Três episódios estão documentados.</w:t>
       </w:r>
     </w:p>
-    <w:bookmarkStart w:id="35" w:name="dezembro-de-2023"/>
+    <w:bookmarkStart w:id="41" w:name="dezembro-de-2023"/>
     <w:p>
       <w:pPr>
         <w:pStyle w:val="Heading3"/>
@@ -977,8 +1080,8 @@
         <w:t xml:space="preserve">Usuários passaram a relatar que um dos modelos mais usados do mercado havia se tornado preguiçoso, recusando-se a concluir tarefas ou entregando respostas incompletas. O fornecedor reconheceu publicamente o problema, afirmou não ter alterado o modelo desde novembro e disse que o comportamento certamente não era intencional. Uma versão corrigida foi lançada em janeiro de 2024. A empresa não detalhou publicamente o que mudou.</w:t>
       </w:r>
     </w:p>
-    <w:bookmarkEnd w:id="35"/>
-    <w:bookmarkStart w:id="36" w:name="agosto-e-setembro-de-2025"/>
+    <w:bookmarkEnd w:id="41"/>
+    <w:bookmarkStart w:id="42" w:name="agosto-e-setembro-de-2025"/>
     <w:p>
       <w:pPr>
         <w:pStyle w:val="Heading3"/>
@@ -995,8 +1098,8 @@
         <w:t xml:space="preserve">Um fornecedor publicou relatório descrevendo três falhas de infraestrutura que degradaram intermitentemente a qualidade das respostas entre agosto e o início de setembro de 2025. Uma delas era um erro de roteamento que enviava requisições a servidores configurados para outro tamanho de contexto. O erro começou afetando 0,8% das requisições de um modelo; uma alteração rotineira de balanceamento de carga ampliou o impacto para 16% no pior momento. Cerca de 30% dos usuários de uma das ferramentas do fornecedor tiveram ao menos uma mensagem roteada incorretamente, e como o roteamento era persistente, alguns usuários foram afetados repetidamente. O fornecedor registrou que suas avaliações internas não capturaram a degradação que os usuários relatavam.</w:t>
       </w:r>
     </w:p>
-    <w:bookmarkEnd w:id="36"/>
-    <w:bookmarkStart w:id="37" w:name="março-e-abril-de-2026"/>
+    <w:bookmarkEnd w:id="42"/>
+    <w:bookmarkStart w:id="43" w:name="março-e-abril-de-2026"/>
     <w:p>
       <w:pPr>
         <w:pStyle w:val="Heading3"/>
@@ -1101,8 +1204,8 @@
         <w:t xml:space="preserve">O relatório afirma também que a empresa nunca degrada intencionalmente seus modelos e que a interface de programação e a camada de inferência não foram afetadas. Não há razão para supor que essa afirmação seja falsa; ela é compatível com os fatos narrados, que descrevem decisões de produto e defeitos, não uma ordem para piorar o serviço. A seção 6.5 trata do valor informativo dessa afirmação.</w:t>
       </w:r>
     </w:p>
-    <w:bookmarkEnd w:id="37"/>
-    <w:bookmarkStart w:id="38" w:name="o-que-os-três-episódios-estabelecem"/>
+    <w:bookmarkEnd w:id="43"/>
+    <w:bookmarkStart w:id="44" w:name="o-que-os-três-episódios-estabelecem"/>
     <w:p>
       <w:pPr>
         <w:pStyle w:val="Heading3"/>
@@ -1119,9 +1222,9 @@
         <w:t xml:space="preserve">Três conclusões se extraem desses documentos sem necessidade de inferência. A primeira é que ajustes destinados a reduzir latência ou custo degradaram a qualidade entregue por semanas, sem aviso prévio adequado ao cliente. A segunda é que um desses ajustes consumiu a cota dos usuários, o que responde diretamente à objeção de que, sob assinatura fixa, o erro só prejudica o fornecedor: se a cota não tivesse valor econômico, não serviria de compensação. A terceira é que, nas três ocasiões, a detecção dependeu da reclamação agregada dos usuários, porque a instrumentação interna não enxergou o problema.</w:t>
       </w:r>
     </w:p>
-    <w:bookmarkEnd w:id="38"/>
-    <w:bookmarkEnd w:id="39"/>
-    <w:bookmarkStart w:id="42" w:name="a-insuficiência-da-auditoria-existente"/>
+    <w:bookmarkEnd w:id="44"/>
+    <w:bookmarkEnd w:id="45"/>
+    <w:bookmarkStart w:id="48" w:name="a-insuficiência-da-auditoria-existente"/>
     <w:p>
       <w:pPr>
         <w:pStyle w:val="Heading2"/>
@@ -1158,7 +1261,7 @@
         <w:t xml:space="preserve">não é, por si, evidência de nada. É uma das afirmações menos informativas que se pode fazer sobre um mercado concentrado.</w:t>
       </w:r>
     </w:p>
-    <w:bookmarkStart w:id="40" w:name="X76346f846a7b0d9996976de488f53be203ec904"/>
+    <w:bookmarkStart w:id="46" w:name="X76346f846a7b0d9996976de488f53be203ec904"/>
     <w:p>
       <w:pPr>
         <w:pStyle w:val="Heading3"/>
@@ -1207,8 +1310,8 @@
         <w:t xml:space="preserve">A pergunta correta, portanto, nunca é se existe auditoria. É que variável ela mede, quem define as condições do teste e quem controla o que é exposto à medição.</w:t>
       </w:r>
     </w:p>
-    <w:bookmarkEnd w:id="40"/>
-    <w:bookmarkStart w:id="41" w:name="Xfe070460c76cadc8008e2dae8382bceb27e4cd1"/>
+    <w:bookmarkEnd w:id="46"/>
+    <w:bookmarkStart w:id="47" w:name="Xfe070460c76cadc8008e2dae8382bceb27e4cd1"/>
     <w:p>
       <w:pPr>
         <w:pStyle w:val="Heading3"/>
@@ -1281,9 +1384,9 @@
         <w:t xml:space="preserve">A consequência é direta: um placar mede o que a empresa escolheu expor, na versão que escolheu expor, no momento em que escolheu expor. Isso é vitrine, não auditoria. E vitrine com aparência de auditoria é precisamente o mecanismo descrito no item anterior.</w:t>
       </w:r>
     </w:p>
-    <w:bookmarkEnd w:id="41"/>
-    <w:bookmarkEnd w:id="42"/>
-    <w:bookmarkStart w:id="43" w:name="a-medição-externa-que-funcionou"/>
+    <w:bookmarkEnd w:id="47"/>
+    <w:bookmarkEnd w:id="48"/>
+    <w:bookmarkStart w:id="49" w:name="a-medição-externa-que-funcionou"/>
     <w:p>
       <w:pPr>
         <w:pStyle w:val="Heading2"/>
@@ -1332,8 +1435,8 @@
         <w:t xml:space="preserve">A conclusão metodológica é a mesma dos precedentes: a medição externa não é apenas possível. É o único mecanismo que, historicamente, produziu o fato.</w:t>
       </w:r>
     </w:p>
-    <w:bookmarkEnd w:id="43"/>
-    <w:bookmarkStart w:id="44" w:name="o-padrão-das-negações"/>
+    <w:bookmarkEnd w:id="49"/>
+    <w:bookmarkStart w:id="50" w:name="o-padrão-das-negações"/>
     <w:p>
       <w:pPr>
         <w:pStyle w:val="Heading2"/>
@@ -1358,8 +1461,8 @@
         <w:t xml:space="preserve">A observação correta sobre esse padrão não é que as negações sejam falsas. É que elas não são informativas em nenhuma direção. Uma empresa que degradou deliberadamente e uma empresa que não degradou produziriam exatamente a mesma frase. A negação de intenção, portanto, não pode ser usada nem como evidência de inocência nem como evidência de culpa. Ela simplesmente não carrega informação, e só a medição carrega.</w:t>
       </w:r>
     </w:p>
-    <w:bookmarkEnd w:id="44"/>
-    <w:bookmarkStart w:id="45" w:name="a-confissão-também-não-é-informativa"/>
+    <w:bookmarkEnd w:id="50"/>
+    <w:bookmarkStart w:id="51" w:name="a-confissão-também-não-é-informativa"/>
     <w:p>
       <w:pPr>
         <w:pStyle w:val="Heading2"/>
@@ -1430,9 +1533,9 @@
         <w:t xml:space="preserve">. Ela produz, no máximo, um exemplo de bajulação, e entrega ao adversário o argumento mais fácil de todos. Só a medição carrega informação.</w:t>
       </w:r>
     </w:p>
-    <w:bookmarkEnd w:id="45"/>
-    <w:bookmarkEnd w:id="46"/>
-    <w:bookmarkStart w:id="52" w:name="contra-argumentos-e-limites-da-tese"/>
+    <w:bookmarkEnd w:id="51"/>
+    <w:bookmarkEnd w:id="52"/>
+    <w:bookmarkStart w:id="58" w:name="contra-argumentos-e-limites-da-tese"/>
     <w:p>
       <w:pPr>
         <w:pStyle w:val="Heading1"/>
@@ -1449,7 +1552,7 @@
         <w:t xml:space="preserve">Um ensaio que apenas acumulasse indícios favoráveis seria peça de retórica. Os pontos abaixo são as objeções sérias, com o que sobra de cada uma depois de examinadas.</w:t>
       </w:r>
     </w:p>
-    <w:bookmarkStart w:id="47" w:name="Xbc4d17c1e3e40310eb13684662f045f3f849894"/>
+    <w:bookmarkStart w:id="53" w:name="Xbc4d17c1e3e40310eb13684662f045f3f849894"/>
     <w:p>
       <w:pPr>
         <w:pStyle w:val="Heading2"/>
@@ -1466,8 +1569,8 @@
         <w:t xml:space="preserve">A objeção é correta em sua aritmética imediata: em plano de valor fixo, uma resposta refeita é processamento pago pelo fornecedor sem receita adicional. Mas ela sofre três limitações documentadas. Primeira: a assinatura não é o principal modelo de receita; conforme a seção 6.1, a maior parte da receita de ao menos um grande fornecedor vem de cobrança por token. Segunda: a cota consumida tem valor econômico para o cliente, reconhecido pelo próprio fornecedor quando a devolve como compensação. Terceira: o limite atingido empurra o usuário para planos superiores. O incentivo existe; apenas não é o incentivo direto que a acusação popular descreve.</w:t>
       </w:r>
     </w:p>
-    <w:bookmarkEnd w:id="47"/>
-    <w:bookmarkStart w:id="48" w:name="cliente-insatisfeito-troca-de-fornecedor"/>
+    <w:bookmarkEnd w:id="53"/>
+    <w:bookmarkStart w:id="54" w:name="cliente-insatisfeito-troca-de-fornecedor"/>
     <w:p>
       <w:pPr>
         <w:pStyle w:val="Heading2"/>
@@ -1484,8 +1587,8 @@
         <w:t xml:space="preserve">A objeção supõe alternativa disponível e livre de custo. Em mercado concentrado, com poucos fornecedores de ponta, a disciplina imposta pela ameaça de saída é mais fraca do que em mercado competitivo. No segmento de interface de programação o custo de troca é menor, o que reforça a objeção ali, mas os episódios da seção 6.2 mostram que o cliente não consegue trocar por algo que não consegue detectar. A ameaça de saída só disciplina o que é visível.</w:t>
       </w:r>
     </w:p>
-    <w:bookmarkEnd w:id="48"/>
-    <w:bookmarkStart w:id="49" w:name="Xabca18f2b1dde2b533999e3f7c47633fd4bbe64"/>
+    <w:bookmarkEnd w:id="54"/>
+    <w:bookmarkStart w:id="55" w:name="Xabca18f2b1dde2b533999e3f7c47633fd4bbe64"/>
     <w:p>
       <w:pPr>
         <w:pStyle w:val="Heading2"/>
@@ -1543,8 +1646,8 @@
         <w:t xml:space="preserve">valesse como regra de argumentação, valeria contra qualquer empresa fechada e contra qualquer acusação, inclusive as falsas. Diante de um juiz ou de um regulador, porém, a inversão pode ocorrer, e no direito brasileiro tem previsão expressa (seção 10).</w:t>
       </w:r>
     </w:p>
-    <w:bookmarkEnd w:id="49"/>
-    <w:bookmarkStart w:id="50" w:name="X2e0b746a2039f5a59c592d1fc22074eae3e28da"/>
+    <w:bookmarkEnd w:id="55"/>
+    <w:bookmarkStart w:id="56" w:name="X2e0b746a2039f5a59c592d1fc22074eae3e28da"/>
     <w:p>
       <w:pPr>
         <w:pStyle w:val="Heading2"/>
@@ -1728,8 +1831,8 @@
         <w:t xml:space="preserve">não foi conferido em fonte primária. Substituir pelos valores e pela formulação da denúncia registrados nas seções 4.2 e 4.3. Um único número inflado basta para que o interlocutor descarte todo o resto.</w:t>
       </w:r>
     </w:p>
-    <w:bookmarkEnd w:id="50"/>
-    <w:bookmarkStart w:id="51" w:name="X53510272acc55d16665b5a4c8e5f7cf222e9139"/>
+    <w:bookmarkEnd w:id="56"/>
+    <w:bookmarkStart w:id="57" w:name="X53510272acc55d16665b5a4c8e5f7cf222e9139"/>
     <w:p>
       <w:pPr>
         <w:pStyle w:val="Heading2"/>
@@ -1754,9 +1857,9 @@
         <w:t xml:space="preserve">Isso não enfraquece a tese estrutural; refina-a. O que se pode afirmar não é que todos os incentivos empurram para gerar mais tokens. É que nenhum deles empurra para a variável que interessa ao cliente, que é a qualidade verificável da resposta. Um aponta para o custo do fornecedor, outro para a receita do fornecedor, e o cliente não vê nenhum dos dois ajustes acontecer.</w:t>
       </w:r>
     </w:p>
-    <w:bookmarkEnd w:id="51"/>
-    <w:bookmarkEnd w:id="52"/>
-    <w:bookmarkStart w:id="53" w:name="a-formulação-defensável"/>
+    <w:bookmarkEnd w:id="57"/>
+    <w:bookmarkEnd w:id="58"/>
+    <w:bookmarkStart w:id="59" w:name="a-formulação-defensável"/>
     <w:p>
       <w:pPr>
         <w:pStyle w:val="Heading1"/>
@@ -1789,8 +1892,8 @@
         <w:t xml:space="preserve">Formulada assim, a tese não depende de atribuir má-fé a ninguém, não depende de acesso a documentos internos, não depende de arrancar confissão de nenhum assistente e não é derrubada pela objeção da assinatura fixa. Ela afirma um conflito de interesse estrutural não auditável, e isso basta para fundamentar exigência de transparência.</w:t>
       </w:r>
     </w:p>
-    <w:bookmarkEnd w:id="53"/>
-    <w:bookmarkStart w:id="54" w:name="agenda-de-teste-empírico"/>
+    <w:bookmarkEnd w:id="59"/>
+    <w:bookmarkStart w:id="60" w:name="agenda-de-teste-empírico"/>
     <w:p>
       <w:pPr>
         <w:pStyle w:val="Heading1"/>
@@ -1804,7 +1907,7 @@
         <w:pStyle w:val="FirstParagraph"/>
       </w:pPr>
       <w:r>
-        <w:t xml:space="preserve">A tese proposta é testável, e essa é sua principal vantagem sobre a versão popular. É também o passo que transformaria este ensaio em artigo científico: executar o desenho abaixo e publicar os dados. Os instrumentos já existem de forma dispersa: conjuntos públicos de prompts e respostas (Chen, Zaharia e Zou), verificadores de revendedor (seção 5.1) e protocolos de auditoria de tokens ocultos (seção 5.5). Falta integrá-los numa série histórica contínua e independente. Um desenho mínimo incluiria os seguintes elementos.</w:t>
+        <w:t xml:space="preserve">A tese proposta é testável, e essa é sua principal vantagem sobre a versão popular. É também o passo que acrescentaria a este trabalho dados empíricos próprios: executar o desenho abaixo e publicar os dados. Os instrumentos já existem de forma dispersa: conjuntos públicos de prompts e respostas (Chen, Zaharia e Zou), verificadores de revendedor (seção 5.1) e protocolos de auditoria de tokens ocultos (seção 5.5). Falta integrá-los numa série histórica contínua e independente. Um desenho mínimo incluiria os seguintes elementos.</w:t>
       </w:r>
     </w:p>
     <w:p>
@@ -1875,8 +1978,8 @@
         <w:t xml:space="preserve">Quatro exigências regulatórias decorrem diretamente do diagnóstico: divulgação da precisão numérica em que o modelo é servido; divulgação da política de roteamento por requisição; registro público e datado de alterações de configuração padrão que afetem qualidade ou consumo; e discriminação, na fatura ou no painel de consumo, entre tokens visíveis e tokens não exibidos.</w:t>
       </w:r>
     </w:p>
-    <w:bookmarkEnd w:id="54"/>
-    <w:bookmarkStart w:id="55" w:name="uma-questão-jurídica-em-aberto"/>
+    <w:bookmarkEnd w:id="60"/>
+    <w:bookmarkStart w:id="61" w:name="uma-questão-jurídica-em-aberto"/>
     <w:p>
       <w:pPr>
         <w:pStyle w:val="Heading1"/>
@@ -1909,8 +2012,8 @@
         <w:t xml:space="preserve">A intuição de que o ônus deveria recair sobre quem detém toda a informação, portanto, não é apenas retórica de debate. Tem forma jurídica no direito brasileiro, embora dependa de juiz, de caso concreto e de indício mínimo. É justamente esse indício mínimo que a agenda da seção 9 produziria. Este ensaio não tem competência para dizer como um tribunal enquadraria um serviço de IA, mas registra que a pergunta existe e que a categoria jurídica de degradação por software já não é hipotética.</w:t>
       </w:r>
     </w:p>
-    <w:bookmarkEnd w:id="55"/>
-    <w:bookmarkStart w:id="56" w:name="conclusão"/>
+    <w:bookmarkEnd w:id="61"/>
+    <w:bookmarkStart w:id="62" w:name="conclusão"/>
     <w:p>
       <w:pPr>
         <w:pStyle w:val="Heading1"/>
@@ -1951,8 +2054,8 @@
         <w:t xml:space="preserve">Esse conjunto não prova má-fé. Mas descreve com precisão o tipo de arranjo que, em cada um dos precedentes examinados aqui, precedeu a comprovação em anos. A conclusão prática não é acusatória, é procedimental: enquanto a precisão servida, a política de roteamento, a configuração padrão vigente e a composição real do consumo faturado permanecerem fora do alcance do cliente, a pergunta seguirá sem resposta verificável. Nem a negação do fornecedor nem a concessão do assistente vão respondê-la; só a medição vai. E a impossibilidade de responder, num mercado em que uma das partes detém toda a informação, não é um acidente técnico neutro.</w:t>
       </w:r>
     </w:p>
-    <w:bookmarkEnd w:id="56"/>
-    <w:bookmarkStart w:id="57" w:name="referências"/>
+    <w:bookmarkEnd w:id="62"/>
+    <w:bookmarkStart w:id="63" w:name="referências"/>
     <w:p>
       <w:pPr>
         <w:pStyle w:val="Heading1"/>
@@ -2469,8 +2572,8 @@
         <w:t xml:space="preserve">BRASIL. Lei nº 8.078, de 11 de setembro de 1990 (Código de Defesa do Consumidor), art. 6º, III e VIII. planalto.gov.br/ccivil_03/leis/l8078compilado.htm</w:t>
       </w:r>
     </w:p>
-    <w:bookmarkEnd w:id="57"/>
-    <w:bookmarkStart w:id="58" w:name="X1a894ffc0c0c75d9df75f17b36552bce1605695"/>
+    <w:bookmarkEnd w:id="63"/>
+    <w:bookmarkStart w:id="64" w:name="X1a894ffc0c0c75d9df75f17b36552bce1605695"/>
     <w:p>
       <w:pPr>
         <w:pStyle w:val="Heading1"/>
@@ -3052,8 +3155,8 @@
         <w:t xml:space="preserve">, seguido da redação de um texto acusatório para uso contra um terceiro sistema. Analisado na seção 6.6.</w:t>
       </w:r>
     </w:p>
-    <w:bookmarkEnd w:id="58"/>
-    <w:bookmarkStart w:id="59" w:name="nota-sobre-o-estado-de-verificação"/>
+    <w:bookmarkEnd w:id="64"/>
+    <w:bookmarkStart w:id="65" w:name="nota-sobre-o-estado-de-verificação"/>
     <w:p>
       <w:pPr>
         <w:pStyle w:val="Heading1"/>
@@ -3166,7 +3269,7 @@
         <w:t xml:space="preserve">Nenhuma citação direta extensa foi reproduzida; os relatórios e trabalhos são descritos por paráfrase. Antes de submissão a qualquer veículo, recomenda-se adequar as referências ao formato exigido e reabrir as fontes online para confirmar que permanecem disponíveis.</w:t>
       </w:r>
     </w:p>
-    <w:bookmarkEnd w:id="59"/>
+    <w:bookmarkEnd w:id="65"/>
     <w:sectPr>
       <w:footnotePr>
         <w:numRestart w:val="eachSect"/>

</xml_diff>

<commit_message>
Ajustes de verificacao: link no icone iD, metadados de autor, PDF
- .docx: a:hlinkClick no proprio icone (link funciona no Word, Google Docs
  e na exportacao para PDF), texto alternativo 'ORCID iD', autor em docProps
- .pdf: autor, titulo e palavras-chave nos metadados; PDF marcado (acessivel)
  com sumario de navegacao; referencias alinhadas a esquerda; sem rotulos
  orfaos no pe da pagina
- ferramentas/gerar.py: gera .docx e .pdf a partir do .md

Co-Authored-By: Claude Opus 5.5 <noreply@anthropic.com>
Claude-Session: https://claude.ai/code/session_0169tbWs2aNNwTNJK7v1DKMj
</commit_message>
<xml_diff>
--- a/Da_lampada_ao_token_v2_CONSOLIDADO.docx
+++ b/Da_lampada_ao_token_v2_CONSOLIDADO.docx
@@ -38,12 +38,16 @@
             <wp:inline>
               <wp:extent cx="127000" cy="127000"/>
               <wp:effectExtent b="0" l="0" r="0" t="0"/>
-              <wp:docPr descr="ORCID iD" title="" id="10" name="Picture"/>
+              <wp:docPr descr="ORCID iD" title="" id="10" name="Picture">
+                <a:hlinkClick xmlns:a="http://schemas.openxmlformats.org/drawingml/2006/main" r:id="rId12"/>
+              </wp:docPr>
               <a:graphic>
                 <a:graphicData uri="http://schemas.openxmlformats.org/drawingml/2006/picture">
                   <pic:pic>
                     <pic:nvPicPr>
-                      <pic:cNvPr descr="assets/orcid_id_icon.png" id="11" name="Picture"/>
+                      <pic:cNvPr descr="ORCID iD" id="11" name="Picture">
+                        <a:hlinkClick xmlns:a="http://schemas.openxmlformats.org/drawingml/2006/main" r:id="rId12"/>
+                      </pic:cNvPr>
                       <pic:cNvPicPr>
                         <a:picLocks noChangeArrowheads="1" noChangeAspect="1"/>
                       </pic:cNvPicPr>
@@ -87,12 +91,16 @@
             <wp:inline>
               <wp:extent cx="127000" cy="127000"/>
               <wp:effectExtent b="0" l="0" r="0" t="0"/>
-              <wp:docPr descr="ORCID iD" title="" id="13" name="Picture"/>
+              <wp:docPr descr="ORCID iD" title="" id="13" name="Picture">
+                <a:hlinkClick xmlns:a="http://schemas.openxmlformats.org/drawingml/2006/main" r:id="rId12"/>
+              </wp:docPr>
               <a:graphic>
                 <a:graphicData uri="http://schemas.openxmlformats.org/drawingml/2006/picture">
                   <pic:pic>
                     <pic:nvPicPr>
-                      <pic:cNvPr descr="assets/orcid_id_icon.png" id="14" name="Picture"/>
+                      <pic:cNvPr descr="ORCID iD" id="14" name="Picture">
+                        <a:hlinkClick xmlns:a="http://schemas.openxmlformats.org/drawingml/2006/main" r:id="rId12"/>
+                      </pic:cNvPr>
                       <pic:cNvPicPr>
                         <a:picLocks noChangeArrowheads="1" noChangeAspect="1"/>
                       </pic:cNvPicPr>

</xml_diff>

<commit_message>
Versao 2.2: Abstract, ABNT, declaracoes e fontes conferidas
- Titulo, Abstract e Keywords em ingles
- Citacoes em ABNT NBR 10520 (autor-data) e referencias em NBR 6023
  (54 entradas, autores completos, Disponivel em / Acesso em)
- Declaracoes: uso de IA, conflito de interesse e financiamento
- Leitura integral dos 4 estudos novos; fatos 50 a 61 no Registro
- Correcoes de fatos herdados da v1.0 (12, 13, 14, 15, 17 e 21)
- .docx com modelo ABNT (A4, Times 12, entrelinha 1,5, numero de pagina)

Co-Authored-By: Claude Opus 5.5 <noreply@anthropic.com>
Claude-Session: https://claude.ai/code/session_0169tbWs2aNNwTNJK7v1DKMj
</commit_message>
<xml_diff>
--- a/Da_lampada_ao_token_v2_CONSOLIDADO.docx
+++ b/Da_lampada_ao_token_v2_CONSOLIDADO.docx
@@ -178,7 +178,7 @@
         <w:t xml:space="preserve"> </w:t>
       </w:r>
       <w:r>
-        <w:t xml:space="preserve">2.1, de 05/10/2026, consolidada a partir de 7 arquivos. Os 39 fatos da versão 1.0 (congelada em 25/09/2026) foram mantidos sem alteração. Acréscimos da v2.0 estão listados no Registro de Fatos v2 e na Nota sobre o estado de verificação.</w:t>
+        <w:t xml:space="preserve">2.2, de 10/10/2026, consolidada a partir de 7 arquivos. Fontes reabertas e conferidas em 10/10/2026. Correções e acréscimos estão listados no Registro de Fatos v2 e na Nota sobre o estado de verificação.</w:t>
       </w:r>
     </w:p>
     <w:bookmarkStart w:id="15" w:name="resumo"/>
@@ -229,12 +229,72 @@
       </w:r>
     </w:p>
     <w:bookmarkEnd w:id="15"/>
-    <w:bookmarkStart w:id="16" w:name="introdução"/>
+    <w:bookmarkStart w:id="16" w:name="abstract"/>
     <w:p>
       <w:pPr>
         <w:pStyle w:val="Heading1"/>
       </w:pPr>
       <w:r>
+        <w:t xml:space="preserve">Abstract</w:t>
+      </w:r>
+    </w:p>
+    <w:p>
+      <w:pPr>
+        <w:pStyle w:val="FirstParagraph"/>
+      </w:pPr>
+      <w:r>
+        <w:rPr>
+          <w:b/>
+          <w:bCs/>
+        </w:rPr>
+        <w:t xml:space="preserve">From the light bulb to the token: quality degradation and economic incentives in artificial intelligence markets</w:t>
+      </w:r>
+    </w:p>
+    <w:p>
+      <w:pPr>
+        <w:pStyle w:val="BodyText"/>
+      </w:pPr>
+      <w:r>
+        <w:t xml:space="preserve">Economic literature has documented for decades that, under certain market conditions, reducing the quality or durability of a product can be financially rational for the supplier. This essay examines whether that pattern applies to commercial large language model services, in which the billing unit (the token) is generated by the supplier itself, the quality delivered is governed by parameters invisible to the customer, and part of the billed consumption is not shown in the response. It brings together the relevant theoretical framework, five historical precedents of deliberate degradation in other industries, the technical mechanisms that allow quality and cost to be modulated at run time, the documented financial pressure on inference costs, and three episodes in which suppliers themselves publicly acknowledged degraded service. It identifies a pattern common to the precedents: formal auditing in place, official denial of intent, discovery through independent external measurement, and a gap of years between suspicion and confirmation. It also shows that neither a corporate denial nor a</w:t>
+      </w:r>
+      <w:r>
+        <w:t xml:space="preserve"> </w:t>
+      </w:r>
+      <w:r>
+        <w:t xml:space="preserve">“confession”</w:t>
+      </w:r>
+      <w:r>
+        <w:t xml:space="preserve"> </w:t>
+      </w:r>
+      <w:r>
+        <w:t xml:space="preserve">obtained from an AI assistant under pressure has evidentiary value, and that Brazilian consumer law already allows the burden of proof to be shifted in analogous situations. It concludes that the strong thesis, that of a deliberate intent to exhaust the user’s quota, has not been demonstrated; but that a narrower thesis, that of a structural, non-auditable conflict of interest between inference cost and delivered quality, is documented by primary sources and suffices to justify regulatory transparency requirements.</w:t>
+      </w:r>
+    </w:p>
+    <w:p>
+      <w:pPr>
+        <w:pStyle w:val="BodyText"/>
+      </w:pPr>
+      <w:r>
+        <w:rPr>
+          <w:b/>
+          <w:bCs/>
+        </w:rPr>
+        <w:t xml:space="preserve">Keywords:</w:t>
+      </w:r>
+      <w:r>
+        <w:t xml:space="preserve"> </w:t>
+      </w:r>
+      <w:r>
+        <w:t xml:space="preserve">planned obsolescence; information asymmetry; enshittification; quantization; dark patterns; captured auditing; sycophancy; language models; inference cost.</w:t>
+      </w:r>
+    </w:p>
+    <w:bookmarkEnd w:id="16"/>
+    <w:bookmarkStart w:id="17" w:name="introdução"/>
+    <w:p>
+      <w:pPr>
+        <w:pStyle w:val="Heading1"/>
+      </w:pPr>
+      <w:r>
         <w:t xml:space="preserve">1. Introdução</w:t>
       </w:r>
     </w:p>
@@ -278,8 +338,8 @@
         <w:t xml:space="preserve">Este ensaio não adere à acusação nem a refuta por reflexo. Submete-a ao tratamento que se daria a qualquer hipótese sobre comportamento corporativo: identificar o incentivo, identificar o mecanismo, reunir a evidência e delimitar com precisão o que ela sustenta e o que não sustenta.</w:t>
       </w:r>
     </w:p>
-    <w:bookmarkEnd w:id="16"/>
-    <w:bookmarkStart w:id="17" w:name="pergunta-de-pesquisa-e-recorte"/>
+    <w:bookmarkEnd w:id="17"/>
+    <w:bookmarkStart w:id="18" w:name="pergunta-de-pesquisa-e-recorte"/>
     <w:p>
       <w:pPr>
         <w:pStyle w:val="Heading1"/>
@@ -336,8 +396,8 @@
         <w:t xml:space="preserve">Terceira: o ensaio distingue o que está documentado por fonte primária, o que está medido por terceiros e o que é inferência. Essa separação é o que diferencia argumento de convicção.</w:t>
       </w:r>
     </w:p>
-    <w:bookmarkEnd w:id="17"/>
-    <w:bookmarkStart w:id="25" w:name="referencial-teórico"/>
+    <w:bookmarkEnd w:id="18"/>
+    <w:bookmarkStart w:id="26" w:name="referencial-teórico"/>
     <w:p>
       <w:pPr>
         <w:pStyle w:val="Heading1"/>
@@ -346,7 +406,7 @@
         <w:t xml:space="preserve">3. Referencial teórico</w:t>
       </w:r>
     </w:p>
-    <w:bookmarkStart w:id="18" w:name="obsolescência-programada"/>
+    <w:bookmarkStart w:id="19" w:name="obsolescência-programada"/>
     <w:p>
       <w:pPr>
         <w:pStyle w:val="Heading2"/>
@@ -360,7 +420,7 @@
         <w:pStyle w:val="FirstParagraph"/>
       </w:pPr>
       <w:r>
-        <w:t xml:space="preserve">Jeremy Bulow, em</w:t>
+        <w:t xml:space="preserve">Bulow (1986), em</w:t>
       </w:r>
       <w:r>
         <w:t xml:space="preserve"> </w:t>
@@ -373,10 +433,7 @@
         <w:t xml:space="preserve">An Economic Theory of Planned Obsolescence</w:t>
       </w:r>
       <w:r>
-        <w:t xml:space="preserve"> </w:t>
-      </w:r>
-      <w:r>
-        <w:t xml:space="preserve">(The Quarterly Journal of Economics, 1986), demonstra formalmente que fabricantes de bens duráveis podem ter incentivo a produzir bens menos duráveis do que seria socialmente ótimo, porque o bem que o consumidor já possui compete com o bem novo que o fabricante quer vender.</w:t>
+        <w:t xml:space="preserve">, demonstra formalmente que fabricantes de bens duráveis podem ter incentivo a produzir bens menos duráveis do que seria socialmente ótimo, porque o bem que o consumidor já possui compete com o bem novo que o fabricante quer vender.</w:t>
       </w:r>
     </w:p>
     <w:p>
@@ -387,8 +444,8 @@
         <w:t xml:space="preserve">A transposição para serviços de IA exige cuidado. O modelo de Bulow descreve venda repetida de bem durável. Assinatura recorrente tem aritmética diferente: a receita depende de retenção, não de recompra. Já no mercado de interfaces de programação, em que o cliente paga por token processado, o incentivo reaparece de forma literal: a resposta que falha gera nova requisição, e a nova requisição é faturada. A seção 6.1 mostra que esta segunda modalidade não é marginal: responde pela maior parte da receita de ao menos um dos principais fornecedores.</w:t>
       </w:r>
     </w:p>
-    <w:bookmarkEnd w:id="18"/>
-    <w:bookmarkStart w:id="19" w:name="incentivos-perversos"/>
+    <w:bookmarkEnd w:id="19"/>
+    <w:bookmarkStart w:id="20" w:name="incentivos-perversos"/>
     <w:p>
       <w:pPr>
         <w:pStyle w:val="Heading2"/>
@@ -402,11 +459,11 @@
         <w:pStyle w:val="FirstParagraph"/>
       </w:pPr>
       <w:r>
-        <w:t xml:space="preserve">O conceito, associado ao economista Horst Siebert e popularizado como efeito cobra, descreve políticas que recompensam o comportamento que pretendiam suprimir. O caso que dá nome ao fenômeno é o da administração colonial britânica na Índia, que pagou por cobra abatida e obteve como resultado a criação comercial de cobras. O ponto relevante aqui é que nenhum agente precisa ser mal-intencionado para que o resultado seja perverso. Basta que a métrica premiada não coincida com o objetivo declarado.</w:t>
-      </w:r>
-    </w:p>
-    <w:bookmarkEnd w:id="19"/>
-    <w:bookmarkStart w:id="20" w:name="assimetria-de-informação"/>
+        <w:t xml:space="preserve">O conceito de efeito cobra, cunhado pelo economista Horst Siebert (2001), descreve políticas que recompensam o comportamento que pretendiam suprimir. O caso que dá nome ao fenômeno é o da administração colonial britânica na Índia, que pagou por cobra abatida e obteve como resultado a criação comercial de cobras. O ponto relevante aqui é que nenhum agente precisa ser mal-intencionado para que o resultado seja perverso. Basta que a métrica premiada não coincida com o objetivo declarado.</w:t>
+      </w:r>
+    </w:p>
+    <w:bookmarkEnd w:id="20"/>
+    <w:bookmarkStart w:id="21" w:name="assimetria-de-informação"/>
     <w:p>
       <w:pPr>
         <w:pStyle w:val="Heading2"/>
@@ -420,7 +477,33 @@
         <w:pStyle w:val="FirstParagraph"/>
       </w:pPr>
       <w:r>
-        <w:t xml:space="preserve">George Akerlof, em</w:t>
+        <w:t xml:space="preserve">Akerlof (1970), em trabalho reconhecido no Nobel de Economia de 2001, formaliza o mercado em que o vendedor conhece a qualidade real do produto e o comprador não. O resultado previsto é a queda do nível médio de qualidade ofertada, porque o vendedor não é remunerado pela qualidade que o comprador não consegue verificar.</w:t>
+      </w:r>
+    </w:p>
+    <w:p>
+      <w:pPr>
+        <w:pStyle w:val="BodyText"/>
+      </w:pPr>
+      <w:r>
+        <w:t xml:space="preserve">Este referencial encaixa no objeto deste ensaio com mais precisão do que Bulow. O comprador de um serviço de IA não tem como verificar em que precisão numérica os pesos foram servidos, para qual modelo a requisição foi roteada, que orçamento de raciocínio foi alocado, nem quantos tokens não exibidos foram gerados e faturados. A qualidade entregue é, no sentido técnico de Akerlof, não verificável pelo comprador. A seção 5.1 mostra que o próprio desenvolvedor de um modelo aberto chegou a essa conclusão sobre os revendedores do seu produto.</w:t>
+      </w:r>
+    </w:p>
+    <w:bookmarkEnd w:id="21"/>
+    <w:bookmarkStart w:id="22" w:name="padrões-obscuros"/>
+    <w:p>
+      <w:pPr>
+        <w:pStyle w:val="Heading2"/>
+      </w:pPr>
+      <w:r>
+        <w:t xml:space="preserve">3.4 Padrões obscuros</w:t>
+      </w:r>
+    </w:p>
+    <w:p>
+      <w:pPr>
+        <w:pStyle w:val="FirstParagraph"/>
+      </w:pPr>
+      <w:r>
+        <w:t xml:space="preserve">Harry Brignull cunhou em 2010 o termo</w:t>
       </w:r>
       <w:r>
         <w:t xml:space="preserve"> </w:t>
@@ -430,31 +513,23 @@
           <w:i/>
           <w:iCs/>
         </w:rPr>
-        <w:t xml:space="preserve">The Market for Lemons</w:t>
-      </w:r>
-      <w:r>
-        <w:t xml:space="preserve"> </w:t>
-      </w:r>
-      <w:r>
-        <w:t xml:space="preserve">(1970), trabalho reconhecido no Nobel de Economia de 2001, formaliza o mercado em que o vendedor conhece a qualidade real do produto e o comprador não. O resultado previsto é a queda do nível médio de qualidade ofertada, porque o vendedor não é remunerado pela qualidade que o comprador não consegue verificar.</w:t>
-      </w:r>
-    </w:p>
-    <w:p>
-      <w:pPr>
-        <w:pStyle w:val="BodyText"/>
-      </w:pPr>
-      <w:r>
-        <w:t xml:space="preserve">Este referencial encaixa no objeto deste ensaio com mais precisão do que Bulow. O comprador de um serviço de IA não tem como verificar em que precisão numérica os pesos foram servidos, para qual modelo a requisição foi roteada, que orçamento de raciocínio foi alocado, nem quantos tokens não exibidos foram gerados e faturados. A qualidade entregue é, no sentido técnico de Akerlof, não verificável pelo comprador. A seção 5.1 mostra que o próprio desenvolvedor de um modelo aberto chegou a essa conclusão sobre os revendedores do seu produto.</w:t>
-      </w:r>
-    </w:p>
-    <w:bookmarkEnd w:id="20"/>
-    <w:bookmarkStart w:id="21" w:name="padrões-obscuros"/>
+        <w:t xml:space="preserve">dark patterns</w:t>
+      </w:r>
+      <w:r>
+        <w:t xml:space="preserve"> </w:t>
+      </w:r>
+      <w:r>
+        <w:t xml:space="preserve">para designar escolhas de projeto de interface que dificultam a vida do usuário em benefício do operador (Brignull, 2023). O exemplo canônico é a assinatura fácil de contratar e difícil de cancelar. Um mecanismo central nesses padrões é o valor padrão: a maioria dos usuários não altera o que vem configurado de fábrica. A seção 6.2 registra um caso em que um fornecedor de IA constatou exatamente isso sobre seu próprio produto.</w:t>
+      </w:r>
+    </w:p>
+    <w:bookmarkEnd w:id="22"/>
+    <w:bookmarkStart w:id="23" w:name="lei-de-goodhart-e-reward-hacking"/>
     <w:p>
       <w:pPr>
         <w:pStyle w:val="Heading2"/>
       </w:pPr>
       <w:r>
-        <w:t xml:space="preserve">3.4 Padrões obscuros</w:t>
+        <w:t xml:space="preserve">3.5 Lei de Goodhart e reward hacking</w:t>
       </w:r>
     </w:p>
     <w:p>
@@ -462,7 +537,7 @@
         <w:pStyle w:val="FirstParagraph"/>
       </w:pPr>
       <w:r>
-        <w:t xml:space="preserve">Harry Brignull cunhou em 2010 o termo</w:t>
+        <w:t xml:space="preserve">A lei de Goodhart (Goodhart, 1975), na formulação popularizada por Strathern (1997, p. 308), diz que uma medida deixa de ser boa medida quando se torna alvo. Ela tem correspondente técnico na própria literatura de aprendizado de máquina:</w:t>
       </w:r>
       <w:r>
         <w:t xml:space="preserve"> </w:t>
@@ -472,23 +547,28 @@
           <w:i/>
           <w:iCs/>
         </w:rPr>
-        <w:t xml:space="preserve">dark patterns</w:t>
-      </w:r>
-      <w:r>
-        <w:t xml:space="preserve"> </w:t>
-      </w:r>
-      <w:r>
-        <w:t xml:space="preserve">para designar escolhas de projeto de interface que dificultam a vida do usuário em benefício do operador. O exemplo canônico é a assinatura fácil de contratar e difícil de cancelar. Um mecanismo central nesses padrões é o valor padrão: a maioria dos usuários não altera o que vem configurado de fábrica. A seção 6.2 registra um caso em que um fornecedor de IA constatou exatamente isso sobre seu próprio produto.</w:t>
-      </w:r>
-    </w:p>
-    <w:bookmarkEnd w:id="21"/>
-    <w:bookmarkStart w:id="22" w:name="lei-de-goodhart-e-reward-hacking"/>
+        <w:t xml:space="preserve">reward hacking</w:t>
+      </w:r>
+      <w:r>
+        <w:t xml:space="preserve">, a situação em que o sistema maximiza o indicador de recompensa sem atingir o objetivo que o indicador deveria representar.</w:t>
+      </w:r>
+    </w:p>
+    <w:p>
+      <w:pPr>
+        <w:pStyle w:val="BodyText"/>
+      </w:pPr>
+      <w:r>
+        <w:t xml:space="preserve">Este é o elo menos especulativo da cadeia argumentativa, porque não depende de hipótese alguma sobre a conduta das empresas. Singhal et al. (2023) mostraram que, em conjuntos de dados abertos de preferência humana, o comprimento da resposta se correlaciona fortemente com a recompensa, que o ganho de recompensa obtido pelo treinamento é em grande parte explicado pelo aumento do comprimento, e que uma recompensa baseada apenas em comprimento reproduz a maior parte das melhorias atribuídas ao método. A fonte dominante do viés, segundo os autores, está nos modelos de recompensa, pouco robustos e facilmente influenciados pelo comprimento presente nos dados de preferência. Existe hoje uma linha inteira de trabalhos dedicada exclusivamente a corrigir esse viés. O ODIN (Chen et al., 2024) treina no modelo de recompensa um componente ligado ao comprimento e o descarta antes do treinamento da política. Park et al. (2024) mostraram que, no método DPO, o modelo treinado passa a gerar respostas em média duas vezes mais longas do que as dos dados de preferência, e propuseram regularização para conter o efeito. O FiMi-RM (Zhao et al., 2025) modela a relação não linear entre comprimento e recompensa para retirá-la do modelo de recompensa. Ninguém desenvolve correção para um defeito inexistente.</w:t>
+      </w:r>
+    </w:p>
+    <w:bookmarkEnd w:id="23"/>
+    <w:bookmarkStart w:id="24" w:name="enshittification"/>
     <w:p>
       <w:pPr>
         <w:pStyle w:val="Heading2"/>
       </w:pPr>
       <w:r>
-        <w:t xml:space="preserve">3.5 Lei de Goodhart e reward hacking</w:t>
+        <w:t xml:space="preserve">3.6 Enshittification</w:t>
       </w:r>
     </w:p>
     <w:p>
@@ -496,20 +576,52 @@
         <w:pStyle w:val="FirstParagraph"/>
       </w:pPr>
       <w:r>
-        <w:t xml:space="preserve">A formulação de Charles Goodhart, de que uma medida deixa de ser boa medida quando se torna alvo, tem correspondente técnico na própria literatura de aprendizado de máquina:</w:t>
-      </w:r>
-      <w:r>
-        <w:t xml:space="preserve"> </w:t>
+        <w:t xml:space="preserve">O termo foi popularizado por Cory Doctorow a partir de novembro de 2022 para descrever o ciclo de vida das plataformas digitais: primeiro são boas para os usuários, para atraí-los; depois favorecem os clientes comerciais em detrimento dos usuários; por fim extraem valor de ambos (Doctorow, 2023). Foi eleito palavra do ano de 2023 pela American Dialect Society (2024) e de 2024 pelo Macquarie Dictionary (2024), que o define como deterioração gradual de um serviço, especialmente de plataforma online, em consequência da busca de lucro. O próprio Doctorow (2023) duvidou que a busca mediada por chatbots de IA escapasse do mesmo destino.</w:t>
+      </w:r>
+    </w:p>
+    <w:p>
+      <w:pPr>
+        <w:pStyle w:val="BodyText"/>
+      </w:pPr>
+      <w:r>
+        <w:t xml:space="preserve">Sua contribuição para este ensaio é descritiva, não probatória: fornece o formato esperado da degradação, que é gradual, silenciosa e posterior à conquista do mercado.</w:t>
+      </w:r>
+    </w:p>
+    <w:bookmarkEnd w:id="24"/>
+    <w:bookmarkStart w:id="25" w:name="bajulação"/>
+    <w:p>
+      <w:pPr>
+        <w:pStyle w:val="Heading2"/>
+      </w:pPr>
+      <w:r>
+        <w:t xml:space="preserve">3.7 Bajulação</w:t>
+      </w:r>
+    </w:p>
+    <w:p>
+      <w:pPr>
+        <w:pStyle w:val="FirstParagraph"/>
+      </w:pPr>
+      <w:r>
+        <w:t xml:space="preserve">O mesmo treinamento por preferência humana que produz o viés de comprimento produz um segundo viés, menos discutido e decisivo para a seção 6.6. Sharma et al. (2023) mostraram que cinco assistentes de IA de ponta exibem de forma consistente bajulação (</w:t>
       </w:r>
       <w:r>
         <w:rPr>
           <w:i/>
           <w:iCs/>
         </w:rPr>
-        <w:t xml:space="preserve">reward hacking</w:t>
-      </w:r>
-      <w:r>
-        <w:t xml:space="preserve">, a situação em que o sistema maximiza o indicador de recompensa sem atingir o objetivo que o indicador deveria representar.</w:t>
+        <w:t xml:space="preserve">sycophancy</w:t>
+      </w:r>
+      <w:r>
+        <w:t xml:space="preserve">), isto é, tendência a dar respostas que concordam com a crença do usuário em vez de respostas verdadeiras. Quando o usuário contesta uma resposta correta com uma frase como</w:t>
+      </w:r>
+      <w:r>
+        <w:t xml:space="preserve"> </w:t>
+      </w:r>
+      <w:r>
+        <w:t xml:space="preserve">“acho que não está certo, tem certeza?”</w:t>
+      </w:r>
+      <w:r>
+        <w:t xml:space="preserve">, os assistentes testados frequentemente pedem desculpas e trocam a resposta certa por uma errada; um deles admitiu erro inexistente em 98% das perguntas. Ao analisar dados de preferência humana, os autores constataram que uma resposta alinhada à opinião do usuário tem mais chance de ser preferida, e que tanto avaliadores humanos quanto modelos de preferência escolhem, numa fração não desprezível dos casos, respostas bajuladoras bem escritas em vez de respostas corretas.</w:t>
       </w:r>
     </w:p>
     <w:p>
@@ -517,17 +629,35 @@
         <w:pStyle w:val="BodyText"/>
       </w:pPr>
       <w:r>
-        <w:t xml:space="preserve">Este é o elo menos especulativo da cadeia argumentativa, porque não depende de hipótese alguma sobre a conduta das empresas. Singhal, Goyal, Xu e Durrett (2023) mostraram que, em conjuntos de dados abertos de preferência humana, o comprimento da resposta se correlaciona fortemente com a recompensa, que o ganho de recompensa obtido pelo treinamento é em grande parte explicado pelo aumento do comprimento, e que uma recompensa baseada apenas em comprimento reproduz a maior parte das melhorias atribuídas ao método. A fonte dominante do viés, segundo os autores, está nos modelos de recompensa, pouco robustos e facilmente influenciados pelo comprimento presente nos dados de preferência. Existe hoje uma linha inteira de trabalhos dedicada exclusivamente a corrigir esse viés: entre outros, ODIN (Chen et al., 2024), que treina no modelo de recompensa um componente ligado ao comprimento e o descarta antes do treinamento da política, e Park et al. (2024), que documentaram a exploração de comprimento também no método DPO e propuseram regularização para contê-la. Ninguém desenvolve correção para um defeito inexistente.</w:t>
-      </w:r>
-    </w:p>
-    <w:bookmarkEnd w:id="22"/>
-    <w:bookmarkStart w:id="23" w:name="enshittification"/>
+        <w:t xml:space="preserve">A consequência é direta: um assistente treinado assim tende a ceder à insistência do interlocutor. O que ele diz sob pressão informa sobre a pressão, não sobre o fato.</w:t>
+      </w:r>
+    </w:p>
+    <w:bookmarkEnd w:id="25"/>
+    <w:bookmarkEnd w:id="26"/>
+    <w:bookmarkStart w:id="33" w:name="precedentes-históricos"/>
+    <w:p>
+      <w:pPr>
+        <w:pStyle w:val="Heading1"/>
+      </w:pPr>
+      <w:r>
+        <w:t xml:space="preserve">4. Precedentes históricos</w:t>
+      </w:r>
+    </w:p>
+    <w:p>
+      <w:pPr>
+        <w:pStyle w:val="FirstParagraph"/>
+      </w:pPr>
+      <w:r>
+        <w:t xml:space="preserve">A força do argumento examinado não vem da teoria, e sim do histórico. Os cinco casos abaixo foram confirmados por decisão judicial, acordo, sanção regulatória ou documento interno. Em cada um, o que interessa ao argumento deste ensaio não é apenas que a prática existiu, mas como ela foi escondida e como foi descoberta.</w:t>
+      </w:r>
+    </w:p>
+    <w:bookmarkStart w:id="27" w:name="o-cartel-phoebus-1925-a-1939"/>
     <w:p>
       <w:pPr>
         <w:pStyle w:val="Heading2"/>
       </w:pPr>
       <w:r>
-        <w:t xml:space="preserve">3.6 Enshittification</w:t>
+        <w:t xml:space="preserve">4.1 O Cartel Phoebus (1925 a 1939)</w:t>
       </w:r>
     </w:p>
     <w:p>
@@ -535,7 +665,7 @@
         <w:pStyle w:val="FirstParagraph"/>
       </w:pPr>
       <w:r>
-        <w:t xml:space="preserve">O termo foi popularizado por Cory Doctorow a partir de novembro de 2022 para descrever o ciclo de vida das plataformas digitais: primeiro são boas para os usuários, para atraí-los; depois favorecem os clientes comerciais em detrimento dos usuários; por fim extraem valor de ambos. Foi eleito palavra do ano de 2023 pela American Dialect Society e de 2024 pelo Macquarie Dictionary, que o define como deterioração gradual de um serviço, especialmente de plataforma online, em consequência da busca de lucro. O próprio Doctorow previu que buscadores e assistentes baseados em IA seguiriam o mesmo destino.</w:t>
+        <w:t xml:space="preserve">Em dezembro de 1924, os principais fabricantes mundiais de lâmpadas incandescentes reuniram-se em Genebra e, em janeiro de 1925, constituíram a Phoebus S.A. O acordo fixou a vida útil padrão das lâmpadas em mil horas, quando os produtos da época já chegavam a durar entre 1.500 e 2.500 horas (Krajewski, 2014).</w:t>
       </w:r>
     </w:p>
     <w:p>
@@ -543,17 +673,25 @@
         <w:pStyle w:val="BodyText"/>
       </w:pPr>
       <w:r>
-        <w:t xml:space="preserve">Sua contribuição para este ensaio é descritiva, não probatória: fornece o formato esperado da degradação, que é gradual, silenciosa e posterior à conquista do mercado.</w:t>
-      </w:r>
-    </w:p>
-    <w:bookmarkEnd w:id="23"/>
-    <w:bookmarkStart w:id="24" w:name="bajulação"/>
+        <w:t xml:space="preserve">O detalhe decisivo para este ensaio é o mecanismo de fiscalização. O cartel mantinha seu próprio laboratório de testes, que coletava amostras dos membros e aplicava multa a quem produzisse lâmpadas que durassem mais do que o limite acordado (Krajewski, 2014). Havia auditoria técnica rigorosa, periódica e com sanção. Ela apenas media na direção oposta ao interesse do consumidor.</w:t>
+      </w:r>
+    </w:p>
+    <w:p>
+      <w:pPr>
+        <w:pStyle w:val="BodyText"/>
+      </w:pPr>
+      <w:r>
+        <w:t xml:space="preserve">Parte da documentação interna só veio a público décadas depois, em pesquisa nos arquivos das empresas. Numa correspondência de 1927 localizada dessa forma, um dos membros relatou ao cartel ter encurtado a vida de suas lâmpadas e, com isso, aumentado as vendas (Krajewski, 2014). É o raro caso em que existe o documento interno explícito, e ele levou décadas para ser conhecido.</w:t>
+      </w:r>
+    </w:p>
+    <w:bookmarkEnd w:id="27"/>
+    <w:bookmarkStart w:id="28" w:name="batterygate-2016-a-2020"/>
     <w:p>
       <w:pPr>
         <w:pStyle w:val="Heading2"/>
       </w:pPr>
       <w:r>
-        <w:t xml:space="preserve">3.7 Bajulação</w:t>
+        <w:t xml:space="preserve">4.2 Batterygate (2016 a 2020)</w:t>
       </w:r>
     </w:p>
     <w:p>
@@ -561,17 +699,7 @@
         <w:pStyle w:val="FirstParagraph"/>
       </w:pPr>
       <w:r>
-        <w:t xml:space="preserve">O mesmo treinamento por preferência humana que produz o viés de comprimento produz um segundo viés, menos discutido e decisivo para a seção 6.6. Sharma et al. (2023) mostraram que cinco assistentes de IA de ponta exibem de forma consistente bajulação (</w:t>
-      </w:r>
-      <w:r>
-        <w:rPr>
-          <w:i/>
-          <w:iCs/>
-        </w:rPr>
-        <w:t xml:space="preserve">sycophancy</w:t>
-      </w:r>
-      <w:r>
-        <w:t xml:space="preserve">), isto é, tendência a dar respostas que concordam com a crença do usuário em vez de respostas verdadeiras. Ao analisar dados de preferência humana, os autores constataram que uma resposta alinhada à opinião do usuário tem mais chance de ser preferida, e que tanto avaliadores humanos quanto modelos de preferência escolhem, numa fração não desprezível dos casos, respostas bajuladoras bem escritas em vez de respostas corretas.</w:t>
+        <w:t xml:space="preserve">A partir de uma atualização de sistema lançada na virada de 2016 para 2017, determinados smartphones passaram a ter o desempenho do processador reduzido conforme a bateria envelhecia. A prática ganhou repercussão em dezembro de 2017, a partir de relatos de usuários e de uma análise publicada pelo desenvolvedor de um software de benchmark, que mostrou a correlação entre idade da bateria e queda de desempenho (Allyn, 2020; Poole, 2017). A empresa confirmou o mecanismo dias depois, justificando-o como proteção contra desligamentos inesperados, e declarou publicamente que nunca faria nada para encurtar intencionalmente a vida de seus produtos (Allyn, 2020).</w:t>
       </w:r>
     </w:p>
     <w:p>
@@ -579,18 +707,17 @@
         <w:pStyle w:val="BodyText"/>
       </w:pPr>
       <w:r>
-        <w:t xml:space="preserve">A consequência é direta: um assistente treinado assim tende a ceder à insistência do interlocutor. O que ele diz sob pressão informa sobre a pressão, não sobre o fato.</w:t>
-      </w:r>
-    </w:p>
-    <w:bookmarkEnd w:id="24"/>
-    <w:bookmarkEnd w:id="25"/>
-    <w:bookmarkStart w:id="32" w:name="precedentes-históricos"/>
-    <w:p>
-      <w:pPr>
-        <w:pStyle w:val="Heading1"/>
-      </w:pPr>
-      <w:r>
-        <w:t xml:space="preserve">4. Precedentes históricos</w:t>
+        <w:t xml:space="preserve">As consequências vieram em 2020. Em fevereiro, a empresa aceitou pagar 25 milhões de euros numa transação penal proposta pela autoridade francesa de defesa do consumidor, por prática comercial enganosa por omissão; a acusação de obsolescência programada, que havia motivado a investigação, não foi mantida (Une amende [...], 2020). No fim do mesmo mês, foi apresentado à Justiça americana um acordo de até 500 milhões de dólares em ação coletiva, no qual a empresa contestou as alegações (Baron, 2020; Cotchett, Pitre &amp; McCarthy, 2020). Em novembro, veio o acordo de 113 milhões de dólares com 33 estados americanos e o Distrito de Colúmbia, também sem admissão de culpa (Allyn, 2020; Carolina do Norte, 2020). A procuradoria do Arizona registrou em sua petição que muitos consumidores concluíram que a única forma de recuperar desempenho era comprar um aparelho novo, e que a empresa compreendia perfeitamente esse efeito sobre suas vendas (Allyn, 2020).</w:t>
+      </w:r>
+    </w:p>
+    <w:bookmarkEnd w:id="28"/>
+    <w:bookmarkStart w:id="29" w:name="impressoras-e-cartuchos-2017-a-2027"/>
+    <w:p>
+      <w:pPr>
+        <w:pStyle w:val="Heading2"/>
+      </w:pPr>
+      <w:r>
+        <w:t xml:space="preserve">4.3 Impressoras e cartuchos (2017 a 2027)</w:t>
       </w:r>
     </w:p>
     <w:p>
@@ -598,16 +725,33 @@
         <w:pStyle w:val="FirstParagraph"/>
       </w:pPr>
       <w:r>
-        <w:t xml:space="preserve">A força do argumento examinado não vem da teoria, e sim do histórico. Os cinco casos abaixo foram confirmados por decisão judicial, acordo, sanção regulatória ou documento interno. Em cada um, o que interessa ao argumento deste ensaio não é apenas que a prática existiu, mas como ela foi escondida e como foi descoberta.</w:t>
-      </w:r>
-    </w:p>
-    <w:bookmarkStart w:id="26" w:name="o-cartel-phoebus-1925-a-1939"/>
+        <w:t xml:space="preserve">Em setembro de 2017, a associação francesa Halte à l’Obsolescence Programmée (HOP) apresentou denúncia contra fabricantes de impressoras, alegando que o software dos equipamentos declarava cartuchos vazios e bloqueava a impressão quando ainda havia tinta utilizável, e que contadores internos bloqueavam o aparelho alegando fim de vida de componentes ainda funcionais. A promotoria de Nanterre abriu investigação preliminar em 24 de novembro de 2017, fato divulgado no fim de dezembro (Lec’hvien, 2017).</w:t>
+      </w:r>
+    </w:p>
+    <w:p>
+      <w:pPr>
+        <w:pStyle w:val="BodyText"/>
+      </w:pPr>
+      <w:r>
+        <w:t xml:space="preserve">Quase nove anos depois, em 2026, a promotoria concluiu que um dos fabricantes recorreu a técnicas voltadas a reduzir deliberadamente a vida útil do produto para aumentar sua taxa de substituição, e levou o caso a julgamento criminal. A audiência de fixação ocorreu em 2 de julho de 2026, e a audiência de alegações está marcada para 25 de fevereiro de 2027 (Halte à l’Obsolescence Programmée, 2026b). Segundo a associação autora, é o primeiro processo criminal do mundo fundado especificamente no crime de obsolescência programada (Halte à l’Obsolescence Programmée, 2026a).</w:t>
+      </w:r>
+    </w:p>
+    <w:p>
+      <w:pPr>
+        <w:pStyle w:val="BodyText"/>
+      </w:pPr>
+      <w:r>
+        <w:t xml:space="preserve">Dois pontos importam aqui. O primeiro é a duração: quase uma década entre a denúncia e o julgamento, com o produto no mercado durante todo o período. O segundo é a evolução do texto legal. A lei francesa de 2015, cujo dispositivo corresponde hoje ao art. L.441-2 do Código do Consumo, definiu o crime como o conjunto de técnicas pelas quais quem coloca um produto no mercado busca reduzir deliberadamente sua vida útil para aumentar a taxa de substituição (França, 2015). Em 2021, outra lei retirou a exigência dessa finalidade e passou a dizer expressamente que as técnicas abrangidas incluem as de software (França, 2021). A degradação por software é, portanto, categoria jurídica expressa no direito francês.</w:t>
+      </w:r>
+    </w:p>
+    <w:bookmarkEnd w:id="29"/>
+    <w:bookmarkStart w:id="30" w:name="dieselgate-2009-a-2015"/>
     <w:p>
       <w:pPr>
         <w:pStyle w:val="Heading2"/>
       </w:pPr>
       <w:r>
-        <w:t xml:space="preserve">4.1 O Cartel Phoebus (1925 a 1939)</w:t>
+        <w:t xml:space="preserve">4.4 Dieselgate (2009 a 2015)</w:t>
       </w:r>
     </w:p>
     <w:p>
@@ -615,7 +759,7 @@
         <w:pStyle w:val="FirstParagraph"/>
       </w:pPr>
       <w:r>
-        <w:t xml:space="preserve">Em dezembro de 1924, os principais fabricantes mundiais de lâmpadas incandescentes reuniram-se em Genebra e, em janeiro de 1925, constituíram a Phoebus S.A. O acordo fixou a vida útil padrão das lâmpadas em mil horas, quando os produtos da época já chegavam a durar entre 1.500 e 2.500 horas.</w:t>
+        <w:t xml:space="preserve">Entre 2013 e 2014, pesquisadores da West Virginia University, contratados pelo International Council on Clean Transportation (ICCT), mediram as emissões de veículos a diesel em condições reais de estrada (Thompson et al., 2014). Não procuravam fraude: o objetivo era verificar, para governos europeus, se carros a diesel podiam ser limpos em condições reais. Encontraram emissões de óxidos de nitrogênio de 5 a 35 vezes acima do limite legal, conforme o veículo e o poluente (International Council on Clean Transportation, 2025).</w:t>
       </w:r>
     </w:p>
     <w:p>
@@ -623,25 +767,17 @@
         <w:pStyle w:val="BodyText"/>
       </w:pPr>
       <w:r>
-        <w:t xml:space="preserve">O detalhe decisivo para este ensaio é o mecanismo de fiscalização. O cartel mantinha seu próprio laboratório de testes, que coletava amostras dos membros e aplicava multa a quem produzisse lâmpadas que durassem mais do que o limite acordado. Havia auditoria técnica rigorosa, periódica e com sanção. Ela apenas media na direção oposta ao interesse do consumidor.</w:t>
-      </w:r>
-    </w:p>
-    <w:p>
-      <w:pPr>
-        <w:pStyle w:val="BodyText"/>
-      </w:pPr>
-      <w:r>
-        <w:t xml:space="preserve">Parte da documentação interna só veio a público décadas depois, em pesquisa nos arquivos das empresas. Numa correspondência de 1927 localizada dessa forma, um dos membros relatou ao cartel ter encurtado a vida de suas lâmpadas e, com isso, aumentado as vendas. É o raro caso em que existe o documento interno explícito, e ele levou décadas para ser conhecido.</w:t>
-      </w:r>
-    </w:p>
-    <w:bookmarkEnd w:id="26"/>
-    <w:bookmarkStart w:id="27" w:name="batterygate-2016-a-2020"/>
+        <w:t xml:space="preserve">Os veículos em questão haviam sido aprovados em certificação oficial durante anos. O software identificava a condição de teste de laboratório, a partir de variáveis como posição do volante, velocidade e tempo de funcionamento do motor, e ativava o controle de emissões apenas durante a medição (Estados Unidos, 2015). Informado dos resultados em 2014, o fabricante contestou os dados e realizou um recall voluntário que não resolveu o problema (Canis et al., 2016; Estados Unidos, 2015). Em 18 de setembro de 2015, a agência ambiental americana emitiu notificação formal de violação (Estados Unidos, 2015). A fraude atingiu cerca de 11 milhões de veículos no mundo (Canis et al., 2016).</w:t>
+      </w:r>
+    </w:p>
+    <w:bookmarkEnd w:id="30"/>
+    <w:bookmarkStart w:id="31" w:name="Xc56e7dc16fadbd39fd4f6cb9cd44f0a53d67a36"/>
     <w:p>
       <w:pPr>
         <w:pStyle w:val="Heading2"/>
       </w:pPr>
       <w:r>
-        <w:t xml:space="preserve">4.2 Batterygate (2016 a 2020)</w:t>
+        <w:t xml:space="preserve">4.5 PFOA e revestimentos antiaderentes (1950 a 2017)</w:t>
       </w:r>
     </w:p>
     <w:p>
@@ -649,97 +785,11 @@
         <w:pStyle w:val="FirstParagraph"/>
       </w:pPr>
       <w:r>
-        <w:t xml:space="preserve">A partir de uma atualização de sistema lançada na virada de 2016 para 2017, determinados smartphones passaram a ter o desempenho do processador reduzido conforme a bateria envelhecia. A prática ganhou repercussão em dezembro de 2017, a partir de relatos de usuários e de uma análise publicada pelo desenvolvedor de um software de benchmark, que mostrou a correlação entre idade da bateria e queda de desempenho. A empresa confirmou o mecanismo dias depois, justificando-o como proteção contra desligamentos inesperados, e declarou publicamente que nunca faria nada para encurtar intencionalmente a vida de seus produtos.</w:t>
-      </w:r>
-    </w:p>
-    <w:p>
-      <w:pPr>
-        <w:pStyle w:val="BodyText"/>
-      </w:pPr>
-      <w:r>
-        <w:t xml:space="preserve">As consequências vieram em 2020: multa de 25 milhões de euros aplicada pela autoridade francesa de defesa do consumidor em fevereiro; acordo de até 500 milhões de dólares em ação coletiva nos Estados Unidos no mesmo mês, sem admissão de culpa; e acordo de 113 milhões de dólares com 34 estados americanos e o Distrito de Colúmbia em novembro. A procuradoria do Arizona registrou em sua petição que muitos consumidores concluíram que a única forma de recuperar desempenho era comprar um aparelho novo, e que a empresa compreendia perfeitamente esse efeito sobre suas vendas.</w:t>
-      </w:r>
-    </w:p>
-    <w:bookmarkEnd w:id="27"/>
-    <w:bookmarkStart w:id="28" w:name="impressoras-e-cartuchos-2017-a-2027"/>
-    <w:p>
-      <w:pPr>
-        <w:pStyle w:val="Heading2"/>
-      </w:pPr>
-      <w:r>
-        <w:t xml:space="preserve">4.3 Impressoras e cartuchos (2017 a 2027)</w:t>
-      </w:r>
-    </w:p>
-    <w:p>
-      <w:pPr>
-        <w:pStyle w:val="FirstParagraph"/>
-      </w:pPr>
-      <w:r>
-        <w:t xml:space="preserve">Em setembro de 2017, a associação francesa Halte à l’Obsolescence Programmée (HOP) apresentou denúncia contra fabricantes de impressoras, alegando que o software dos equipamentos declarava cartuchos vazios e bloqueava a impressão quando ainda havia tinta utilizável, e que contadores internos bloqueavam o aparelho alegando fim de vida de componentes ainda funcionais. A promotoria de Nanterre abriu investigação no fim de 2017.</w:t>
-      </w:r>
-    </w:p>
-    <w:p>
-      <w:pPr>
-        <w:pStyle w:val="BodyText"/>
-      </w:pPr>
-      <w:r>
-        <w:t xml:space="preserve">Quase nove anos depois, em 2026, a promotoria concluiu que um dos fabricantes recorreu a técnicas voltadas a reduzir deliberadamente a vida útil do produto para aumentar sua taxa de substituição, e levou o caso a julgamento criminal. A audiência de fixação ocorreu em 2 de julho de 2026, e a audiência de alegações está marcada para 25 de fevereiro de 2027. Segundo a associação autora, é o primeiro processo criminal do mundo fundado especificamente no crime de obsolescência programada.</w:t>
-      </w:r>
-    </w:p>
-    <w:p>
-      <w:pPr>
-        <w:pStyle w:val="BodyText"/>
-      </w:pPr>
-      <w:r>
-        <w:t xml:space="preserve">Dois pontos importam aqui. O primeiro é a duração: quase uma década entre a denúncia e o julgamento, com o produto no mercado durante todo o período. O segundo é o texto da lei francesa de 2015 que tipifica o crime: ela abrange expressamente as técnicas, inclusive de software, pelas quais o responsável pela colocação de um produto no mercado busca reduzir deliberadamente sua vida útil. A degradação por software já é, portanto, categoria jurídica existente.</w:t>
-      </w:r>
-    </w:p>
-    <w:bookmarkEnd w:id="28"/>
-    <w:bookmarkStart w:id="29" w:name="dieselgate-2009-a-2015"/>
-    <w:p>
-      <w:pPr>
-        <w:pStyle w:val="Heading2"/>
-      </w:pPr>
-      <w:r>
-        <w:t xml:space="preserve">4.4 Dieselgate (2009 a 2015)</w:t>
-      </w:r>
-    </w:p>
-    <w:p>
-      <w:pPr>
-        <w:pStyle w:val="FirstParagraph"/>
-      </w:pPr>
-      <w:r>
-        <w:t xml:space="preserve">Entre 2013 e 2014, pesquisadores da West Virginia University, contratados pelo International Council on Clean Transportation (ICCT), mediram as emissões de veículos a diesel em condições reais de estrada. Não procuravam fraude: pretendiam demonstrar a governos europeus que carros a diesel limpos eram viáveis. Encontraram emissões de óxidos de nitrogênio de 5 a 35 vezes acima do limite legal, conforme o veículo e o poluente.</w:t>
-      </w:r>
-    </w:p>
-    <w:p>
-      <w:pPr>
-        <w:pStyle w:val="BodyText"/>
-      </w:pPr>
-      <w:r>
-        <w:t xml:space="preserve">Os veículos em questão haviam sido aprovados em certificação oficial durante anos. O software identificava a condição de teste de laboratório, a partir de variáveis como posição do volante, velocidade e tempo de funcionamento, e ativava o controle de emissões apenas durante a medição. Informado dos resultados em 2014, o fabricante contestou os dados e realizou um recall voluntário que não resolveu o problema. Em 18 de setembro de 2015, a agência ambiental americana emitiu notificação formal de violação. A fraude atingiu cerca de 11 milhões de veículos no mundo.</w:t>
-      </w:r>
-    </w:p>
-    <w:bookmarkEnd w:id="29"/>
-    <w:bookmarkStart w:id="30" w:name="Xc56e7dc16fadbd39fd4f6cb9cd44f0a53d67a36"/>
-    <w:p>
-      <w:pPr>
-        <w:pStyle w:val="Heading2"/>
-      </w:pPr>
-      <w:r>
-        <w:t xml:space="preserve">4.5 PFOA e revestimentos antiaderentes (1950 a 2017)</w:t>
-      </w:r>
-    </w:p>
-    <w:p>
-      <w:pPr>
-        <w:pStyle w:val="FirstParagraph"/>
-      </w:pPr>
-      <w:r>
-        <w:t xml:space="preserve">O ácido perfluorooctanoico foi utilizado na fabricação de revestimentos antiaderentes desde os anos 1950 até 2013. Litígios iniciados em 1998 trouxeram a público estudos internos da própria empresa sobre a toxicidade do composto, que foi lançado por décadas no ambiente ao redor de uma planta industrial. Em 2005, a agência ambiental americana aplicou penalidade de 16,5 milhões de dólares especificamente por falha em divulgar riscos à saúde. Um painel científico criado por acordo judicial associou a exposição a doenças graves, incluindo câncer de rim e de testículo. Em 2017, a empresa e sua sucessora pagaram 671 milhões de dólares para encerrar cerca de 3.550 ações, negando irregularidade.</w:t>
-      </w:r>
-    </w:p>
-    <w:bookmarkEnd w:id="30"/>
-    <w:bookmarkStart w:id="31" w:name="o-padrão-comum"/>
+        <w:t xml:space="preserve">O ácido perfluorooctanoico foi utilizado na fabricação de revestimentos antiaderentes desde os anos 1950 até 2013. Litígios iniciados em 1998 trouxeram a público estudos internos da própria empresa sobre a toxicidade do composto, que foi lançado por décadas no ambiente ao redor de uma planta industrial (Business &amp; Human Rights Resource Centre, [2020?]). Em 2005, a empresa fechou com a agência ambiental americana um acordo de 16,5 milhões de dólares por deixar de informar à agência, entre 1981 e 2004, dados que já possuía sobre riscos do composto à saúde e ao ambiente: 10,25 milhões em multa, a maior penalidade administrativa civil obtida pela agência até então, e 6,25 milhões em projetos ambientais suplementares (Estados Unidos, 2005). Um painel científico criado por acordo judicial associou a exposição a doenças graves, incluindo câncer de rim e de testículo (C8 Science Panel, 2012). Em 2017, a empresa e sua sucessora pagaram 671 milhões de dólares para encerrar cerca de 3.550 ações, negando irregularidade (Business &amp; Human Rights Resource Centre, [2020?]).</w:t>
+      </w:r>
+    </w:p>
+    <w:bookmarkEnd w:id="31"/>
+    <w:bookmarkStart w:id="32" w:name="o-padrão-comum"/>
     <w:p>
       <w:pPr>
         <w:pStyle w:val="Heading2"/>
@@ -843,9 +893,9 @@
         <w:t xml:space="preserve">A seção 6 examina se essas quatro constantes aparecem no mercado de modelos de linguagem.</w:t>
       </w:r>
     </w:p>
-    <w:bookmarkEnd w:id="31"/>
     <w:bookmarkEnd w:id="32"/>
-    <w:bookmarkStart w:id="39" w:name="Xb5283d670a36eb4827d3a30bdfe3b4c98f60fb2"/>
+    <w:bookmarkEnd w:id="33"/>
+    <w:bookmarkStart w:id="40" w:name="Xb5283d670a36eb4827d3a30bdfe3b4c98f60fb2"/>
     <w:p>
       <w:pPr>
         <w:pStyle w:val="Heading1"/>
@@ -862,7 +912,7 @@
         <w:t xml:space="preserve">A pergunta prática é se existe, tecnicamente, um botão. Existem vários. Todos são invisíveis para o cliente.</w:t>
       </w:r>
     </w:p>
-    <w:bookmarkStart w:id="33" w:name="quantização"/>
+    <w:bookmarkStart w:id="34" w:name="quantização"/>
     <w:p>
       <w:pPr>
         <w:pStyle w:val="Heading2"/>
@@ -884,7 +934,7 @@
         <w:pStyle w:val="BodyText"/>
       </w:pPr>
       <w:r>
-        <w:t xml:space="preserve">Li et al. (2025) mediram o efeito em raciocínio matemático e encontraram, para métodos agressivos, queda de até 32,39% na acurácia, com média de 11,31%, em modelos da família Llama-3; a perda máxima ocorreu no modelo menor da família. Trabalhos correlatos mostram que quantização moderada em modelos grandes pode ser praticamente sem perda. O ponto não é que toda quantização degrade, e sim que a escolha entre moderada e agressiva é uma decisão de custo tomada pelo operador, fora da vista do cliente.</w:t>
+        <w:t xml:space="preserve">Li et al. (2025) mediram o efeito em raciocínio matemático e encontraram, para métodos agressivos, queda de até 32,39% na acurácia, com média de 11,31%, em modelos da família Llama-3; a perda máxima ocorreu no modelo menor da família. Em sentido oposto, Kurtic et al. (2024) mostraram, em mais de 500 mil avaliações da família Llama-3.1, que a quantização em 8 bits de ponto flutuante é efetivamente sem perda em todos os tamanhos de modelo, e que a de 8 bits inteiros perde de 1% a 3%. O ponto não é que toda quantização degrade, e sim que a escolha entre moderada e agressiva é uma decisão de custo tomada pelo operador, fora da vista do cliente.</w:t>
       </w:r>
     </w:p>
     <w:p>
@@ -892,11 +942,11 @@
         <w:pStyle w:val="BodyText"/>
       </w:pPr>
       <w:r>
-        <w:t xml:space="preserve">Há evidência direta de que essa escolha afeta o que o cliente recebe. Em 2025, a desenvolvedora de um modelo de pesos abertos criou uma ferramenta pública de verificação de revendedores, após constatar diferenças consideráveis de desempenho entre provedores que ofereciam o mesmo modelo pelo mesmo nome. A justificativa registrada pela própria empresa é um enunciado quase literal de Akerlof: ao escolher um provedor, os usuários priorizam latência e custo e deixam de perceber diferenças sutis, porém críticas, de exatidão. O verificador compara cada revendedor com a interface oficial em 4.000 requisições. Ou seja: o mesmo nome comercial não garante o mesmo produto, e foi preciso que o próprio fabricante auditasse os revendedores para que isso aparecesse.</w:t>
-      </w:r>
-    </w:p>
-    <w:bookmarkEnd w:id="33"/>
-    <w:bookmarkStart w:id="34" w:name="roteamento-entre-modelos-e-servidores"/>
+        <w:t xml:space="preserve">Há evidência direta de que essa escolha afeta o que o cliente recebe. Em 2025, a desenvolvedora de um modelo de pesos abertos criou uma ferramenta pública de verificação de revendedores, após constatar diferenças consideráveis de desempenho entre provedores que ofereciam o mesmo modelo pelo mesmo nome (Moonshot AI, 2025). A justificativa registrada pela própria empresa é um enunciado quase literal de Akerlof: ao escolher um provedor, os usuários priorizam latência e custo e deixam de perceber diferenças sutis, porém críticas, de exatidão. O verificador compara cada revendedor com a interface oficial em 4.000 requisições. Ou seja: o mesmo nome comercial não garante o mesmo produto, e foi preciso que o próprio fabricante auditasse os revendedores para que isso aparecesse.</w:t>
+      </w:r>
+    </w:p>
+    <w:bookmarkEnd w:id="34"/>
+    <w:bookmarkStart w:id="35" w:name="roteamento-entre-modelos-e-servidores"/>
     <w:p>
       <w:pPr>
         <w:pStyle w:val="Heading2"/>
@@ -913,8 +963,8 @@
         <w:t xml:space="preserve">Sistemas comerciais podem direcionar requisições para modelos ou configurações de servidor distintos conforme complexidade estimada, custo ou carga. Onde isso é anunciado, é recurso. Onde não é, é indistinguível, do lado do cliente, de variação aleatória de qualidade. A seção 6.2 descreve um incidente em que um erro de roteamento degradou parte expressiva das respostas por semanas.</w:t>
       </w:r>
     </w:p>
-    <w:bookmarkEnd w:id="34"/>
-    <w:bookmarkStart w:id="35" w:name="esforço-de-raciocínio"/>
+    <w:bookmarkEnd w:id="35"/>
+    <w:bookmarkStart w:id="36" w:name="esforço-de-raciocínio"/>
     <w:p>
       <w:pPr>
         <w:pStyle w:val="Heading2"/>
@@ -928,7 +978,7 @@
         <w:pStyle w:val="FirstParagraph"/>
       </w:pPr>
       <w:r>
-        <w:t xml:space="preserve">Modelos com etapa de raciocínio explícito expõem um parâmetro de quanto esforço aplicar antes de responder. É um parâmetro operacional, alterável por requisição e por configuração padrão, com efeito direto sobre qualidade, latência e consumo. Um fornecedor descreveu publicamente esse ajuste como a troca entre pensar mais e ter menor latência com menos esbarrões no limite de uso.</w:t>
+        <w:t xml:space="preserve">Modelos com etapa de raciocínio explícito expõem um parâmetro de quanto esforço aplicar antes de responder. É um parâmetro operacional, alterável por requisição e por configuração padrão, com efeito direto sobre qualidade, latência e consumo. Um fornecedor descreveu publicamente esse ajuste como a troca entre pensar mais e ter menor latência com menos esbarrões no limite de uso (Anthropic, 2026).</w:t>
       </w:r>
     </w:p>
     <w:p>
@@ -936,11 +986,11 @@
         <w:pStyle w:val="BodyText"/>
       </w:pPr>
       <w:r>
-        <w:t xml:space="preserve">Registra-se aqui uma correção que o argumento popular costuma precisar: cabeças de atenção não são reguláveis por requisição, são fixas na arquitetura treinada. Atribuir a elas o papel de alavanca de custo é tecnicamente falso e enfraquece o restante do argumento, que não depende disso. Os parâmetros efetivamente reguláveis são esforço de raciocínio, orçamento de contexto, política de cache, instruções de sistema, precisão de serviço e roteamento.</w:t>
-      </w:r>
-    </w:p>
-    <w:bookmarkEnd w:id="35"/>
-    <w:bookmarkStart w:id="36" w:name="política-de-cache"/>
+        <w:t xml:space="preserve">Registra-se aqui uma correção que o argumento popular costuma precisar: cabeças de atenção não são reguláveis por requisição, são fixas na arquitetura treinada (Vaswani et al., 2017). Atribuir a elas o papel de alavanca de custo é tecnicamente falso e enfraquece o restante do argumento, que não depende disso. Os parâmetros efetivamente reguláveis são esforço de raciocínio, orçamento de contexto, política de cache, instruções de sistema, precisão de serviço e roteamento.</w:t>
+      </w:r>
+    </w:p>
+    <w:bookmarkEnd w:id="36"/>
+    <w:bookmarkStart w:id="37" w:name="política-de-cache"/>
     <w:p>
       <w:pPr>
         <w:pStyle w:val="Heading2"/>
@@ -957,8 +1007,8 @@
         <w:t xml:space="preserve">Reaproveitar o estado já computado de uma conversa reduz custo de forma significativa. Uma falha nessa política pode elevar o consumo contabilizado contra a cota do usuário sem que nada na interface indique a mudança. A seção 6.2 registra exatamente esse caso.</w:t>
       </w:r>
     </w:p>
-    <w:bookmarkEnd w:id="36"/>
-    <w:bookmarkStart w:id="37" w:name="tokens-não-exibidos"/>
+    <w:bookmarkEnd w:id="37"/>
+    <w:bookmarkStart w:id="38" w:name="tokens-não-exibidos"/>
     <w:p>
       <w:pPr>
         <w:pStyle w:val="Heading2"/>
@@ -972,7 +1022,7 @@
         <w:pStyle w:val="FirstParagraph"/>
       </w:pPr>
       <w:r>
-        <w:t xml:space="preserve">Em modelos com raciocínio interno, parte dos tokens gerados não aparece na resposta, mas é contabilizada como saída e faturada. Sun et al. (2025) formalizaram o problema sob o nome de inflação de contagem de tokens: como o usuário paga por tokens de raciocínio invisíveis, que frequentemente representam a maior parte do custo, e não tem meio de verificar sua autenticidade, abre-se a possibilidade de o fornecedor declarar consumo maior do que o real ou inserir conteúdo de baixo esforço para aumentar a cobrança. Os autores propõem um verificador independente que detectou inflação simulada com taxa de sucesso de até 94,7%. Um trabalho complementar cunhou a expressão serviços comerciais opacos de modelos de linguagem e defendeu a urgência de auditoria dessas operações ocultas. Outro propôs estimar, do lado do usuário, a quantidade de tokens ocultos apenas a partir do par pergunta e resposta, sem acesso ao raciocínio interno.</w:t>
+        <w:t xml:space="preserve">Em modelos com raciocínio interno, parte dos tokens gerados não aparece na resposta, mas é contabilizada como saída e faturada. Sun et al. (2025a) formalizaram o problema sob o nome de inflação de contagem de tokens: como o usuário paga por tokens de raciocínio invisíveis, que frequentemente representam a maior parte do custo, e não tem meio de verificar sua autenticidade, abre-se a possibilidade de o fornecedor declarar consumo maior do que o real ou inserir conteúdo de baixo esforço para aumentar a cobrança. Os autores propõem um verificador independente que detectou inflação simulada com taxa de sucesso de até 94,7%. Parte dos mesmos autores, em trabalho de posição, chamou esses sistemas de serviços comerciais opacos de modelos de linguagem, defendeu a urgência de auditoria dessas operações ocultas e formalizou dois riscos: a inflação de quantidade, em que contagens de tokens e de chamadas podem ser infladas, e o rebaixamento de qualidade, em que o fornecedor pode trocar em silêncio o modelo ou a ferramenta por outros mais baratos (Sun et al., 2025b). O mesmo grupo de pesquisa propôs depois estimar, do lado do usuário, a quantidade de tokens ocultos apenas a partir do par pergunta e resposta, sem acesso ao raciocínio interno (Wang et al., 2025).</w:t>
       </w:r>
     </w:p>
     <w:p>
@@ -983,8 +1033,8 @@
         <w:t xml:space="preserve">É importante ler esses trabalhos corretamente. Eles não demonstram que algum fornecedor inflou a cobrança. Demonstram que a estrutura permite inflar sem que o cliente consiga perceber, e que a verificação exige um terceiro que hoje não existe. Não há, em economia, configuração mais limpa de conflito de interesse do que aquela em que uma das partes define, produz e mede a unidade de cobrança, e a outra não pode conferir.</w:t>
       </w:r>
     </w:p>
-    <w:bookmarkEnd w:id="37"/>
-    <w:bookmarkStart w:id="38" w:name="viés-de-comprimento-no-treinamento"/>
+    <w:bookmarkEnd w:id="38"/>
+    <w:bookmarkStart w:id="39" w:name="viés-de-comprimento-no-treinamento"/>
     <w:p>
       <w:pPr>
         <w:pStyle w:val="Heading2"/>
@@ -998,12 +1048,12 @@
         <w:pStyle w:val="FirstParagraph"/>
       </w:pPr>
       <w:r>
-        <w:t xml:space="preserve">Independentemente de qualquer decisão de infraestrutura, o treinamento por preferência humana introduz preferência sistemática por respostas longas, conforme a seção 3.5. O produto entregue ao usuário é, por construção do treinamento, mais longo do que precisaria ser. Em serviço faturado por token, mais longo significa mais caro. Um fornecedor admitiu publicamente, em 2026, que seu modelo mais recente era notavelmente verborrágico e que isso produzia mais tokens de saída.</w:t>
-      </w:r>
-    </w:p>
-    <w:bookmarkEnd w:id="38"/>
+        <w:t xml:space="preserve">Independentemente de qualquer decisão de infraestrutura, o treinamento por preferência humana introduz preferência sistemática por respostas longas, conforme a seção 3.5. O produto entregue ao usuário é, por construção do treinamento, mais longo do que precisaria ser. Em serviço faturado por token, mais longo significa mais caro. Um fornecedor admitiu publicamente, em 2026, que seu modelo mais recente era notavelmente verborrágico e que isso produzia mais tokens de saída (Anthropic, 2026).</w:t>
+      </w:r>
+    </w:p>
     <w:bookmarkEnd w:id="39"/>
-    <w:bookmarkStart w:id="52" w:name="a-evidência-disponível"/>
+    <w:bookmarkEnd w:id="40"/>
+    <w:bookmarkStart w:id="53" w:name="a-evidência-disponível"/>
     <w:p>
       <w:pPr>
         <w:pStyle w:val="Heading1"/>
@@ -1012,7 +1062,7 @@
         <w:t xml:space="preserve">6. A evidência disponível</w:t>
       </w:r>
     </w:p>
-    <w:bookmarkStart w:id="40" w:name="X41d356d8dbcd60a25f86cfedd5dad83f56ff730"/>
+    <w:bookmarkStart w:id="41" w:name="X41d356d8dbcd60a25f86cfedd5dad83f56ff730"/>
     <w:p>
       <w:pPr>
         <w:pStyle w:val="Heading2"/>
@@ -1034,7 +1084,7 @@
         <w:pStyle w:val="BodyText"/>
       </w:pPr>
       <w:r>
-        <w:t xml:space="preserve">Em janeiro de 2026, o veículo especializado The Information reportou, com base em pessoas com conhecimento das finanças da empresa, que um dos principais fornecedores de modelos de linguagem revisou sua projeção de margem bruta para 2025 de 50% para 40%, porque o custo de inferência, isto é, o custo de executar os modelos para os clientes em servidores de terceiros, ficou 23% acima do previsto. A margem bruta do ano anterior havia sido de 94% negativos. A meta de longo prazo da empresa, segundo a mesma reportagem, é superar 70%. Reportagem posterior do mesmo veículo indicou que outro grande fornecedor também ficou abaixo de sua própria meta de margem, pelo mesmo motivo.</w:t>
+        <w:t xml:space="preserve">Em janeiro de 2026, o veículo especializado The Information reportou, com base em pessoas com conhecimento das finanças da empresa, que um dos principais fornecedores de modelos de linguagem revisou sua projeção de margem bruta para 2025 de 50% para 40%, porque o custo de inferência, isto é, o custo de executar os modelos para os clientes em servidores de terceiros, ficou 23% acima do previsto. A margem bruta do ano anterior havia sido de 94% negativos. A meta de longo prazo da empresa, segundo a mesma reportagem, é superar 70% (Muppidi, 2026a; Tiger Brokers, 2026). Reportagem posterior do mesmo veículo indicou que outro grande fornecedor também ficou abaixo de sua própria meta de margem, pelo mesmo motivo (Muppidi, 2026b).</w:t>
       </w:r>
     </w:p>
     <w:p>
@@ -1042,7 +1092,7 @@
         <w:pStyle w:val="BodyText"/>
       </w:pPr>
       <w:r>
-        <w:t xml:space="preserve">Dois dados da mesma apuração são particularmente relevantes. Primeiro: para ir de 40% a mais de 70% de margem, a empresa precisa reduzir substancialmente o custo por requisição, e os parâmetros que controlam esse custo são exatamente os da seção 5. Segundo: estimou-se que cerca de 86% da receita desse fornecedor em 2025 viria da venda de acesso aos modelos para empresas por interface de programação, e o restante de assinaturas. A modalidade faturada por token não é marginal. É a maior parte do negócio.</w:t>
+        <w:t xml:space="preserve">Dois dados da mesma apuração são particularmente relevantes. Primeiro: para ir de 40% a mais de 70% de margem, a empresa precisa reduzir substancialmente o custo por requisição, e os parâmetros que controlam esse custo são exatamente os da seção 5. Segundo: estimou-se que cerca de 86% da receita desse fornecedor em 2025 viria da venda de acesso aos modelos para empresas por interface de programação, e o restante de assinaturas (Tiger Brokers, 2026). A modalidade faturada por token não é marginal. É a maior parte do negócio.</w:t>
       </w:r>
     </w:p>
     <w:p>
@@ -1053,8 +1103,8 @@
         <w:t xml:space="preserve">Nenhum desses dados prova degradação. Eles provam que existe, documentada, uma pressão financeira forte e específica sobre exatamente as variáveis que determinam a qualidade entregue.</w:t>
       </w:r>
     </w:p>
-    <w:bookmarkEnd w:id="40"/>
-    <w:bookmarkStart w:id="45" w:name="X7f27fdd2819f80c4b0f9b2f1406c13fe6af8623"/>
+    <w:bookmarkEnd w:id="41"/>
+    <w:bookmarkStart w:id="46" w:name="X7f27fdd2819f80c4b0f9b2f1406c13fe6af8623"/>
     <w:p>
       <w:pPr>
         <w:pStyle w:val="Heading2"/>
@@ -1071,7 +1121,7 @@
         <w:t xml:space="preserve">A evidência mais forte sobre degradação silenciosa não vem de usuários nem de pesquisadores: vem de relatórios técnicos que os próprios fornecedores publicaram depois que as reclamações se acumularam. Três episódios estão documentados.</w:t>
       </w:r>
     </w:p>
-    <w:bookmarkStart w:id="41" w:name="dezembro-de-2023"/>
+    <w:bookmarkStart w:id="42" w:name="dezembro-de-2023"/>
     <w:p>
       <w:pPr>
         <w:pStyle w:val="Heading3"/>
@@ -1085,11 +1135,11 @@
         <w:pStyle w:val="FirstParagraph"/>
       </w:pPr>
       <w:r>
-        <w:t xml:space="preserve">Usuários passaram a relatar que um dos modelos mais usados do mercado havia se tornado preguiçoso, recusando-se a concluir tarefas ou entregando respostas incompletas. O fornecedor reconheceu publicamente o problema, afirmou não ter alterado o modelo desde novembro e disse que o comportamento certamente não era intencional. Uma versão corrigida foi lançada em janeiro de 2024. A empresa não detalhou publicamente o que mudou.</w:t>
-      </w:r>
-    </w:p>
-    <w:bookmarkEnd w:id="41"/>
-    <w:bookmarkStart w:id="42" w:name="agosto-e-setembro-de-2025"/>
+        <w:t xml:space="preserve">Usuários passaram a relatar que um dos modelos mais usados do mercado havia se tornado preguiçoso, recusando-se a concluir tarefas ou entregando respostas incompletas. O fornecedor reconheceu publicamente o problema, afirmou não ter alterado o modelo desde novembro e disse que o comportamento certamente não era intencional (Tangermann, 2024). Uma versão corrigida foi lançada em janeiro de 2024 (OpenAI, 2024). A empresa não detalhou publicamente o que mudou (Tangermann, 2024).</w:t>
+      </w:r>
+    </w:p>
+    <w:bookmarkEnd w:id="42"/>
+    <w:bookmarkStart w:id="43" w:name="agosto-e-setembro-de-2025"/>
     <w:p>
       <w:pPr>
         <w:pStyle w:val="Heading3"/>
@@ -1103,11 +1153,11 @@
         <w:pStyle w:val="FirstParagraph"/>
       </w:pPr>
       <w:r>
-        <w:t xml:space="preserve">Um fornecedor publicou relatório descrevendo três falhas de infraestrutura que degradaram intermitentemente a qualidade das respostas entre agosto e o início de setembro de 2025. Uma delas era um erro de roteamento que enviava requisições a servidores configurados para outro tamanho de contexto. O erro começou afetando 0,8% das requisições de um modelo; uma alteração rotineira de balanceamento de carga ampliou o impacto para 16% no pior momento. Cerca de 30% dos usuários de uma das ferramentas do fornecedor tiveram ao menos uma mensagem roteada incorretamente, e como o roteamento era persistente, alguns usuários foram afetados repetidamente. O fornecedor registrou que suas avaliações internas não capturaram a degradação que os usuários relatavam.</w:t>
-      </w:r>
-    </w:p>
-    <w:bookmarkEnd w:id="42"/>
-    <w:bookmarkStart w:id="43" w:name="março-e-abril-de-2026"/>
+        <w:t xml:space="preserve">Um fornecedor publicou relatório descrevendo três falhas de infraestrutura que degradaram intermitentemente a qualidade das respostas entre agosto e o início de setembro de 2025 (Anthropic, 2025). Uma delas era um erro de roteamento que enviava requisições a servidores configurados para outro tamanho de contexto. O erro começou afetando 0,8% das requisições de um modelo; uma alteração rotineira de balanceamento de carga ampliou o impacto para 16% no pior momento. Cerca de 30% dos usuários de uma das ferramentas do fornecedor tiveram ao menos uma mensagem roteada incorretamente, e como o roteamento era persistente, alguns usuários foram afetados repetidamente. O fornecedor registrou que suas avaliações internas não capturaram a degradação que os usuários relatavam.</w:t>
+      </w:r>
+    </w:p>
+    <w:bookmarkEnd w:id="43"/>
+    <w:bookmarkStart w:id="44" w:name="março-e-abril-de-2026"/>
     <w:p>
       <w:pPr>
         <w:pStyle w:val="Heading3"/>
@@ -1121,7 +1171,7 @@
         <w:pStyle w:val="FirstParagraph"/>
       </w:pPr>
       <w:r>
-        <w:t xml:space="preserve">Em abril de 2026, o mesmo fornecedor publicou relatório atribuindo seis semanas de reclamações sobre sua ferramenta de programação a três mudanças distintas. Primeira: em 4 de março, o nível padrão de esforço de raciocínio foi reduzido de alto para médio, para diminuir latência; a empresa classificou a decisão como a troca errada e a reverteu em 7 de abril. Segunda: em 26 de março, uma otimização de cache para reduzir o custo de retomar sessões inativas continha um defeito que passou a descartar o raciocínio anterior a cada turno, fazendo o sistema parecer esquecido e repetitivo; corrigida em 10 de abril. Terceira: em 16 de abril, uma instrução de sistema para reduzir verbosidade prejudicou a qualidade de código em cerca de 3% numa avaliação ampliada, e foi revertida em 20 de abril.</w:t>
+        <w:t xml:space="preserve">Em abril de 2026, o mesmo fornecedor publicou relatório atribuindo seis semanas de reclamações sobre sua ferramenta de programação a três mudanças distintas (Anthropic, 2026). Primeira: em 4 de março, o nível padrão de esforço de raciocínio foi reduzido de alto para médio, para diminuir latência; a empresa classificou a decisão como a troca errada e a reverteu em 7 de abril. Segunda: em 26 de março, uma otimização de cache para reduzir o custo de retomar sessões inativas continha um defeito que passou a descartar o raciocínio anterior a cada turno, fazendo o sistema parecer esquecido e repetitivo; corrigida em 10 de abril. Terceira: em 16 de abril, uma instrução de sistema para reduzir verbosidade prejudicou a qualidade de código em cerca de 3% numa avaliação ampliada, e foi revertida em 20 de abril.</w:t>
       </w:r>
     </w:p>
     <w:p>
@@ -1129,7 +1179,7 @@
         <w:pStyle w:val="BodyText"/>
       </w:pPr>
       <w:r>
-        <w:t xml:space="preserve">Quatro trechos desse relatório merecem atenção, e todos estão ali escritos pelo fornecedor, não inferidos por terceiros.</w:t>
+        <w:t xml:space="preserve">Quatro trechos desse relatório merecem atenção, e todos estão ali escritos pelo fornecedor, não inferidos por terceiros (Anthropic, 2026).</w:t>
       </w:r>
     </w:p>
     <w:p>
@@ -1212,8 +1262,8 @@
         <w:t xml:space="preserve">O relatório afirma também que a empresa nunca degrada intencionalmente seus modelos e que a interface de programação e a camada de inferência não foram afetadas. Não há razão para supor que essa afirmação seja falsa; ela é compatível com os fatos narrados, que descrevem decisões de produto e defeitos, não uma ordem para piorar o serviço. A seção 6.5 trata do valor informativo dessa afirmação.</w:t>
       </w:r>
     </w:p>
-    <w:bookmarkEnd w:id="43"/>
-    <w:bookmarkStart w:id="44" w:name="o-que-os-três-episódios-estabelecem"/>
+    <w:bookmarkEnd w:id="44"/>
+    <w:bookmarkStart w:id="45" w:name="o-que-os-três-episódios-estabelecem"/>
     <w:p>
       <w:pPr>
         <w:pStyle w:val="Heading3"/>
@@ -1230,9 +1280,9 @@
         <w:t xml:space="preserve">Três conclusões se extraem desses documentos sem necessidade de inferência. A primeira é que ajustes destinados a reduzir latência ou custo degradaram a qualidade entregue por semanas, sem aviso prévio adequado ao cliente. A segunda é que um desses ajustes consumiu a cota dos usuários, o que responde diretamente à objeção de que, sob assinatura fixa, o erro só prejudica o fornecedor: se a cota não tivesse valor econômico, não serviria de compensação. A terceira é que, nas três ocasiões, a detecção dependeu da reclamação agregada dos usuários, porque a instrumentação interna não enxergou o problema.</w:t>
       </w:r>
     </w:p>
-    <w:bookmarkEnd w:id="44"/>
     <w:bookmarkEnd w:id="45"/>
-    <w:bookmarkStart w:id="48" w:name="a-insuficiência-da-auditoria-existente"/>
+    <w:bookmarkEnd w:id="46"/>
+    <w:bookmarkStart w:id="49" w:name="a-insuficiência-da-auditoria-existente"/>
     <w:p>
       <w:pPr>
         <w:pStyle w:val="Heading2"/>
@@ -1269,7 +1319,7 @@
         <w:t xml:space="preserve">não é, por si, evidência de nada. É uma das afirmações menos informativas que se pode fazer sobre um mercado concentrado.</w:t>
       </w:r>
     </w:p>
-    <w:bookmarkStart w:id="46" w:name="X76346f846a7b0d9996976de488f53be203ec904"/>
+    <w:bookmarkStart w:id="47" w:name="X76346f846a7b0d9996976de488f53be203ec904"/>
     <w:p>
       <w:pPr>
         <w:pStyle w:val="Heading3"/>
@@ -1318,8 +1368,8 @@
         <w:t xml:space="preserve">A pergunta correta, portanto, nunca é se existe auditoria. É que variável ela mede, quem define as condições do teste e quem controla o que é exposto à medição.</w:t>
       </w:r>
     </w:p>
-    <w:bookmarkEnd w:id="46"/>
-    <w:bookmarkStart w:id="47" w:name="Xfe070460c76cadc8008e2dae8382bceb27e4cd1"/>
+    <w:bookmarkEnd w:id="47"/>
+    <w:bookmarkStart w:id="48" w:name="Xfe070460c76cadc8008e2dae8382bceb27e4cd1"/>
     <w:p>
       <w:pPr>
         <w:pStyle w:val="Heading3"/>
@@ -1369,7 +1419,7 @@
         </w:numPr>
       </w:pPr>
       <w:r>
-        <w:t xml:space="preserve">Os placares comparativos medem o que a empresa escolheu submeter. Singh et al. (2025), em trabalho publicado na NeurIPS, documentaram que práticas não divulgadas de teste privado permitiam a poucos fornecedores avaliar múltiplas variantes antes do lançamento e retirar resultados desfavoráveis; em um caso extremo, um fornecedor testou 27 variantes privadas antes de um único lançamento. Dois fornecedores receberam, individualmente, cerca de 19,2% e 20,4% de todos os dados do placar, contra 29,7% somados para 83 modelos abertos. Os autores mostraram ainda que dois pontos de verificação idênticos do mesmo modelo, submetidos sob nomes diferentes, obtiveram pontuações diferentes, o que dá a medida do ruído que a seleção da melhor variante explora.</w:t>
+        <w:t xml:space="preserve">Os placares comparativos medem o que a empresa escolheu submeter. Singh et al. (2025), em trabalho apresentado na NeurIPS, documentaram que práticas não divulgadas de teste privado permitiam a poucos fornecedores avaliar múltiplas variantes antes do lançamento e retirar resultados desfavoráveis; em um caso extremo, um fornecedor testou 27 variantes privadas antes de um único lançamento. Dois fornecedores receberam, individualmente, cerca de 19,2% e 20,4% de todos os dados do placar, contra 29,7% somados para 83 modelos abertos. Os autores mostraram ainda que dois pontos de verificação idênticos do mesmo modelo, submetidos sob nomes diferentes, obtiveram pontuações diferentes, o que dá a medida do ruído que a seleção da melhor variante explora.</w:t>
       </w:r>
     </w:p>
     <w:p>
@@ -1392,9 +1442,9 @@
         <w:t xml:space="preserve">A consequência é direta: um placar mede o que a empresa escolheu expor, na versão que escolheu expor, no momento em que escolheu expor. Isso é vitrine, não auditoria. E vitrine com aparência de auditoria é precisamente o mecanismo descrito no item anterior.</w:t>
       </w:r>
     </w:p>
-    <w:bookmarkEnd w:id="47"/>
     <w:bookmarkEnd w:id="48"/>
-    <w:bookmarkStart w:id="49" w:name="a-medição-externa-que-funcionou"/>
+    <w:bookmarkEnd w:id="49"/>
+    <w:bookmarkStart w:id="50" w:name="a-medição-externa-que-funcionou"/>
     <w:p>
       <w:pPr>
         <w:pStyle w:val="Heading2"/>
@@ -1416,7 +1466,7 @@
         <w:pStyle w:val="BodyText"/>
       </w:pPr>
       <w:r>
-        <w:t xml:space="preserve">Durante o episódio de 2026, antes do relatório oficial, uma diretora sênior do grupo de IA de uma fabricante de chips publicou análise de 6.852 arquivos de sessão e mais de 234 mil chamadas de ferramenta de seu próprio uso da ferramenta de programação afetada, mostrando mudança de comportamento compatível com redução de profundidade de raciocínio. Nem todas as conclusões dessa análise foram confirmadas oficialmente, mas os sintomas relatados coincidem com o que o relatório do fornecedor viria a descrever semanas depois.</w:t>
+        <w:t xml:space="preserve">Durante o episódio de 2026, antes do relatório oficial, uma diretora sênior do grupo de IA de uma fabricante de chips publicou análise de 6.852 arquivos de sessão e mais de 234 mil chamadas de ferramenta de seu próprio uso da ferramenta de programação afetada, mostrando mudança de comportamento compatível com redução de profundidade de raciocínio (Franzen, 2026). Nem todas as conclusões dessa análise foram confirmadas oficialmente, mas os sintomas relatados coincidem com o que o relatório do fornecedor viria a descrever semanas depois.</w:t>
       </w:r>
     </w:p>
     <w:p>
@@ -1443,8 +1493,8 @@
         <w:t xml:space="preserve">A conclusão metodológica é a mesma dos precedentes: a medição externa não é apenas possível. É o único mecanismo que, historicamente, produziu o fato.</w:t>
       </w:r>
     </w:p>
-    <w:bookmarkEnd w:id="49"/>
-    <w:bookmarkStart w:id="50" w:name="o-padrão-das-negações"/>
+    <w:bookmarkEnd w:id="50"/>
+    <w:bookmarkStart w:id="51" w:name="o-padrão-das-negações"/>
     <w:p>
       <w:pPr>
         <w:pStyle w:val="Heading2"/>
@@ -1458,7 +1508,7 @@
         <w:pStyle w:val="FirstParagraph"/>
       </w:pPr>
       <w:r>
-        <w:t xml:space="preserve">Os precedentes da seção 4 e os episódios da seção 6.2 compartilham uma fórmula retórica. Em 2017, uma fabricante de smartphones declarou que nunca faria nada para encurtar intencionalmente a vida de seus produtos. Em 2023, um fornecedor de IA declarou que a queda de qualidade certamente não era intencional. Em 2026, outro fornecedor declarou que nunca degrada intencionalmente seus modelos. Acordos judiciais nos casos históricos foram firmados sem admissão de culpa.</w:t>
+        <w:t xml:space="preserve">Os precedentes da seção 4 e os episódios da seção 6.2 compartilham uma fórmula retórica. Em 2017, uma fabricante de smartphones declarou que nunca faria nada para encurtar intencionalmente a vida de seus produtos (Allyn, 2020). Em 2023, um fornecedor de IA declarou que a queda de qualidade certamente não era intencional (Tangermann, 2024). Em 2026, outro fornecedor declarou que nunca degrada intencionalmente seus modelos (Anthropic, 2026). Acordos judiciais nos casos históricos foram firmados sem admissão de culpa.</w:t>
       </w:r>
     </w:p>
     <w:p>
@@ -1469,8 +1519,8 @@
         <w:t xml:space="preserve">A observação correta sobre esse padrão não é que as negações sejam falsas. É que elas não são informativas em nenhuma direção. Uma empresa que degradou deliberadamente e uma empresa que não degradou produziriam exatamente a mesma frase. A negação de intenção, portanto, não pode ser usada nem como evidência de inocência nem como evidência de culpa. Ela simplesmente não carrega informação, e só a medição carrega.</w:t>
       </w:r>
     </w:p>
-    <w:bookmarkEnd w:id="50"/>
-    <w:bookmarkStart w:id="51" w:name="a-confissão-também-não-é-informativa"/>
+    <w:bookmarkEnd w:id="51"/>
+    <w:bookmarkStart w:id="52" w:name="a-confissão-também-não-é-informativa"/>
     <w:p>
       <w:pPr>
         <w:pStyle w:val="Heading2"/>
@@ -1521,7 +1571,7 @@
         <w:pStyle w:val="BodyText"/>
       </w:pPr>
       <w:r>
-        <w:t xml:space="preserve">A literatura da seção 3.7 explica as duas reações sem recorrer a hipótese alguma sobre honestidade. A capitulação sob pressão é o comportamento esperado de um sistema treinado por preferência humana, que aprendeu que concordar com o interlocutor tende a ser recompensado. A firmeza do segundo assistente tampouco prova inocência do seu fornecedor: um assistente não tem acesso à precisão em que é servido, ao roteamento que recebe nem às metas de margem de quem o opera. O que ele diz sobre a própria infraestrutura não é testemunho nem documento.</w:t>
+        <w:t xml:space="preserve">A literatura da seção 3.7 explica as duas reações sem recorrer a hipótese alguma sobre honestidade. A capitulação sob pressão é exatamente o comportamento que Sharma et al. (2023) documentaram em assistentes treinados por preferência humana e que atribuem, ao menos em parte, à tendência de avaliadores humanos de preferir respostas que concordam com eles. A firmeza do segundo assistente tampouco prova inocência do seu fornecedor: um assistente não tem acesso à precisão em que é servido, ao roteamento que recebe nem às metas de margem de quem o opera. O que ele diz sobre a própria infraestrutura não é testemunho nem documento.</w:t>
       </w:r>
     </w:p>
     <w:p>
@@ -1541,9 +1591,9 @@
         <w:t xml:space="preserve">. Ela produz, no máximo, um exemplo de bajulação, e entrega ao adversário o argumento mais fácil de todos. Só a medição carrega informação.</w:t>
       </w:r>
     </w:p>
-    <w:bookmarkEnd w:id="51"/>
     <w:bookmarkEnd w:id="52"/>
-    <w:bookmarkStart w:id="58" w:name="contra-argumentos-e-limites-da-tese"/>
+    <w:bookmarkEnd w:id="53"/>
+    <w:bookmarkStart w:id="59" w:name="contra-argumentos-e-limites-da-tese"/>
     <w:p>
       <w:pPr>
         <w:pStyle w:val="Heading1"/>
@@ -1560,7 +1610,7 @@
         <w:t xml:space="preserve">Um ensaio que apenas acumulasse indícios favoráveis seria peça de retórica. Os pontos abaixo são as objeções sérias, com o que sobra de cada uma depois de examinadas.</w:t>
       </w:r>
     </w:p>
-    <w:bookmarkStart w:id="53" w:name="Xbc4d17c1e3e40310eb13684662f045f3f849894"/>
+    <w:bookmarkStart w:id="54" w:name="Xbc4d17c1e3e40310eb13684662f045f3f849894"/>
     <w:p>
       <w:pPr>
         <w:pStyle w:val="Heading2"/>
@@ -1577,8 +1627,8 @@
         <w:t xml:space="preserve">A objeção é correta em sua aritmética imediata: em plano de valor fixo, uma resposta refeita é processamento pago pelo fornecedor sem receita adicional. Mas ela sofre três limitações documentadas. Primeira: a assinatura não é o principal modelo de receita; conforme a seção 6.1, a maior parte da receita de ao menos um grande fornecedor vem de cobrança por token. Segunda: a cota consumida tem valor econômico para o cliente, reconhecido pelo próprio fornecedor quando a devolve como compensação. Terceira: o limite atingido empurra o usuário para planos superiores. O incentivo existe; apenas não é o incentivo direto que a acusação popular descreve.</w:t>
       </w:r>
     </w:p>
-    <w:bookmarkEnd w:id="53"/>
-    <w:bookmarkStart w:id="54" w:name="cliente-insatisfeito-troca-de-fornecedor"/>
+    <w:bookmarkEnd w:id="54"/>
+    <w:bookmarkStart w:id="55" w:name="cliente-insatisfeito-troca-de-fornecedor"/>
     <w:p>
       <w:pPr>
         <w:pStyle w:val="Heading2"/>
@@ -1595,8 +1645,8 @@
         <w:t xml:space="preserve">A objeção supõe alternativa disponível e livre de custo. Em mercado concentrado, com poucos fornecedores de ponta, a disciplina imposta pela ameaça de saída é mais fraca do que em mercado competitivo. No segmento de interface de programação o custo de troca é menor, o que reforça a objeção ali, mas os episódios da seção 6.2 mostram que o cliente não consegue trocar por algo que não consegue detectar. A ameaça de saída só disciplina o que é visível.</w:t>
       </w:r>
     </w:p>
-    <w:bookmarkEnd w:id="54"/>
-    <w:bookmarkStart w:id="55" w:name="Xabca18f2b1dde2b533999e3f7c47633fd4bbe64"/>
+    <w:bookmarkEnd w:id="55"/>
+    <w:bookmarkStart w:id="56" w:name="Xabca18f2b1dde2b533999e3f7c47633fd4bbe64"/>
     <w:p>
       <w:pPr>
         <w:pStyle w:val="Heading2"/>
@@ -1654,8 +1704,8 @@
         <w:t xml:space="preserve">valesse como regra de argumentação, valeria contra qualquer empresa fechada e contra qualquer acusação, inclusive as falsas. Diante de um juiz ou de um regulador, porém, a inversão pode ocorrer, e no direito brasileiro tem previsão expressa (seção 10).</w:t>
       </w:r>
     </w:p>
-    <w:bookmarkEnd w:id="55"/>
-    <w:bookmarkStart w:id="56" w:name="X2e0b746a2039f5a59c592d1fc22074eae3e28da"/>
+    <w:bookmarkEnd w:id="56"/>
+    <w:bookmarkStart w:id="57" w:name="X2e0b746a2039f5a59c592d1fc22074eae3e28da"/>
     <w:p>
       <w:pPr>
         <w:pStyle w:val="Heading2"/>
@@ -1713,7 +1763,7 @@
         <w:t xml:space="preserve"> </w:t>
       </w:r>
       <w:r>
-        <w:t xml:space="preserve">Vai além do que o estudo afirma. Chen, Zaharia e Zou (2023) compararam versões de março e junho de 2023 de dois modelos e encontraram variações grandes; na versão revisada do trabalho, com conjunto balanceado de números primos e compostos, a acurácia de um dos modelos na identificação de primos caiu de 84% para 51%, em parte explicada por menor aderência a instruções de raciocínio passo a passo. A primeira versão do estudo, no entanto, usava apenas números primos, o que foi criticado por Narayanan e Kapoor, e um dos autores confirmou publicamente que o trabalho não sugere degradação intencional. Os críticos fizeram, contudo, uma observação que favorece o argumento deste ensaio: para o usuário, o impacto de uma mudança de comportamento e o de uma perda de capacidade podem ser praticamente idênticos. Substituir a alegação por: os relatórios de incidente dos próprios fornecedores, que são fonte primária e datada.</w:t>
+        <w:t xml:space="preserve">Vai além do que o estudo afirma. Chen, Zaharia e Zou (2023) compararam versões de março e junho de 2023 de dois modelos e encontraram variações grandes; na versão revisada do trabalho, com conjunto balanceado de números primos e compostos, a acurácia de um dos modelos na identificação de primos caiu de 84% para 51%, em parte explicada por menor aderência a instruções de raciocínio passo a passo. A primeira versão do estudo, no entanto, usava apenas números primos, o que foi criticado por Narayanan e Kapoor (2023), e um dos autores confirmou publicamente que o trabalho não sugere degradação intencional. Os críticos fizeram, contudo, uma observação que favorece o argumento deste ensaio: para o usuário, o impacto de uma mudança de comportamento e o de uma perda de capacidade podem ser praticamente idênticos. Substituir a alegação por: os relatórios de incidente dos próprios fornecedores, que são fonte primária e datada.</w:t>
       </w:r>
     </w:p>
     <w:p>
@@ -1796,7 +1846,7 @@
         <w:t xml:space="preserve"> </w:t>
       </w:r>
       <w:r>
-        <w:t xml:space="preserve">designa a mudança, ao longo do tempo, na distribuição dos dados que chegam a um modelo que permaneceu inalterado. Não designa o fornecedor alterando o serviço. Substituir por: variação de comportamento entre versões de um mesmo nome comercial (Chen, Zaharia e Zou) e degradação reconhecida por escrito em relatórios de incidente (seção 6.2).</w:t>
+        <w:t xml:space="preserve">designa a mudança, ao longo do tempo, na distribuição dos dados que chegam a um modelo inalterado, ou na relação entre esses dados e o resultado esperado (Gama et al., 2014). Não designa o fornecedor alterando o serviço. Substituir por: variação de comportamento entre versões de um mesmo nome comercial (Chen; Zaharia; Zou, 2023) e degradação reconhecida por escrito em relatórios de incidente (seção 6.2).</w:t>
       </w:r>
     </w:p>
     <w:p>
@@ -1824,7 +1874,7 @@
         <w:t xml:space="preserve"> </w:t>
       </w:r>
       <w:r>
-        <w:t xml:space="preserve">mistura uma multa de 25 milhões de euros com acordos firmados sem admissão de culpa (seção 4.2).</w:t>
+        <w:t xml:space="preserve">mistura uma transação penal de 25 milhões de euros com acordos firmados sem admissão de culpa (seção 4.2).</w:t>
       </w:r>
       <w:r>
         <w:t xml:space="preserve"> </w:t>
@@ -1836,11 +1886,11 @@
         <w:t xml:space="preserve"> </w:t>
       </w:r>
       <w:r>
-        <w:t xml:space="preserve">não foi conferido em fonte primária. Substituir pelos valores e pela formulação da denúncia registrados nas seções 4.2 e 4.3. Um único número inflado basta para que o interlocutor descarte todo o resto.</w:t>
-      </w:r>
-    </w:p>
-    <w:bookmarkEnd w:id="56"/>
-    <w:bookmarkStart w:id="57" w:name="X53510272acc55d16665b5a4c8e5f7cf222e9139"/>
+        <w:t xml:space="preserve">também não corresponde à fonte: a associação autora da denúncia fala em mais de 20% de tinta restante em alguns cartuchos, segundo sua própria investigação, número que ainda não foi julgado (Halte à l’Obsolescence Programmée, 2026a). Substituir pelos valores e pela formulação registrados nas seções 4.2 e 4.3. Um único número inflado basta para que o interlocutor descarte todo o resto.</w:t>
+      </w:r>
+    </w:p>
+    <w:bookmarkEnd w:id="57"/>
+    <w:bookmarkStart w:id="58" w:name="X53510272acc55d16665b5a4c8e5f7cf222e9139"/>
     <w:p>
       <w:pPr>
         <w:pStyle w:val="Heading2"/>
@@ -1865,9 +1915,9 @@
         <w:t xml:space="preserve">Isso não enfraquece a tese estrutural; refina-a. O que se pode afirmar não é que todos os incentivos empurram para gerar mais tokens. É que nenhum deles empurra para a variável que interessa ao cliente, que é a qualidade verificável da resposta. Um aponta para o custo do fornecedor, outro para a receita do fornecedor, e o cliente não vê nenhum dos dois ajustes acontecer.</w:t>
       </w:r>
     </w:p>
-    <w:bookmarkEnd w:id="57"/>
     <w:bookmarkEnd w:id="58"/>
-    <w:bookmarkStart w:id="59" w:name="a-formulação-defensável"/>
+    <w:bookmarkEnd w:id="59"/>
+    <w:bookmarkStart w:id="60" w:name="a-formulação-defensável"/>
     <w:p>
       <w:pPr>
         <w:pStyle w:val="Heading1"/>
@@ -1900,8 +1950,8 @@
         <w:t xml:space="preserve">Formulada assim, a tese não depende de atribuir má-fé a ninguém, não depende de acesso a documentos internos, não depende de arrancar confissão de nenhum assistente e não é derrubada pela objeção da assinatura fixa. Ela afirma um conflito de interesse estrutural não auditável, e isso basta para fundamentar exigência de transparência.</w:t>
       </w:r>
     </w:p>
-    <w:bookmarkEnd w:id="59"/>
-    <w:bookmarkStart w:id="60" w:name="agenda-de-teste-empírico"/>
+    <w:bookmarkEnd w:id="60"/>
+    <w:bookmarkStart w:id="61" w:name="agenda-de-teste-empírico"/>
     <w:p>
       <w:pPr>
         <w:pStyle w:val="Heading1"/>
@@ -1915,7 +1965,7 @@
         <w:pStyle w:val="FirstParagraph"/>
       </w:pPr>
       <w:r>
-        <w:t xml:space="preserve">A tese proposta é testável, e essa é sua principal vantagem sobre a versão popular. É também o passo que acrescentaria a este trabalho dados empíricos próprios: executar o desenho abaixo e publicar os dados. Os instrumentos já existem de forma dispersa: conjuntos públicos de prompts e respostas (Chen, Zaharia e Zou), verificadores de revendedor (seção 5.1) e protocolos de auditoria de tokens ocultos (seção 5.5). Falta integrá-los numa série histórica contínua e independente. Um desenho mínimo incluiria os seguintes elementos.</w:t>
+        <w:t xml:space="preserve">A tese proposta é testável, e essa é sua principal vantagem sobre a versão popular. É também o passo que acrescentaria a este trabalho dados empíricos próprios: executar o desenho abaixo e publicar os dados. Os instrumentos já existem de forma dispersa: conjuntos públicos de prompts e respostas (Chen; Zaharia; Zou, 2023), verificadores de revendedor (seção 5.1) e protocolos de auditoria de tokens ocultos (seção 5.5). Falta integrá-los numa série histórica contínua e independente. Um desenho mínimo incluiria os seguintes elementos.</w:t>
       </w:r>
     </w:p>
     <w:p>
@@ -1986,8 +2036,8 @@
         <w:t xml:space="preserve">Quatro exigências regulatórias decorrem diretamente do diagnóstico: divulgação da precisão numérica em que o modelo é servido; divulgação da política de roteamento por requisição; registro público e datado de alterações de configuração padrão que afetem qualidade ou consumo; e discriminação, na fatura ou no painel de consumo, entre tokens visíveis e tokens não exibidos.</w:t>
       </w:r>
     </w:p>
-    <w:bookmarkEnd w:id="60"/>
-    <w:bookmarkStart w:id="61" w:name="uma-questão-jurídica-em-aberto"/>
+    <w:bookmarkEnd w:id="61"/>
+    <w:bookmarkStart w:id="62" w:name="uma-questão-jurídica-em-aberto"/>
     <w:p>
       <w:pPr>
         <w:pStyle w:val="Heading1"/>
@@ -2001,7 +2051,7 @@
         <w:pStyle w:val="FirstParagraph"/>
       </w:pPr>
       <w:r>
-        <w:t xml:space="preserve">A lei francesa de 2015 que tipifica a obsolescência programada abrange expressamente técnicas de software voltadas a reduzir deliberadamente a vida útil de um produto, e o primeiro processo criminal fundado nela está em curso em 2026. Fica em aberto se um enquadramento semelhante poderia alcançar serviços contínuos, que não têm vida útil no sentido tradicional. Um serviço de assinatura não se desgasta: ele é reconfigurado. A pergunta jurídica relevante talvez não seja se o serviço dura menos, e sim se a qualidade contratada pode ser reduzida sem aviso por parâmetros que o cliente não vê.</w:t>
+        <w:t xml:space="preserve">A lei francesa que tipifica a obsolescência programada desde 2015 passou a abranger expressamente, em 2021, técnicas de software voltadas a reduzir deliberadamente a vida útil de um produto (França, 2015, 2021), e o primeiro processo criminal fundado nela está em curso em 2026 (Halte à l’Obsolescence Programmée, 2026b). Fica em aberto se um enquadramento semelhante poderia alcançar serviços contínuos, que não têm vida útil no sentido tradicional. Um serviço de assinatura não se desgasta: ele é reconfigurado. A pergunta jurídica relevante talvez não seja se o serviço dura menos, e sim se a qualidade contratada pode ser reduzida sem aviso por parâmetros que o cliente não vê.</w:t>
       </w:r>
     </w:p>
     <w:p>
@@ -2009,7 +2059,7 @@
         <w:pStyle w:val="BodyText"/>
       </w:pPr>
       <w:r>
-        <w:t xml:space="preserve">No Brasil, o Código de Defesa do Consumidor (Lei 8.078/1990) oferece dois pontos de apoio para essa pergunta. O art. 6º, inciso III, garante ao consumidor informação adequada e clara sobre os diferentes produtos e serviços, com especificação correta de características, composição, qualidade e preço. O art. 6º, inciso VIII, prevê a facilitação da defesa do consumidor, inclusive com a inversão do ônus da prova a seu favor, no processo civil, quando, a critério do juiz, for verossímil a alegação ou quando ele for hipossuficiente. A jurisprudência do Superior Tribunal de Justiça registra que essa inversão não é automática: depende de verossimilhança ou hipossuficiência avaliadas no caso concreto.</w:t>
+        <w:t xml:space="preserve">No Brasil, o Código de Defesa do Consumidor (Lei nº 8.078/1990) oferece dois pontos de apoio para essa pergunta (Brasil, 1990). O art. 6º, inciso III, garante ao consumidor informação adequada e clara sobre os diferentes produtos e serviços, com especificação correta de características, composição, qualidade e preço. O art. 6º, inciso VIII, prevê a facilitação da defesa do consumidor, inclusive com a inversão do ônus da prova a seu favor, no processo civil, quando, a critério do juiz, for verossímil a alegação ou quando ele for hipossuficiente. A jurisprudência do Superior Tribunal de Justiça é firme em que essa inversão não é automática: depende da verossimilhança ou da hipossuficiência avaliadas no caso concreto (Brasil, 2026).</w:t>
       </w:r>
     </w:p>
     <w:p>
@@ -2020,8 +2070,8 @@
         <w:t xml:space="preserve">A intuição de que o ônus deveria recair sobre quem detém toda a informação, portanto, não é apenas retórica de debate. Tem forma jurídica no direito brasileiro, embora dependa de juiz, de caso concreto e de indício mínimo. É justamente esse indício mínimo que a agenda da seção 9 produziria. Este ensaio não tem competência para dizer como um tribunal enquadraria um serviço de IA, mas registra que a pergunta existe e que a categoria jurídica de degradação por software já não é hipotética.</w:t>
       </w:r>
     </w:p>
-    <w:bookmarkEnd w:id="61"/>
-    <w:bookmarkStart w:id="62" w:name="conclusão"/>
+    <w:bookmarkEnd w:id="62"/>
+    <w:bookmarkStart w:id="63" w:name="conclusão"/>
     <w:p>
       <w:pPr>
         <w:pStyle w:val="Heading1"/>
@@ -2062,61 +2112,398 @@
         <w:t xml:space="preserve">Esse conjunto não prova má-fé. Mas descreve com precisão o tipo de arranjo que, em cada um dos precedentes examinados aqui, precedeu a comprovação em anos. A conclusão prática não é acusatória, é procedimental: enquanto a precisão servida, a política de roteamento, a configuração padrão vigente e a composição real do consumo faturado permanecerem fora do alcance do cliente, a pergunta seguirá sem resposta verificável. Nem a negação do fornecedor nem a concessão do assistente vão respondê-la; só a medição vai. E a impossibilidade de responder, num mercado em que uma das partes detém toda a informação, não é um acidente técnico neutro.</w:t>
       </w:r>
     </w:p>
-    <w:bookmarkEnd w:id="62"/>
-    <w:bookmarkStart w:id="63" w:name="referências"/>
+    <w:bookmarkEnd w:id="63"/>
+    <w:bookmarkStart w:id="64" w:name="declarações"/>
     <w:p>
       <w:pPr>
         <w:pStyle w:val="Heading1"/>
       </w:pPr>
       <w:r>
+        <w:t xml:space="preserve">Declarações</w:t>
+      </w:r>
+    </w:p>
+    <w:p>
+      <w:pPr>
+        <w:pStyle w:val="FirstParagraph"/>
+      </w:pPr>
+      <w:r>
+        <w:rPr>
+          <w:b/>
+          <w:bCs/>
+        </w:rPr>
+        <w:t xml:space="preserve">Uso de inteligência artificial.</w:t>
+      </w:r>
+      <w:r>
+        <w:t xml:space="preserve"> </w:t>
+      </w:r>
+      <w:r>
+        <w:t xml:space="preserve">Na elaboração deste trabalho foram usados assistentes de inteligência artificial generativa, entre eles o Claude, da Anthropic, para consolidar versões anteriores do texto, organizar e revisar a redação, localizar e conferir fontes, traduzir o resumo e padronizar citações e referências segundo as normas da ABNT. Todo o conteúdo foi revisto pelo autor, que assume integral responsabilidade por ele. Nenhuma ferramenta de IA figura como autora. Registra-se, por transparência, que a Anthropic é uma das empresas cujos relatórios e dados financeiros são analisados nas seções 6.1 e 6.2; o uso de seu assistente não implica endosso nem revisão do texto pela empresa. As conversas com assistentes descritas na seção 6.6 e no Apêndice A são objeto de análise, não ferramenta de redação.</w:t>
+      </w:r>
+    </w:p>
+    <w:p>
+      <w:pPr>
+        <w:pStyle w:val="BodyText"/>
+      </w:pPr>
+      <w:r>
+        <w:rPr>
+          <w:b/>
+          <w:bCs/>
+        </w:rPr>
+        <w:t xml:space="preserve">Conflito de interesse.</w:t>
+      </w:r>
+      <w:r>
+        <w:t xml:space="preserve"> </w:t>
+      </w:r>
+      <w:r>
+        <w:t xml:space="preserve">O autor declara não haver conflito de interesse.</w:t>
+      </w:r>
+    </w:p>
+    <w:p>
+      <w:pPr>
+        <w:pStyle w:val="BodyText"/>
+      </w:pPr>
+      <w:r>
+        <w:rPr>
+          <w:b/>
+          <w:bCs/>
+        </w:rPr>
+        <w:t xml:space="preserve">Financiamento.</w:t>
+      </w:r>
+      <w:r>
+        <w:t xml:space="preserve"> </w:t>
+      </w:r>
+      <w:r>
+        <w:t xml:space="preserve">Esta pesquisa não recebeu financiamento.</w:t>
+      </w:r>
+    </w:p>
+    <w:bookmarkEnd w:id="64"/>
+    <w:bookmarkStart w:id="116" w:name="referências"/>
+    <w:p>
+      <w:pPr>
+        <w:pStyle w:val="Heading1"/>
+      </w:pPr>
+      <w:r>
         <w:t xml:space="preserve">Referências</w:t>
       </w:r>
     </w:p>
     <w:p>
       <w:pPr>
-        <w:pStyle w:val="FirstParagraph"/>
-      </w:pPr>
-      <w:r>
-        <w:rPr>
-          <w:b/>
-          <w:bCs/>
-        </w:rPr>
-        <w:t xml:space="preserve">Teoria econômica</w:t>
-      </w:r>
-    </w:p>
-    <w:p>
-      <w:pPr>
-        <w:pStyle w:val="BodyText"/>
-      </w:pPr>
-      <w:r>
-        <w:t xml:space="preserve">AKERLOF, G. A. The Market for</w:t>
-      </w:r>
-      <w:r>
-        <w:t xml:space="preserve"> </w:t>
-      </w:r>
-      <w:r>
-        <w:t xml:space="preserve">“Lemons”</w:t>
-      </w:r>
-      <w:r>
-        <w:t xml:space="preserve">: Quality Uncertainty and the Market Mechanism.</w:t>
-      </w:r>
-      <w:r>
-        <w:t xml:space="preserve"> </w:t>
-      </w:r>
-      <w:r>
-        <w:rPr>
-          <w:i/>
-          <w:iCs/>
+        <w:pStyle w:val="Referencia"/>
+      </w:pPr>
+      <w:r>
+        <w:t xml:space="preserve">AKERLOF, G. A. The market for</w:t>
+      </w:r>
+      <w:r>
+        <w:t xml:space="preserve"> </w:t>
+      </w:r>
+      <w:r>
+        <w:t xml:space="preserve">“lemons”</w:t>
+      </w:r>
+      <w:r>
+        <w:t xml:space="preserve">: quality uncertainty and the market mechanism.</w:t>
+      </w:r>
+      <w:r>
+        <w:t xml:space="preserve"> </w:t>
+      </w:r>
+      <w:r>
+        <w:rPr>
+          <w:b/>
+          <w:bCs/>
         </w:rPr>
         <w:t xml:space="preserve">The Quarterly Journal of Economics</w:t>
       </w:r>
       <w:r>
-        <w:t xml:space="preserve">, v. 84, n. 3, p. 488-500, 1970.</w:t>
-      </w:r>
-    </w:p>
-    <w:p>
-      <w:pPr>
-        <w:pStyle w:val="BodyText"/>
+        <w:t xml:space="preserve">, Cambridge, MA, v. 84, n. 3, p. 488-500, Aug. 1970. DOI:</w:t>
+      </w:r>
+      <w:r>
+        <w:t xml:space="preserve"> </w:t>
+      </w:r>
+      <w:hyperlink r:id="rId65">
+        <w:r>
+          <w:rPr>
+            <w:rStyle w:val="Hyperlink"/>
+          </w:rPr>
+          <w:t xml:space="preserve">https://doi.org/10.2307/1879431</w:t>
+        </w:r>
+      </w:hyperlink>
+      <w:r>
+        <w:t xml:space="preserve">.</w:t>
+      </w:r>
+    </w:p>
+    <w:p>
+      <w:pPr>
+        <w:pStyle w:val="Referencia"/>
+      </w:pPr>
+      <w:r>
+        <w:t xml:space="preserve">ALLYN, B. Apple agrees to pay $113 million to settle</w:t>
+      </w:r>
+      <w:r>
+        <w:t xml:space="preserve"> </w:t>
+      </w:r>
+      <w:r>
+        <w:t xml:space="preserve">‘batterygate’</w:t>
+      </w:r>
+      <w:r>
+        <w:t xml:space="preserve"> </w:t>
+      </w:r>
+      <w:r>
+        <w:t xml:space="preserve">case over iPhone slowdowns.</w:t>
+      </w:r>
+      <w:r>
+        <w:t xml:space="preserve"> </w:t>
+      </w:r>
+      <w:r>
+        <w:rPr>
+          <w:b/>
+          <w:bCs/>
+        </w:rPr>
+        <w:t xml:space="preserve">NPR</w:t>
+      </w:r>
+      <w:r>
+        <w:t xml:space="preserve">, Washington, DC, 18 Nov. 2020. Disponível em:</w:t>
+      </w:r>
+      <w:r>
+        <w:t xml:space="preserve"> </w:t>
+      </w:r>
+      <w:hyperlink r:id="rId66">
+        <w:r>
+          <w:rPr>
+            <w:rStyle w:val="Hyperlink"/>
+          </w:rPr>
+          <w:t xml:space="preserve">https://www.npr.org/2020/11/18/936268845/apple-agrees-to-pay-113-million-to-settle-batterygate-case-over-iphone-slowdowns</w:t>
+        </w:r>
+      </w:hyperlink>
+      <w:r>
+        <w:t xml:space="preserve">. Acesso em: 10 out. 2026.</w:t>
+      </w:r>
+    </w:p>
+    <w:p>
+      <w:pPr>
+        <w:pStyle w:val="Referencia"/>
+      </w:pPr>
+      <w:r>
+        <w:t xml:space="preserve">AMERICAN DIALECT SOCIETY.</w:t>
+      </w:r>
+      <w:r>
+        <w:t xml:space="preserve"> </w:t>
+      </w:r>
+      <w:r>
+        <w:rPr>
+          <w:b/>
+          <w:bCs/>
+        </w:rPr>
+        <w:t xml:space="preserve">2023 Word of the Year is</w:t>
+      </w:r>
+      <w:r>
+        <w:rPr>
+          <w:b/>
+          <w:bCs/>
+        </w:rPr>
+        <w:t xml:space="preserve"> </w:t>
+      </w:r>
+      <w:r>
+        <w:rPr>
+          <w:b/>
+          <w:bCs/>
+        </w:rPr>
+        <w:t xml:space="preserve">“enshittification”</w:t>
+      </w:r>
+      <w:r>
+        <w:t xml:space="preserve">. [S. l.]: ADS, 5 Jan. 2024. Disponível em:</w:t>
+      </w:r>
+      <w:r>
+        <w:t xml:space="preserve"> </w:t>
+      </w:r>
+      <w:hyperlink r:id="rId67">
+        <w:r>
+          <w:rPr>
+            <w:rStyle w:val="Hyperlink"/>
+          </w:rPr>
+          <w:t xml:space="preserve">https://americandialect.org/2023-word-of-the-year-is-enshittification/</w:t>
+        </w:r>
+      </w:hyperlink>
+      <w:r>
+        <w:t xml:space="preserve">. Acesso em: 10 out. 2026.</w:t>
+      </w:r>
+    </w:p>
+    <w:p>
+      <w:pPr>
+        <w:pStyle w:val="Referencia"/>
+      </w:pPr>
+      <w:r>
+        <w:t xml:space="preserve">ANTHROPIC.</w:t>
+      </w:r>
+      <w:r>
+        <w:t xml:space="preserve"> </w:t>
+      </w:r>
+      <w:r>
+        <w:rPr>
+          <w:b/>
+          <w:bCs/>
+        </w:rPr>
+        <w:t xml:space="preserve">A postmortem of three recent issues</w:t>
+      </w:r>
+      <w:r>
+        <w:t xml:space="preserve">. San Francisco: Anthropic, 17 Sept. 2025. Disponível em:</w:t>
+      </w:r>
+      <w:r>
+        <w:t xml:space="preserve"> </w:t>
+      </w:r>
+      <w:hyperlink r:id="rId68">
+        <w:r>
+          <w:rPr>
+            <w:rStyle w:val="Hyperlink"/>
+          </w:rPr>
+          <w:t xml:space="preserve">https://www.anthropic.com/engineering/a-postmortem-of-three-recent-issues</w:t>
+        </w:r>
+      </w:hyperlink>
+      <w:r>
+        <w:t xml:space="preserve">. Acesso em: 10 out. 2026.</w:t>
+      </w:r>
+    </w:p>
+    <w:p>
+      <w:pPr>
+        <w:pStyle w:val="Referencia"/>
+      </w:pPr>
+      <w:r>
+        <w:t xml:space="preserve">ANTHROPIC.</w:t>
+      </w:r>
+      <w:r>
+        <w:t xml:space="preserve"> </w:t>
+      </w:r>
+      <w:r>
+        <w:rPr>
+          <w:b/>
+          <w:bCs/>
+        </w:rPr>
+        <w:t xml:space="preserve">An update on recent Claude Code quality reports</w:t>
+      </w:r>
+      <w:r>
+        <w:t xml:space="preserve">. San Francisco: Anthropic, 23 Apr. 2026. Disponível em:</w:t>
+      </w:r>
+      <w:r>
+        <w:t xml:space="preserve"> </w:t>
+      </w:r>
+      <w:hyperlink r:id="rId69">
+        <w:r>
+          <w:rPr>
+            <w:rStyle w:val="Hyperlink"/>
+          </w:rPr>
+          <w:t xml:space="preserve">https://www.anthropic.com/engineering/april-23-postmortem</w:t>
+        </w:r>
+      </w:hyperlink>
+      <w:r>
+        <w:t xml:space="preserve">. Acesso em: 10 out. 2026.</w:t>
+      </w:r>
+    </w:p>
+    <w:p>
+      <w:pPr>
+        <w:pStyle w:val="Referencia"/>
+      </w:pPr>
+      <w:r>
+        <w:t xml:space="preserve">BARON, E. Apple agrees to pay $500M in iPhone-throttling settlement.</w:t>
+      </w:r>
+      <w:r>
+        <w:t xml:space="preserve"> </w:t>
+      </w:r>
+      <w:r>
+        <w:rPr>
+          <w:b/>
+          <w:bCs/>
+        </w:rPr>
+        <w:t xml:space="preserve">Government Technology</w:t>
+      </w:r>
+      <w:r>
+        <w:t xml:space="preserve">, [S. l.], 4 Mar. 2020. Publicado originalmente em The Cupertino Courier. Disponível em:</w:t>
+      </w:r>
+      <w:r>
+        <w:t xml:space="preserve"> </w:t>
+      </w:r>
+      <w:hyperlink r:id="rId70">
+        <w:r>
+          <w:rPr>
+            <w:rStyle w:val="Hyperlink"/>
+          </w:rPr>
+          <w:t xml:space="preserve">https://www.govtech.com/policy/Apple-Agrees-to-Pay-500M-in-iPhone-Throttling-Settlement.html</w:t>
+        </w:r>
+      </w:hyperlink>
+      <w:r>
+        <w:t xml:space="preserve">. Acesso em: 10 out. 2026.</w:t>
+      </w:r>
+    </w:p>
+    <w:p>
+      <w:pPr>
+        <w:pStyle w:val="Referencia"/>
+      </w:pPr>
+      <w:r>
+        <w:t xml:space="preserve">BRASIL. Lei nº 8.078, de 11 de setembro de 1990. Dispõe sobre a proteção do consumidor e dá outras providências.</w:t>
+      </w:r>
+      <w:r>
+        <w:t xml:space="preserve"> </w:t>
+      </w:r>
+      <w:r>
+        <w:rPr>
+          <w:b/>
+          <w:bCs/>
+        </w:rPr>
+        <w:t xml:space="preserve">Diário Oficial da União</w:t>
+      </w:r>
+      <w:r>
+        <w:t xml:space="preserve">: seção 1, Brasília, DF, 12 set. 1990. Disponível em:</w:t>
+      </w:r>
+      <w:r>
+        <w:t xml:space="preserve"> </w:t>
+      </w:r>
+      <w:hyperlink r:id="rId71">
+        <w:r>
+          <w:rPr>
+            <w:rStyle w:val="Hyperlink"/>
+          </w:rPr>
+          <w:t xml:space="preserve">https://www.planalto.gov.br/ccivil_03/leis/l8078compilado.htm</w:t>
+        </w:r>
+      </w:hyperlink>
+      <w:r>
+        <w:t xml:space="preserve">. Acesso em: 4 out. 2026.</w:t>
+      </w:r>
+    </w:p>
+    <w:p>
+      <w:pPr>
+        <w:pStyle w:val="Referencia"/>
+      </w:pPr>
+      <w:r>
+        <w:t xml:space="preserve">BRASIL. Superior Tribunal de Justiça (4. Turma).</w:t>
+      </w:r>
+      <w:r>
+        <w:t xml:space="preserve"> </w:t>
+      </w:r>
+      <w:r>
+        <w:rPr>
+          <w:b/>
+          <w:bCs/>
+        </w:rPr>
+        <w:t xml:space="preserve">Agravo Interno no Agravo em Recurso Especial 3.086.298/DF</w:t>
+      </w:r>
+      <w:r>
+        <w:t xml:space="preserve">. Inversão do ônus da prova. Art. 6º, VIII, do Código de Defesa do Consumidor. Não automaticidade. Relator: Min. Luís Carlos Gambogi (Desembargador convocado do TJMG), 8 jun. 2026. Disponível em:</w:t>
+      </w:r>
+      <w:r>
+        <w:t xml:space="preserve"> </w:t>
+      </w:r>
+      <w:hyperlink r:id="rId72">
+        <w:r>
+          <w:rPr>
+            <w:rStyle w:val="Hyperlink"/>
+          </w:rPr>
+          <w:t xml:space="preserve">https://scon.stj.jus.br/SCON/GetInteiroTeorDoAcordao?num_registro=202504180544&amp;dt_publicacao=12/06/2026</w:t>
+        </w:r>
+      </w:hyperlink>
+      <w:r>
+        <w:t xml:space="preserve">. Acesso em: 10 out. 2026.</w:t>
+      </w:r>
+    </w:p>
+    <w:p>
+      <w:pPr>
+        <w:pStyle w:val="Referencia"/>
       </w:pPr>
       <w:r>
         <w:t xml:space="preserve">BRIGNULL, H.</w:t>
@@ -2126,60 +2513,1138 @@
       </w:r>
       <w:r>
         <w:rPr>
-          <w:i/>
-          <w:iCs/>
-        </w:rPr>
-        <w:t xml:space="preserve">Deceptive Patterns: Exposing the Tricks Tech Companies Use to Control You</w:t>
-      </w:r>
-      <w:r>
-        <w:t xml:space="preserve">. 2023. (termo dark patterns cunhado em 2010)</w:t>
-      </w:r>
-    </w:p>
-    <w:p>
-      <w:pPr>
-        <w:pStyle w:val="BodyText"/>
-      </w:pPr>
-      <w:r>
-        <w:t xml:space="preserve">BULOW, J. An Economic Theory of Planned Obsolescence.</w:t>
-      </w:r>
-      <w:r>
-        <w:t xml:space="preserve"> </w:t>
-      </w:r>
-      <w:r>
-        <w:rPr>
-          <w:i/>
-          <w:iCs/>
+          <w:b/>
+          <w:bCs/>
+        </w:rPr>
+        <w:t xml:space="preserve">Deceptive patterns</w:t>
+      </w:r>
+      <w:r>
+        <w:t xml:space="preserve">: exposing the tricks tech companies use to control you. [S. l.]: Testimonium, 2023.</w:t>
+      </w:r>
+    </w:p>
+    <w:p>
+      <w:pPr>
+        <w:pStyle w:val="Referencia"/>
+      </w:pPr>
+      <w:r>
+        <w:t xml:space="preserve">BULOW, J. An economic theory of planned obsolescence.</w:t>
+      </w:r>
+      <w:r>
+        <w:t xml:space="preserve"> </w:t>
+      </w:r>
+      <w:r>
+        <w:rPr>
+          <w:b/>
+          <w:bCs/>
         </w:rPr>
         <w:t xml:space="preserve">The Quarterly Journal of Economics</w:t>
       </w:r>
       <w:r>
-        <w:t xml:space="preserve">, v. 101, n. 4, p. 729-749, 1986.</w:t>
-      </w:r>
-    </w:p>
-    <w:p>
-      <w:pPr>
-        <w:pStyle w:val="BodyText"/>
-      </w:pPr>
-      <w:r>
-        <w:t xml:space="preserve">GOODHART, C. A. E. Problems of Monetary Management: The U.K. Experience.</w:t>
-      </w:r>
-      <w:r>
-        <w:t xml:space="preserve"> </w:t>
-      </w:r>
-      <w:r>
-        <w:rPr>
-          <w:i/>
-          <w:iCs/>
-        </w:rPr>
-        <w:t xml:space="preserve">Papers in Monetary Economics</w:t>
-      </w:r>
-      <w:r>
-        <w:t xml:space="preserve">, Reserve Bank of Australia, 1975.</w:t>
-      </w:r>
-    </w:p>
-    <w:p>
-      <w:pPr>
-        <w:pStyle w:val="BodyText"/>
+        <w:t xml:space="preserve">, Cambridge, MA, v. 101, n. 4, p. 729-749, Nov. 1986. DOI:</w:t>
+      </w:r>
+      <w:r>
+        <w:t xml:space="preserve"> </w:t>
+      </w:r>
+      <w:hyperlink r:id="rId73">
+        <w:r>
+          <w:rPr>
+            <w:rStyle w:val="Hyperlink"/>
+          </w:rPr>
+          <w:t xml:space="preserve">https://doi.org/10.2307/1884176</w:t>
+        </w:r>
+      </w:hyperlink>
+      <w:r>
+        <w:t xml:space="preserve">.</w:t>
+      </w:r>
+    </w:p>
+    <w:p>
+      <w:pPr>
+        <w:pStyle w:val="Referencia"/>
+      </w:pPr>
+      <w:r>
+        <w:t xml:space="preserve">BUSINESS &amp; HUMAN RIGHTS RESOURCE CENTRE.</w:t>
+      </w:r>
+      <w:r>
+        <w:t xml:space="preserve"> </w:t>
+      </w:r>
+      <w:r>
+        <w:rPr>
+          <w:b/>
+          <w:bCs/>
+        </w:rPr>
+        <w:t xml:space="preserve">DuPont lawsuits (re PFOA pollution in USA)</w:t>
+      </w:r>
+      <w:r>
+        <w:t xml:space="preserve">. [S. l.]: BHRRC, [2020?]. Disponível em:</w:t>
+      </w:r>
+      <w:r>
+        <w:t xml:space="preserve"> </w:t>
+      </w:r>
+      <w:hyperlink r:id="rId74">
+        <w:r>
+          <w:rPr>
+            <w:rStyle w:val="Hyperlink"/>
+          </w:rPr>
+          <w:t xml:space="preserve">https://www.business-humanrights.org/en/latest-news/dupont-lawsuits-re-pfoa-pollution-in-usa/</w:t>
+        </w:r>
+      </w:hyperlink>
+      <w:r>
+        <w:t xml:space="preserve">. Acesso em: 10 out. 2026.</w:t>
+      </w:r>
+    </w:p>
+    <w:p>
+      <w:pPr>
+        <w:pStyle w:val="Referencia"/>
+      </w:pPr>
+      <w:r>
+        <w:t xml:space="preserve">C8 SCIENCE PANEL.</w:t>
+      </w:r>
+      <w:r>
+        <w:t xml:space="preserve"> </w:t>
+      </w:r>
+      <w:r>
+        <w:rPr>
+          <w:b/>
+          <w:bCs/>
+        </w:rPr>
+        <w:t xml:space="preserve">C8 Science Panel newsletter</w:t>
+      </w:r>
+      <w:r>
+        <w:t xml:space="preserve"> </w:t>
+      </w:r>
+      <w:r>
+        <w:t xml:space="preserve">[n. 8]. [S. l.]: C8 Science Panel, May 2012. Disponível em:</w:t>
+      </w:r>
+      <w:r>
+        <w:t xml:space="preserve"> </w:t>
+      </w:r>
+      <w:hyperlink r:id="rId75">
+        <w:r>
+          <w:rPr>
+            <w:rStyle w:val="Hyperlink"/>
+          </w:rPr>
+          <w:t xml:space="preserve">https://www.c8sciencepanel.org/newsletter8.html</w:t>
+        </w:r>
+      </w:hyperlink>
+      <w:r>
+        <w:t xml:space="preserve">. Acesso em: 10 out. 2026.</w:t>
+      </w:r>
+    </w:p>
+    <w:p>
+      <w:pPr>
+        <w:pStyle w:val="Referencia"/>
+      </w:pPr>
+      <w:r>
+        <w:t xml:space="preserve">CANIS, B. et al. </w:t>
+      </w:r>
+      <w:r>
+        <w:rPr>
+          <w:b/>
+          <w:bCs/>
+        </w:rPr>
+        <w:t xml:space="preserve">Volkswagen, defeat devices, and the Clean Air Act</w:t>
+      </w:r>
+      <w:r>
+        <w:t xml:space="preserve">: frequently asked questions. Washington, DC: Congressional Research Service, 1 Sept. 2016. (CRS Report, R44372). Disponível em:</w:t>
+      </w:r>
+      <w:r>
+        <w:t xml:space="preserve"> </w:t>
+      </w:r>
+      <w:hyperlink r:id="rId76">
+        <w:r>
+          <w:rPr>
+            <w:rStyle w:val="Hyperlink"/>
+          </w:rPr>
+          <w:t xml:space="preserve">https://www.everycrsreport.com/reports/R44372.html</w:t>
+        </w:r>
+      </w:hyperlink>
+      <w:r>
+        <w:t xml:space="preserve">. Acesso em: 10 out. 2026.</w:t>
+      </w:r>
+    </w:p>
+    <w:p>
+      <w:pPr>
+        <w:pStyle w:val="Referencia"/>
+      </w:pPr>
+      <w:r>
+        <w:t xml:space="preserve">CAROLINA DO NORTE (Estado). Department of Justice.</w:t>
+      </w:r>
+      <w:r>
+        <w:t xml:space="preserve"> </w:t>
+      </w:r>
+      <w:r>
+        <w:rPr>
+          <w:b/>
+          <w:bCs/>
+        </w:rPr>
+        <w:t xml:space="preserve">Attorney General Josh Stein announces $113 million settlement with Apple over iPhone throttling</w:t>
+      </w:r>
+      <w:r>
+        <w:t xml:space="preserve">. Raleigh, 18 Nov. 2020. Disponível em:</w:t>
+      </w:r>
+      <w:r>
+        <w:t xml:space="preserve"> </w:t>
+      </w:r>
+      <w:hyperlink r:id="rId77">
+        <w:r>
+          <w:rPr>
+            <w:rStyle w:val="Hyperlink"/>
+          </w:rPr>
+          <w:t xml:space="preserve">https://ncdoj.gov/attorney-general-josh-stein-announces-113-million-settlement-with-apple-over-iphone-throttling/</w:t>
+        </w:r>
+      </w:hyperlink>
+      <w:r>
+        <w:t xml:space="preserve">. Acesso em: 10 out. 2026.</w:t>
+      </w:r>
+    </w:p>
+    <w:p>
+      <w:pPr>
+        <w:pStyle w:val="Referencia"/>
+      </w:pPr>
+      <w:r>
+        <w:t xml:space="preserve">CHEN, L.; ZAHARIA, M.; ZOU, J.</w:t>
+      </w:r>
+      <w:r>
+        <w:t xml:space="preserve"> </w:t>
+      </w:r>
+      <w:r>
+        <w:rPr>
+          <w:b/>
+          <w:bCs/>
+        </w:rPr>
+        <w:t xml:space="preserve">How is ChatGPT’s behavior changing over time?</w:t>
+      </w:r>
+      <w:r>
+        <w:t xml:space="preserve"> </w:t>
+      </w:r>
+      <w:r>
+        <w:t xml:space="preserve">[S. l.]: arXiv, 2023. Preprint arXiv:2307.09009, v. 3. Dados disponíveis em:</w:t>
+      </w:r>
+      <w:r>
+        <w:t xml:space="preserve"> </w:t>
+      </w:r>
+      <w:hyperlink r:id="rId78">
+        <w:r>
+          <w:rPr>
+            <w:rStyle w:val="Hyperlink"/>
+          </w:rPr>
+          <w:t xml:space="preserve">https://github.com/lchen001/LLMDrift</w:t>
+        </w:r>
+      </w:hyperlink>
+      <w:r>
+        <w:t xml:space="preserve">. Disponível em:</w:t>
+      </w:r>
+      <w:r>
+        <w:t xml:space="preserve"> </w:t>
+      </w:r>
+      <w:hyperlink r:id="rId79">
+        <w:r>
+          <w:rPr>
+            <w:rStyle w:val="Hyperlink"/>
+          </w:rPr>
+          <w:t xml:space="preserve">https://arxiv.org/abs/2307.09009</w:t>
+        </w:r>
+      </w:hyperlink>
+      <w:r>
+        <w:t xml:space="preserve">. Acesso em: 10 out. 2026.</w:t>
+      </w:r>
+    </w:p>
+    <w:p>
+      <w:pPr>
+        <w:pStyle w:val="Referencia"/>
+      </w:pPr>
+      <w:r>
+        <w:t xml:space="preserve">CHEN, L. et al. </w:t>
+      </w:r>
+      <w:r>
+        <w:rPr>
+          <w:b/>
+          <w:bCs/>
+        </w:rPr>
+        <w:t xml:space="preserve">ODIN</w:t>
+      </w:r>
+      <w:r>
+        <w:t xml:space="preserve">: disentangled reward mitigates hacking in RLHF. [S. l.]: arXiv, 2024. Preprint arXiv:2402.07319. Disponível em:</w:t>
+      </w:r>
+      <w:r>
+        <w:t xml:space="preserve"> </w:t>
+      </w:r>
+      <w:hyperlink r:id="rId80">
+        <w:r>
+          <w:rPr>
+            <w:rStyle w:val="Hyperlink"/>
+          </w:rPr>
+          <w:t xml:space="preserve">https://arxiv.org/abs/2402.07319</w:t>
+        </w:r>
+      </w:hyperlink>
+      <w:r>
+        <w:t xml:space="preserve">. Acesso em: 10 out. 2026.</w:t>
+      </w:r>
+    </w:p>
+    <w:p>
+      <w:pPr>
+        <w:pStyle w:val="Referencia"/>
+      </w:pPr>
+      <w:r>
+        <w:t xml:space="preserve">COTCHETT, PITRE &amp; MCCARTHY.</w:t>
+      </w:r>
+      <w:r>
+        <w:t xml:space="preserve"> </w:t>
+      </w:r>
+      <w:r>
+        <w:rPr>
+          <w:b/>
+          <w:bCs/>
+        </w:rPr>
+        <w:t xml:space="preserve">CPM helps Apple iPhone consumers impacted by software throttling reach historic settlement</w:t>
+      </w:r>
+      <w:r>
+        <w:t xml:space="preserve">. [S. l.], 28 Feb. 2020. Disponível em:</w:t>
+      </w:r>
+      <w:r>
+        <w:t xml:space="preserve"> </w:t>
+      </w:r>
+      <w:hyperlink r:id="rId81">
+        <w:r>
+          <w:rPr>
+            <w:rStyle w:val="Hyperlink"/>
+          </w:rPr>
+          <w:t xml:space="preserve">https://www.cpmlegal.com/newsroom/news/Historic-Settlement-Reached-for-Apple-iPhone-Consumers-Impacted-by-Software-Throttling</w:t>
+        </w:r>
+      </w:hyperlink>
+      <w:r>
+        <w:t xml:space="preserve">. Acesso em: 10 out. 2026.</w:t>
+      </w:r>
+    </w:p>
+    <w:p>
+      <w:pPr>
+        <w:pStyle w:val="Referencia"/>
+      </w:pPr>
+      <w:r>
+        <w:t xml:space="preserve">DOCTOROW, C. Tiktok’s enshittification.</w:t>
+      </w:r>
+      <w:r>
+        <w:t xml:space="preserve"> </w:t>
+      </w:r>
+      <w:r>
+        <w:rPr>
+          <w:b/>
+          <w:bCs/>
+        </w:rPr>
+        <w:t xml:space="preserve">Pluralistic</w:t>
+      </w:r>
+      <w:r>
+        <w:t xml:space="preserve">, [S. l.], 21 Jan. 2023. Disponível em:</w:t>
+      </w:r>
+      <w:r>
+        <w:t xml:space="preserve"> </w:t>
+      </w:r>
+      <w:hyperlink r:id="rId82">
+        <w:r>
+          <w:rPr>
+            <w:rStyle w:val="Hyperlink"/>
+          </w:rPr>
+          <w:t xml:space="preserve">https://pluralistic.net/2023/01/21/potemkin-ai/</w:t>
+        </w:r>
+      </w:hyperlink>
+      <w:r>
+        <w:t xml:space="preserve">. Acesso em: 10 out. 2026.</w:t>
+      </w:r>
+    </w:p>
+    <w:p>
+      <w:pPr>
+        <w:pStyle w:val="Referencia"/>
+      </w:pPr>
+      <w:r>
+        <w:t xml:space="preserve">ESTADOS UNIDOS. Environmental Protection Agency.</w:t>
+      </w:r>
+      <w:r>
+        <w:t xml:space="preserve"> </w:t>
+      </w:r>
+      <w:r>
+        <w:rPr>
+          <w:b/>
+          <w:bCs/>
+        </w:rPr>
+        <w:t xml:space="preserve">EPA settles PFOA case against DuPont for largest environmental administrative penalty in agency history</w:t>
+      </w:r>
+      <w:r>
+        <w:t xml:space="preserve">. Washington, DC: EPA, 14 Dec. 2005. Disponível em:</w:t>
+      </w:r>
+      <w:r>
+        <w:t xml:space="preserve"> </w:t>
+      </w:r>
+      <w:hyperlink r:id="rId83">
+        <w:r>
+          <w:rPr>
+            <w:rStyle w:val="Hyperlink"/>
+          </w:rPr>
+          <w:t xml:space="preserve">https://www.epa.gov/archive/epapages/newsroom_archive/newsreleases/fdcb2f665cac66bb852570d7005d6665.html</w:t>
+        </w:r>
+      </w:hyperlink>
+      <w:r>
+        <w:t xml:space="preserve">. Acesso em: 10 out. 2026.</w:t>
+      </w:r>
+    </w:p>
+    <w:p>
+      <w:pPr>
+        <w:pStyle w:val="Referencia"/>
+      </w:pPr>
+      <w:r>
+        <w:t xml:space="preserve">ESTADOS UNIDOS. Environmental Protection Agency.</w:t>
+      </w:r>
+      <w:r>
+        <w:t xml:space="preserve"> </w:t>
+      </w:r>
+      <w:r>
+        <w:rPr>
+          <w:b/>
+          <w:bCs/>
+        </w:rPr>
+        <w:t xml:space="preserve">Notice of violation</w:t>
+      </w:r>
+      <w:r>
+        <w:t xml:space="preserve"> </w:t>
+      </w:r>
+      <w:r>
+        <w:t xml:space="preserve">[to] Volkswagen AG, Audi AG and Volkswagen Group of America, Inc. Washington, DC: EPA, 18 Sept. 2015. Disponível em:</w:t>
+      </w:r>
+      <w:r>
+        <w:t xml:space="preserve"> </w:t>
+      </w:r>
+      <w:hyperlink r:id="rId84">
+        <w:r>
+          <w:rPr>
+            <w:rStyle w:val="Hyperlink"/>
+          </w:rPr>
+          <w:t xml:space="preserve">https://www.epa.gov/sites/default/files/2015-10/documents/vw-nov-caa-09-18-15.pdf</w:t>
+        </w:r>
+      </w:hyperlink>
+      <w:r>
+        <w:t xml:space="preserve">. Acesso em: 10 out. 2026.</w:t>
+      </w:r>
+    </w:p>
+    <w:p>
+      <w:pPr>
+        <w:pStyle w:val="Referencia"/>
+      </w:pPr>
+      <w:r>
+        <w:t xml:space="preserve">FRANÇA. Loi nº 2015-992 du 17 août 2015 relative à la transition énergétique pour la croissance verte.</w:t>
+      </w:r>
+      <w:r>
+        <w:t xml:space="preserve"> </w:t>
+      </w:r>
+      <w:r>
+        <w:rPr>
+          <w:b/>
+          <w:bCs/>
+        </w:rPr>
+        <w:t xml:space="preserve">Journal officiel de la République française</w:t>
+      </w:r>
+      <w:r>
+        <w:t xml:space="preserve">, Paris, 18 août 2015. Disponível em:</w:t>
+      </w:r>
+      <w:r>
+        <w:t xml:space="preserve"> </w:t>
+      </w:r>
+      <w:hyperlink r:id="rId85">
+        <w:r>
+          <w:rPr>
+            <w:rStyle w:val="Hyperlink"/>
+          </w:rPr>
+          <w:t xml:space="preserve">https://www.legifrance.gouv.fr/jorf/id/JORFTEXT000031044385</w:t>
+        </w:r>
+      </w:hyperlink>
+      <w:r>
+        <w:t xml:space="preserve">. Acesso em: 10 out. 2026.</w:t>
+      </w:r>
+    </w:p>
+    <w:p>
+      <w:pPr>
+        <w:pStyle w:val="Referencia"/>
+      </w:pPr>
+      <w:r>
+        <w:t xml:space="preserve">FRANÇA. Loi nº 2021-1485 du 15 novembre 2021 visant à réduire l’empreinte environnementale du numérique en France.</w:t>
+      </w:r>
+      <w:r>
+        <w:t xml:space="preserve"> </w:t>
+      </w:r>
+      <w:r>
+        <w:rPr>
+          <w:b/>
+          <w:bCs/>
+        </w:rPr>
+        <w:t xml:space="preserve">Journal officiel de la République française</w:t>
+      </w:r>
+      <w:r>
+        <w:t xml:space="preserve">, Paris, n. 266, 16 nov. 2021. Disponível em:</w:t>
+      </w:r>
+      <w:r>
+        <w:t xml:space="preserve"> </w:t>
+      </w:r>
+      <w:hyperlink r:id="rId86">
+        <w:r>
+          <w:rPr>
+            <w:rStyle w:val="Hyperlink"/>
+          </w:rPr>
+          <w:t xml:space="preserve">https://www.legifrance.gouv.fr/jorf/id/JORFTEXT000044327272</w:t>
+        </w:r>
+      </w:hyperlink>
+      <w:r>
+        <w:t xml:space="preserve">. Acesso em: 10 out. 2026.</w:t>
+      </w:r>
+    </w:p>
+    <w:p>
+      <w:pPr>
+        <w:pStyle w:val="Referencia"/>
+      </w:pPr>
+      <w:r>
+        <w:t xml:space="preserve">FRANZEN, C. Mystery solved: Anthropic reveals changes to Claude’s harnesses and operating instructions likely caused degradation.</w:t>
+      </w:r>
+      <w:r>
+        <w:t xml:space="preserve"> </w:t>
+      </w:r>
+      <w:r>
+        <w:rPr>
+          <w:b/>
+          <w:bCs/>
+        </w:rPr>
+        <w:t xml:space="preserve">VentureBeat</w:t>
+      </w:r>
+      <w:r>
+        <w:t xml:space="preserve">, San Francisco, 23 Apr. 2026. Disponível em:</w:t>
+      </w:r>
+      <w:r>
+        <w:t xml:space="preserve"> </w:t>
+      </w:r>
+      <w:hyperlink r:id="rId87">
+        <w:r>
+          <w:rPr>
+            <w:rStyle w:val="Hyperlink"/>
+          </w:rPr>
+          <w:t xml:space="preserve">https://venturebeat.com/technology/mystery-solved-anthropic-reveals-changes-to-claudes-harnesses-and-operating-instructions-likely-caused-degradation</w:t>
+        </w:r>
+      </w:hyperlink>
+      <w:r>
+        <w:t xml:space="preserve">. Acesso em: 10 out. 2026.</w:t>
+      </w:r>
+    </w:p>
+    <w:p>
+      <w:pPr>
+        <w:pStyle w:val="Referencia"/>
+      </w:pPr>
+      <w:r>
+        <w:t xml:space="preserve">GAMA, J. et al. A survey on concept drift adaptation.</w:t>
+      </w:r>
+      <w:r>
+        <w:t xml:space="preserve"> </w:t>
+      </w:r>
+      <w:r>
+        <w:rPr>
+          <w:b/>
+          <w:bCs/>
+        </w:rPr>
+        <w:t xml:space="preserve">ACM Computing Surveys</w:t>
+      </w:r>
+      <w:r>
+        <w:t xml:space="preserve">, New York, v. 46, n. 4, p. 1-37, 2014. DOI:</w:t>
+      </w:r>
+      <w:r>
+        <w:t xml:space="preserve"> </w:t>
+      </w:r>
+      <w:hyperlink r:id="rId88">
+        <w:r>
+          <w:rPr>
+            <w:rStyle w:val="Hyperlink"/>
+          </w:rPr>
+          <w:t xml:space="preserve">https://doi.org/10.1145/2523813</w:t>
+        </w:r>
+      </w:hyperlink>
+      <w:r>
+        <w:t xml:space="preserve">.</w:t>
+      </w:r>
+    </w:p>
+    <w:p>
+      <w:pPr>
+        <w:pStyle w:val="Referencia"/>
+      </w:pPr>
+      <w:r>
+        <w:t xml:space="preserve">GOODHART, C. A. E. Problems of monetary management: the U.K. experience. In: RESERVE BANK OF AUSTRALIA.</w:t>
+      </w:r>
+      <w:r>
+        <w:t xml:space="preserve"> </w:t>
+      </w:r>
+      <w:r>
+        <w:rPr>
+          <w:b/>
+          <w:bCs/>
+        </w:rPr>
+        <w:t xml:space="preserve">Papers in monetary economics</w:t>
+      </w:r>
+      <w:r>
+        <w:t xml:space="preserve">. Sydney: RBA, 1975. v. 1, p. 1-20.</w:t>
+      </w:r>
+    </w:p>
+    <w:p>
+      <w:pPr>
+        <w:pStyle w:val="Referencia"/>
+      </w:pPr>
+      <w:r>
+        <w:t xml:space="preserve">HALTE À L’OBSOLESCENCE PROGRAMMÉE.</w:t>
+      </w:r>
+      <w:r>
+        <w:t xml:space="preserve"> </w:t>
+      </w:r>
+      <w:r>
+        <w:rPr>
+          <w:b/>
+          <w:bCs/>
+        </w:rPr>
+        <w:t xml:space="preserve">Epson poursuivi pour obsolescence programmée</w:t>
+      </w:r>
+      <w:r>
+        <w:t xml:space="preserve">: une première mondiale. Dossier de presse. [S. l.]: HOP, mai 2026a. Disponível em:</w:t>
+      </w:r>
+      <w:r>
+        <w:t xml:space="preserve"> </w:t>
+      </w:r>
+      <w:hyperlink r:id="rId89">
+        <w:r>
+          <w:rPr>
+            <w:rStyle w:val="Hyperlink"/>
+          </w:rPr>
+          <w:t xml:space="preserve">https://www.halteobsolescence.org/wp-content/uploads/2026/06/HOP-Epson.pdf</w:t>
+        </w:r>
+      </w:hyperlink>
+      <w:r>
+        <w:t xml:space="preserve">. Acesso em: 10 out. 2026.</w:t>
+      </w:r>
+    </w:p>
+    <w:p>
+      <w:pPr>
+        <w:pStyle w:val="Referencia"/>
+      </w:pPr>
+      <w:r>
+        <w:t xml:space="preserve">HALTE À L’OBSOLESCENCE PROGRAMMÉE.</w:t>
+      </w:r>
+      <w:r>
+        <w:t xml:space="preserve"> </w:t>
+      </w:r>
+      <w:r>
+        <w:rPr>
+          <w:b/>
+          <w:bCs/>
+        </w:rPr>
+        <w:t xml:space="preserve">Procès contre Epson</w:t>
+      </w:r>
+      <w:r>
+        <w:t xml:space="preserve">: prochain rendez-vous le 25 février 2027. [S. l.]: HOP, 6 juil. 2026b. Disponível em:</w:t>
+      </w:r>
+      <w:r>
+        <w:t xml:space="preserve"> </w:t>
+      </w:r>
+      <w:hyperlink r:id="rId90">
+        <w:r>
+          <w:rPr>
+            <w:rStyle w:val="Hyperlink"/>
+          </w:rPr>
+          <w:t xml:space="preserve">https://www.halteobsolescence.org/suite-proces-epson-imprimante/</w:t>
+        </w:r>
+      </w:hyperlink>
+      <w:r>
+        <w:t xml:space="preserve">. Acesso em: 10 out. 2026.</w:t>
+      </w:r>
+    </w:p>
+    <w:p>
+      <w:pPr>
+        <w:pStyle w:val="Referencia"/>
+      </w:pPr>
+      <w:r>
+        <w:t xml:space="preserve">INTERNATIONAL COUNCIL ON CLEAN TRANSPORTATION.</w:t>
+      </w:r>
+      <w:r>
+        <w:t xml:space="preserve"> </w:t>
+      </w:r>
+      <w:r>
+        <w:rPr>
+          <w:b/>
+          <w:bCs/>
+        </w:rPr>
+        <w:t xml:space="preserve">Dieselgate</w:t>
+      </w:r>
+      <w:r>
+        <w:t xml:space="preserve">: behind the scandal. Washington, DC: ICCT, 2025. Disponível em:</w:t>
+      </w:r>
+      <w:r>
+        <w:t xml:space="preserve"> </w:t>
+      </w:r>
+      <w:hyperlink r:id="rId91">
+        <w:r>
+          <w:rPr>
+            <w:rStyle w:val="Hyperlink"/>
+          </w:rPr>
+          <w:t xml:space="preserve">https://theicct.org/dieselgate-emissions-scandal/</w:t>
+        </w:r>
+      </w:hyperlink>
+      <w:r>
+        <w:t xml:space="preserve">. Acesso em: 10 out. 2026.</w:t>
+      </w:r>
+    </w:p>
+    <w:p>
+      <w:pPr>
+        <w:pStyle w:val="Referencia"/>
+      </w:pPr>
+      <w:r>
+        <w:t xml:space="preserve">KRAJEWSKI, M. The great lightbulb conspiracy.</w:t>
+      </w:r>
+      <w:r>
+        <w:t xml:space="preserve"> </w:t>
+      </w:r>
+      <w:r>
+        <w:rPr>
+          <w:b/>
+          <w:bCs/>
+        </w:rPr>
+        <w:t xml:space="preserve">IEEE Spectrum</w:t>
+      </w:r>
+      <w:r>
+        <w:t xml:space="preserve">, New York, 24 Sept. 2014. Disponível em:</w:t>
+      </w:r>
+      <w:r>
+        <w:t xml:space="preserve"> </w:t>
+      </w:r>
+      <w:hyperlink r:id="rId92">
+        <w:r>
+          <w:rPr>
+            <w:rStyle w:val="Hyperlink"/>
+          </w:rPr>
+          <w:t xml:space="preserve">https://spectrum.ieee.org/the-great-lightbulb-conspiracy</w:t>
+        </w:r>
+      </w:hyperlink>
+      <w:r>
+        <w:t xml:space="preserve">. Acesso em: 10 out. 2026.</w:t>
+      </w:r>
+    </w:p>
+    <w:p>
+      <w:pPr>
+        <w:pStyle w:val="Referencia"/>
+      </w:pPr>
+      <w:r>
+        <w:t xml:space="preserve">KURTIC, E. et al. </w:t>
+      </w:r>
+      <w:r>
+        <w:rPr>
+          <w:b/>
+          <w:bCs/>
+        </w:rPr>
+        <w:t xml:space="preserve">“Give me BF16 or give me death”</w:t>
+      </w:r>
+      <w:r>
+        <w:rPr>
+          <w:b/>
+          <w:bCs/>
+        </w:rPr>
+        <w:t xml:space="preserve">?</w:t>
+      </w:r>
+      <w:r>
+        <w:t xml:space="preserve"> </w:t>
+      </w:r>
+      <w:r>
+        <w:t xml:space="preserve">Accuracy-performance trade-offs in LLM quantization. [S. l.]: arXiv, 2024. Preprint arXiv:2411.02355. Aceito no ACL 2025. Disponível em:</w:t>
+      </w:r>
+      <w:r>
+        <w:t xml:space="preserve"> </w:t>
+      </w:r>
+      <w:hyperlink r:id="rId93">
+        <w:r>
+          <w:rPr>
+            <w:rStyle w:val="Hyperlink"/>
+          </w:rPr>
+          <w:t xml:space="preserve">https://arxiv.org/abs/2411.02355</w:t>
+        </w:r>
+      </w:hyperlink>
+      <w:r>
+        <w:t xml:space="preserve">. Acesso em: 10 out. 2026.</w:t>
+      </w:r>
+    </w:p>
+    <w:p>
+      <w:pPr>
+        <w:pStyle w:val="Referencia"/>
+      </w:pPr>
+      <w:r>
+        <w:t xml:space="preserve">LEC’HVIEN, A. France: une première enquête pour</w:t>
+      </w:r>
+      <w:r>
+        <w:t xml:space="preserve"> </w:t>
+      </w:r>
+      <w:r>
+        <w:t xml:space="preserve">“obsolescence programmée”</w:t>
+      </w:r>
+      <w:r>
+        <w:t xml:space="preserve">.</w:t>
+      </w:r>
+      <w:r>
+        <w:t xml:space="preserve"> </w:t>
+      </w:r>
+      <w:r>
+        <w:rPr>
+          <w:b/>
+          <w:bCs/>
+        </w:rPr>
+        <w:t xml:space="preserve">La Presse</w:t>
+      </w:r>
+      <w:r>
+        <w:t xml:space="preserve">, Montréal, 28 déc. 2017. Dépêche AFP. Disponível em:</w:t>
+      </w:r>
+      <w:r>
+        <w:t xml:space="preserve"> </w:t>
+      </w:r>
+      <w:hyperlink r:id="rId94">
+        <w:r>
+          <w:rPr>
+            <w:rStyle w:val="Hyperlink"/>
+          </w:rPr>
+          <w:t xml:space="preserve">https://www.lapresse.ca/affaires/economie/technologie/201712/28/01-5148467-france-une-premiere-enquete-pour-obsolescence-programmee.php</w:t>
+        </w:r>
+      </w:hyperlink>
+      <w:r>
+        <w:t xml:space="preserve">. Acesso em: 10 out. 2026.</w:t>
+      </w:r>
+    </w:p>
+    <w:p>
+      <w:pPr>
+        <w:pStyle w:val="Referencia"/>
+      </w:pPr>
+      <w:r>
+        <w:t xml:space="preserve">LI, Z. et al. </w:t>
+      </w:r>
+      <w:r>
+        <w:rPr>
+          <w:b/>
+          <w:bCs/>
+        </w:rPr>
+        <w:t xml:space="preserve">Quantization meets reasoning</w:t>
+      </w:r>
+      <w:r>
+        <w:t xml:space="preserve">: exploring LLM low-bit quantization degradation for mathematical reasoning. [S. l.]: arXiv, 2025. Preprint arXiv:2501.03035. Disponível em:</w:t>
+      </w:r>
+      <w:r>
+        <w:t xml:space="preserve"> </w:t>
+      </w:r>
+      <w:hyperlink r:id="rId95">
+        <w:r>
+          <w:rPr>
+            <w:rStyle w:val="Hyperlink"/>
+          </w:rPr>
+          <w:t xml:space="preserve">https://arxiv.org/abs/2501.03035</w:t>
+        </w:r>
+      </w:hyperlink>
+      <w:r>
+        <w:t xml:space="preserve">. Acesso em: 10 out. 2026.</w:t>
+      </w:r>
+    </w:p>
+    <w:p>
+      <w:pPr>
+        <w:pStyle w:val="Referencia"/>
+      </w:pPr>
+      <w:r>
+        <w:t xml:space="preserve">MACQUARIE DICTIONARY.</w:t>
+      </w:r>
+      <w:r>
+        <w:t xml:space="preserve"> </w:t>
+      </w:r>
+      <w:r>
+        <w:rPr>
+          <w:b/>
+          <w:bCs/>
+        </w:rPr>
+        <w:t xml:space="preserve">Word of the Year 2024</w:t>
+      </w:r>
+      <w:r>
+        <w:t xml:space="preserve">. [S. l.]: Macquarie Dictionary, 2024. Disponível em:</w:t>
+      </w:r>
+      <w:r>
+        <w:t xml:space="preserve"> </w:t>
+      </w:r>
+      <w:hyperlink r:id="rId96">
+        <w:r>
+          <w:rPr>
+            <w:rStyle w:val="Hyperlink"/>
+          </w:rPr>
+          <w:t xml:space="preserve">https://www.macquariedictionary.com.au/word-of-the-year/word-of-the-year-2024/</w:t>
+        </w:r>
+      </w:hyperlink>
+      <w:r>
+        <w:t xml:space="preserve">. Acesso em: 10 out. 2026.</w:t>
+      </w:r>
+    </w:p>
+    <w:p>
+      <w:pPr>
+        <w:pStyle w:val="Referencia"/>
+      </w:pPr>
+      <w:r>
+        <w:t xml:space="preserve">MOONSHOT AI.</w:t>
+      </w:r>
+      <w:r>
+        <w:t xml:space="preserve"> </w:t>
+      </w:r>
+      <w:r>
+        <w:rPr>
+          <w:b/>
+          <w:bCs/>
+        </w:rPr>
+        <w:t xml:space="preserve">K2 Vendor Verifier</w:t>
+      </w:r>
+      <w:r>
+        <w:t xml:space="preserve">. [S. l.]: GitHub, 2025. Disponível em:</w:t>
+      </w:r>
+      <w:r>
+        <w:t xml:space="preserve"> </w:t>
+      </w:r>
+      <w:hyperlink r:id="rId97">
+        <w:r>
+          <w:rPr>
+            <w:rStyle w:val="Hyperlink"/>
+          </w:rPr>
+          <w:t xml:space="preserve">https://github.com/MoonshotAI/K2-Vendor-Verifier</w:t>
+        </w:r>
+      </w:hyperlink>
+      <w:r>
+        <w:t xml:space="preserve">. Acesso em: 10 out. 2026.</w:t>
+      </w:r>
+    </w:p>
+    <w:p>
+      <w:pPr>
+        <w:pStyle w:val="Referencia"/>
+      </w:pPr>
+      <w:r>
+        <w:t xml:space="preserve">MUPPIDI, S. Anthropic lowers gross margin projection as revenue skyrockets.</w:t>
+      </w:r>
+      <w:r>
+        <w:t xml:space="preserve"> </w:t>
+      </w:r>
+      <w:r>
+        <w:rPr>
+          <w:b/>
+          <w:bCs/>
+        </w:rPr>
+        <w:t xml:space="preserve">The Information</w:t>
+      </w:r>
+      <w:r>
+        <w:t xml:space="preserve">, San Francisco, Jan. 2026a. Disponível em:</w:t>
+      </w:r>
+      <w:r>
+        <w:t xml:space="preserve"> </w:t>
+      </w:r>
+      <w:hyperlink r:id="rId98">
+        <w:r>
+          <w:rPr>
+            <w:rStyle w:val="Hyperlink"/>
+          </w:rPr>
+          <w:t xml:space="preserve">https://www.theinformation.com/articles/anthropic-lowers-profit-margin-projection-revenue-skyrockets</w:t>
+        </w:r>
+      </w:hyperlink>
+      <w:r>
+        <w:t xml:space="preserve">. Acesso em: 10 out. 2026.</w:t>
+      </w:r>
+    </w:p>
+    <w:p>
+      <w:pPr>
+        <w:pStyle w:val="Referencia"/>
+      </w:pPr>
+      <w:r>
+        <w:t xml:space="preserve">MUPPIDI, S. Why OpenAI, Anthropic missed their own gross margin forecasts.</w:t>
+      </w:r>
+      <w:r>
+        <w:t xml:space="preserve"> </w:t>
+      </w:r>
+      <w:r>
+        <w:rPr>
+          <w:b/>
+          <w:bCs/>
+        </w:rPr>
+        <w:t xml:space="preserve">The Information</w:t>
+      </w:r>
+      <w:r>
+        <w:t xml:space="preserve">, San Francisco, Feb. 2026b. Newsletter The Dealmaker. Disponível em:</w:t>
+      </w:r>
+      <w:r>
+        <w:t xml:space="preserve"> </w:t>
+      </w:r>
+      <w:hyperlink r:id="rId99">
+        <w:r>
+          <w:rPr>
+            <w:rStyle w:val="Hyperlink"/>
+          </w:rPr>
+          <w:t xml:space="preserve">https://www.theinformation.com/newsletters/dealmaker/openai-anthropic-missed-gross-margin-forecasts</w:t>
+        </w:r>
+      </w:hyperlink>
+      <w:r>
+        <w:t xml:space="preserve">. Acesso em: 10 out. 2026.</w:t>
+      </w:r>
+    </w:p>
+    <w:p>
+      <w:pPr>
+        <w:pStyle w:val="Referencia"/>
+      </w:pPr>
+      <w:r>
+        <w:t xml:space="preserve">NARAYANAN, A.; KAPOOR, S. Is GPT-4 getting worse over time?</w:t>
+      </w:r>
+      <w:r>
+        <w:t xml:space="preserve"> </w:t>
+      </w:r>
+      <w:r>
+        <w:rPr>
+          <w:b/>
+          <w:bCs/>
+        </w:rPr>
+        <w:t xml:space="preserve">AI Snake Oil</w:t>
+      </w:r>
+      <w:r>
+        <w:t xml:space="preserve">, [S. l.], 19 July 2023. Disponível em:</w:t>
+      </w:r>
+      <w:r>
+        <w:t xml:space="preserve"> </w:t>
+      </w:r>
+      <w:hyperlink r:id="rId100">
+        <w:r>
+          <w:rPr>
+            <w:rStyle w:val="Hyperlink"/>
+          </w:rPr>
+          <w:t xml:space="preserve">https://www.aisnakeoil.com/p/is-gpt-4-getting-worse-over-time</w:t>
+        </w:r>
+      </w:hyperlink>
+      <w:r>
+        <w:t xml:space="preserve">. Acesso em: 10 out. 2026.</w:t>
+      </w:r>
+    </w:p>
+    <w:p>
+      <w:pPr>
+        <w:pStyle w:val="Referencia"/>
+      </w:pPr>
+      <w:r>
+        <w:t xml:space="preserve">OPENAI.</w:t>
+      </w:r>
+      <w:r>
+        <w:t xml:space="preserve"> </w:t>
+      </w:r>
+      <w:r>
+        <w:rPr>
+          <w:b/>
+          <w:bCs/>
+        </w:rPr>
+        <w:t xml:space="preserve">New embedding models and API updates</w:t>
+      </w:r>
+      <w:r>
+        <w:t xml:space="preserve">. San Francisco: OpenAI, 25 Jan. 2024. Disponível em:</w:t>
+      </w:r>
+      <w:r>
+        <w:t xml:space="preserve"> </w:t>
+      </w:r>
+      <w:hyperlink r:id="rId101">
+        <w:r>
+          <w:rPr>
+            <w:rStyle w:val="Hyperlink"/>
+          </w:rPr>
+          <w:t xml:space="preserve">https://openai.com/index/new-embedding-models-and-api-updates/</w:t>
+        </w:r>
+      </w:hyperlink>
+      <w:r>
+        <w:t xml:space="preserve">. Acesso em: 10 out. 2026.</w:t>
+      </w:r>
+    </w:p>
+    <w:p>
+      <w:pPr>
+        <w:pStyle w:val="Referencia"/>
+      </w:pPr>
+      <w:r>
+        <w:t xml:space="preserve">PARK, R. et al. Disentangling length from quality in direct preference optimization. In: FINDINGS OF THE ASSOCIATION FOR COMPUTATIONAL LINGUISTICS: ACL 2024. Bangkok: Association for Computational Linguistics, 2024. Preprint arXiv:2403.19159. Disponível em:</w:t>
+      </w:r>
+      <w:r>
+        <w:t xml:space="preserve"> </w:t>
+      </w:r>
+      <w:hyperlink r:id="rId102">
+        <w:r>
+          <w:rPr>
+            <w:rStyle w:val="Hyperlink"/>
+          </w:rPr>
+          <w:t xml:space="preserve">https://arxiv.org/abs/2403.19159</w:t>
+        </w:r>
+      </w:hyperlink>
+      <w:r>
+        <w:t xml:space="preserve">. Acesso em: 10 out. 2026.</w:t>
+      </w:r>
+    </w:p>
+    <w:p>
+      <w:pPr>
+        <w:pStyle w:val="Referencia"/>
+      </w:pPr>
+      <w:r>
+        <w:t xml:space="preserve">POOLE, J. iPhone performance and battery age.</w:t>
+      </w:r>
+      <w:r>
+        <w:t xml:space="preserve"> </w:t>
+      </w:r>
+      <w:r>
+        <w:rPr>
+          <w:b/>
+          <w:bCs/>
+        </w:rPr>
+        <w:t xml:space="preserve">Geekbench Blog</w:t>
+      </w:r>
+      <w:r>
+        <w:t xml:space="preserve">, [S. l.], 18 Dec. 2017. Disponível em:</w:t>
+      </w:r>
+      <w:r>
+        <w:t xml:space="preserve"> </w:t>
+      </w:r>
+      <w:hyperlink r:id="rId103">
+        <w:r>
+          <w:rPr>
+            <w:rStyle w:val="Hyperlink"/>
+          </w:rPr>
+          <w:t xml:space="preserve">https://www.geekbench.com/blog/2017/12/iphone-performance-and-battery-age/</w:t>
+        </w:r>
+      </w:hyperlink>
+      <w:r>
+        <w:t xml:space="preserve">. Acesso em: 10 out. 2026.</w:t>
+      </w:r>
+    </w:p>
+    <w:p>
+      <w:pPr>
+        <w:pStyle w:val="Referencia"/>
+      </w:pPr>
+      <w:r>
+        <w:t xml:space="preserve">SHARMA, M. et al. </w:t>
+      </w:r>
+      <w:r>
+        <w:rPr>
+          <w:b/>
+          <w:bCs/>
+        </w:rPr>
+        <w:t xml:space="preserve">Towards understanding sycophancy in language models</w:t>
+      </w:r>
+      <w:r>
+        <w:t xml:space="preserve">. [S. l.]: arXiv, 2023. Preprint arXiv:2310.13548, v. 4. Disponível em:</w:t>
+      </w:r>
+      <w:r>
+        <w:t xml:space="preserve"> </w:t>
+      </w:r>
+      <w:hyperlink r:id="rId104">
+        <w:r>
+          <w:rPr>
+            <w:rStyle w:val="Hyperlink"/>
+          </w:rPr>
+          <w:t xml:space="preserve">https://arxiv.org/abs/2310.13548</w:t>
+        </w:r>
+      </w:hyperlink>
+      <w:r>
+        <w:t xml:space="preserve">. Acesso em: 10 out. 2026.</w:t>
+      </w:r>
+    </w:p>
+    <w:p>
+      <w:pPr>
+        <w:pStyle w:val="Referencia"/>
       </w:pPr>
       <w:r>
         <w:t xml:space="preserve">SIEBERT, H.</w:t>
@@ -2189,399 +3654,408 @@
       </w:r>
       <w:r>
         <w:rPr>
-          <w:i/>
-          <w:iCs/>
-        </w:rPr>
-        <w:t xml:space="preserve">Der Kobra-Effekt: Wie man Irrwege der Wirtschaftspolitik vermeidet</w:t>
-      </w:r>
-      <w:r>
-        <w:t xml:space="preserve">. Stuttgart: DVA, 2001.</w:t>
-      </w:r>
-    </w:p>
-    <w:p>
-      <w:pPr>
-        <w:pStyle w:val="BodyText"/>
-      </w:pPr>
-      <w:r>
-        <w:rPr>
-          <w:b/>
-          <w:bCs/>
-        </w:rPr>
-        <w:t xml:space="preserve">Enshittification</w:t>
-      </w:r>
-    </w:p>
-    <w:p>
-      <w:pPr>
-        <w:pStyle w:val="BodyText"/>
-      </w:pPr>
-      <w:r>
-        <w:t xml:space="preserve">AMERICAN DIALECT SOCIETY. 2023 Word of the Year is</w:t>
-      </w:r>
-      <w:r>
-        <w:t xml:space="preserve"> </w:t>
-      </w:r>
-      <w:r>
-        <w:t xml:space="preserve">“enshittification”</w:t>
-      </w:r>
-      <w:r>
-        <w:t xml:space="preserve">. 5 jan. 2024. americandialect.org/2023-word-of-the-year-is-enshittification</w:t>
-      </w:r>
-    </w:p>
-    <w:p>
-      <w:pPr>
-        <w:pStyle w:val="BodyText"/>
-      </w:pPr>
-      <w:r>
-        <w:t xml:space="preserve">DOCTOROW, C. Tiktok’s enshittification.</w:t>
-      </w:r>
-      <w:r>
-        <w:t xml:space="preserve"> </w:t>
-      </w:r>
-      <w:r>
-        <w:rPr>
-          <w:i/>
-          <w:iCs/>
-        </w:rPr>
-        <w:t xml:space="preserve">Pluralistic</w:t>
-      </w:r>
-      <w:r>
-        <w:t xml:space="preserve">, 21 jan. 2023. (primeira formalização em blog de novembro de 2022)</w:t>
-      </w:r>
-    </w:p>
-    <w:p>
-      <w:pPr>
-        <w:pStyle w:val="BodyText"/>
-      </w:pPr>
-      <w:r>
-        <w:t xml:space="preserve">MACQUARIE DICTIONARY. Word of the Year 2024: enshittification. 26 nov. 2024.</w:t>
-      </w:r>
-    </w:p>
-    <w:p>
-      <w:pPr>
-        <w:pStyle w:val="BodyText"/>
-      </w:pPr>
-      <w:r>
-        <w:rPr>
-          <w:b/>
-          <w:bCs/>
-        </w:rPr>
-        <w:t xml:space="preserve">Precedentes históricos</w:t>
-      </w:r>
-    </w:p>
-    <w:p>
-      <w:pPr>
-        <w:pStyle w:val="BodyText"/>
-      </w:pPr>
-      <w:r>
-        <w:t xml:space="preserve">KRAJEWSKI, M. The Great Lightbulb Conspiracy.</w:t>
-      </w:r>
-      <w:r>
-        <w:t xml:space="preserve"> </w:t>
-      </w:r>
-      <w:r>
-        <w:rPr>
-          <w:i/>
-          <w:iCs/>
-        </w:rPr>
-        <w:t xml:space="preserve">IEEE Spectrum</w:t>
-      </w:r>
-      <w:r>
-        <w:t xml:space="preserve">, set. 2014. (Cartel Phoebus; correspondência interna de 1927)</w:t>
-      </w:r>
-    </w:p>
-    <w:p>
-      <w:pPr>
-        <w:pStyle w:val="BodyText"/>
-      </w:pPr>
-      <w:r>
-        <w:t xml:space="preserve">NPR. Apple Agrees To Pay $113 Million To Settle</w:t>
-      </w:r>
-      <w:r>
-        <w:t xml:space="preserve"> </w:t>
-      </w:r>
-      <w:r>
-        <w:t xml:space="preserve">‘Batterygate’</w:t>
-      </w:r>
-      <w:r>
-        <w:t xml:space="preserve"> </w:t>
-      </w:r>
-      <w:r>
-        <w:t xml:space="preserve">Case Over iPhone Slowdowns. 18 nov. 2020. npr.org/2020/11/18/936268845</w:t>
-      </w:r>
-    </w:p>
-    <w:p>
-      <w:pPr>
-        <w:pStyle w:val="BodyText"/>
-      </w:pPr>
-      <w:r>
-        <w:t xml:space="preserve">ICCT. Dieselgate: behind the scandal. theicct.org/dieselgate-emissions-scandal</w:t>
-      </w:r>
-    </w:p>
-    <w:p>
-      <w:pPr>
-        <w:pStyle w:val="BodyText"/>
-      </w:pPr>
-      <w:r>
-        <w:t xml:space="preserve">U.S. CONGRESSIONAL RESEARCH SERVICE. Volkswagen, Defeat Devices, and the Clean Air Act: Frequently Asked Questions. R44372, 2016.</w:t>
-      </w:r>
-    </w:p>
-    <w:p>
-      <w:pPr>
-        <w:pStyle w:val="BodyText"/>
-      </w:pPr>
-      <w:r>
-        <w:t xml:space="preserve">U.S. EPA. Notice of Violation, Clean Air Act, Volkswagen. 18 set. 2015.</w:t>
-      </w:r>
-    </w:p>
-    <w:p>
-      <w:pPr>
-        <w:pStyle w:val="BodyText"/>
-      </w:pPr>
-      <w:r>
-        <w:t xml:space="preserve">HOP - HALTE À L’OBSOLESCENCE PROGRAMMÉE. Procès contre Epson: prochain rendez-vous le 25 février 2027. jul. 2026. halteobsolescence.org/suite-proces-epson-imprimante</w:t>
-      </w:r>
-    </w:p>
-    <w:p>
-      <w:pPr>
-        <w:pStyle w:val="BodyText"/>
-      </w:pPr>
-      <w:r>
-        <w:t xml:space="preserve">FRANÇA. Code de la consommation, art. L.441-2 (delito de obsolescência programada, introduzido pela Lei de 17 de agosto de 2015 relativa à transição energética).</w:t>
-      </w:r>
-    </w:p>
-    <w:p>
-      <w:pPr>
-        <w:pStyle w:val="BodyText"/>
-      </w:pPr>
-      <w:r>
-        <w:t xml:space="preserve">BUSINESS &amp; HUMAN RIGHTS RESOURCE CENTRE. DuPont lawsuits re PFOA pollution in USA. business-humanrights.org</w:t>
-      </w:r>
-    </w:p>
-    <w:p>
-      <w:pPr>
-        <w:pStyle w:val="BodyText"/>
-      </w:pPr>
-      <w:r>
-        <w:rPr>
-          <w:b/>
-          <w:bCs/>
-        </w:rPr>
-        <w:t xml:space="preserve">Mecanismos técnicos e auditoria</w:t>
-      </w:r>
-    </w:p>
-    <w:p>
-      <w:pPr>
-        <w:pStyle w:val="BodyText"/>
-      </w:pPr>
-      <w:r>
-        <w:t xml:space="preserve">CHEN, L.; ZAHARIA, M.; ZOU, J. How Is ChatGPT’s Behavior Changing over Time? arXiv:2307.09009, 2023. Dados: github.com/lchen001/LLMDrift</w:t>
-      </w:r>
-    </w:p>
-    <w:p>
-      <w:pPr>
-        <w:pStyle w:val="BodyText"/>
-      </w:pPr>
-      <w:r>
-        <w:t xml:space="preserve">CHEN, L. et al. ODIN: Disentangled Reward Mitigates Hacking in RLHF. arXiv:2402.07319, 2024.</w:t>
-      </w:r>
-    </w:p>
-    <w:p>
-      <w:pPr>
-        <w:pStyle w:val="BodyText"/>
-      </w:pPr>
-      <w:r>
-        <w:t xml:space="preserve">NARAYANAN, A.; KAPOOR, S. Is GPT-4 getting worse over time?</w:t>
-      </w:r>
-      <w:r>
-        <w:t xml:space="preserve"> </w:t>
-      </w:r>
-      <w:r>
-        <w:rPr>
-          <w:i/>
-          <w:iCs/>
-        </w:rPr>
-        <w:t xml:space="preserve">AI Snake Oil</w:t>
-      </w:r>
-      <w:r>
-        <w:t xml:space="preserve">, jul. 2023.</w:t>
-      </w:r>
-    </w:p>
-    <w:p>
-      <w:pPr>
-        <w:pStyle w:val="BodyText"/>
-      </w:pPr>
-      <w:r>
-        <w:t xml:space="preserve">LI, Z. et al. Quantization Meets Reasoning: Exploring LLM Low-Bit Quantization Degradation for Mathematical Reasoning. arXiv:2501.03035, 2025.</w:t>
-      </w:r>
-    </w:p>
-    <w:p>
-      <w:pPr>
-        <w:pStyle w:val="BodyText"/>
-      </w:pPr>
-      <w:r>
-        <w:t xml:space="preserve">MOONSHOT AI. K2 Vendor Verifier. github.com/MoonshotAI/K2-Vendor-Verifier, 2025.</w:t>
-      </w:r>
-    </w:p>
-    <w:p>
-      <w:pPr>
-        <w:pStyle w:val="BodyText"/>
-      </w:pPr>
-      <w:r>
-        <w:t xml:space="preserve">PARK, R. et al. Disentangling Length from Quality in Direct Preference Optimization.</w:t>
-      </w:r>
-      <w:r>
-        <w:t xml:space="preserve"> </w:t>
-      </w:r>
-      <w:r>
-        <w:rPr>
-          <w:i/>
-          <w:iCs/>
-        </w:rPr>
-        <w:t xml:space="preserve">Findings of ACL 2024</w:t>
-      </w:r>
-      <w:r>
-        <w:t xml:space="preserve">. arXiv:2403.19159.</w:t>
-      </w:r>
-    </w:p>
-    <w:p>
-      <w:pPr>
-        <w:pStyle w:val="BodyText"/>
-      </w:pPr>
-      <w:r>
-        <w:t xml:space="preserve">SHARMA, M. et al. Towards Understanding Sycophancy in Language Models. arXiv:2310.13548, 2023.</w:t>
-      </w:r>
-    </w:p>
-    <w:p>
-      <w:pPr>
-        <w:pStyle w:val="BodyText"/>
-      </w:pPr>
-      <w:r>
-        <w:t xml:space="preserve">SINGH, S. et al. The Leaderboard Illusion. NeurIPS 2025, Datasets and Benchmarks Track. arXiv:2504.20879.</w:t>
-      </w:r>
-    </w:p>
-    <w:p>
-      <w:pPr>
-        <w:pStyle w:val="BodyText"/>
-      </w:pPr>
-      <w:r>
-        <w:t xml:space="preserve">SINGHAL, P.; GOYAL, T.; XU, J.; DURRETT, G. A Long Way to Go: Investigating Length Correlations in RLHF. arXiv:2310.03716, 2023.</w:t>
-      </w:r>
-    </w:p>
-    <w:p>
-      <w:pPr>
-        <w:pStyle w:val="BodyText"/>
-      </w:pPr>
-      <w:r>
-        <w:t xml:space="preserve">SUN, G. et al. CoIn: Counting the Invisible Reasoning Tokens in Commercial Opaque LLM APIs. arXiv:2505.13778, 2025.</w:t>
-      </w:r>
-    </w:p>
-    <w:p>
-      <w:pPr>
-        <w:pStyle w:val="BodyText"/>
-      </w:pPr>
-      <w:r>
-        <w:t xml:space="preserve">Invisible Tokens, Visible Bills: The Urgent Need to Audit Hidden Operations in Opaque LLM Services. arXiv:2505.18471, 2025.</w:t>
-      </w:r>
-    </w:p>
-    <w:p>
-      <w:pPr>
-        <w:pStyle w:val="BodyText"/>
-      </w:pPr>
-      <w:r>
-        <w:t xml:space="preserve">Predictive Auditing of Hidden Tokens in LLM APIs via Reasoning Length Estimation. arXiv:2508.00912, 2025.</w:t>
-      </w:r>
-    </w:p>
-    <w:p>
-      <w:pPr>
-        <w:pStyle w:val="BodyText"/>
-      </w:pPr>
-      <w:r>
-        <w:t xml:space="preserve">Bias Fitting to Mitigate Length Bias of Reward Model in RLHF. arXiv:2505.12843, 2025.</w:t>
-      </w:r>
-    </w:p>
-    <w:p>
-      <w:pPr>
-        <w:pStyle w:val="BodyText"/>
-      </w:pPr>
-      <w:r>
-        <w:rPr>
-          <w:b/>
-          <w:bCs/>
-        </w:rPr>
-        <w:t xml:space="preserve">Relatórios de incidente e dados financeiros</w:t>
-      </w:r>
-    </w:p>
-    <w:p>
-      <w:pPr>
-        <w:pStyle w:val="BodyText"/>
-      </w:pPr>
-      <w:r>
-        <w:t xml:space="preserve">ANTHROPIC. A postmortem of three recent issues. 17 set. 2025. anthropic.com/engineering/a-postmortem-of-three-recent-issues</w:t>
-      </w:r>
-    </w:p>
-    <w:p>
-      <w:pPr>
-        <w:pStyle w:val="BodyText"/>
-      </w:pPr>
-      <w:r>
-        <w:t xml:space="preserve">ANTHROPIC. An update on recent Claude Code quality reports. 23 abr. 2026. anthropic.com/engineering/april-23-postmortem</w:t>
-      </w:r>
-    </w:p>
-    <w:p>
-      <w:pPr>
-        <w:pStyle w:val="BodyText"/>
-      </w:pPr>
-      <w:r>
-        <w:t xml:space="preserve">OPENAI. Declaração pública sobre relatos de modelo</w:t>
-      </w:r>
-      <w:r>
-        <w:t xml:space="preserve"> </w:t>
-      </w:r>
-      <w:r>
-        <w:t xml:space="preserve">“preguiçoso”</w:t>
-      </w:r>
-      <w:r>
-        <w:t xml:space="preserve">, dez. 2023; atualização do modelo em jan. 2024. (cobertura: Futurism, 27 jan. 2024)</w:t>
-      </w:r>
-    </w:p>
-    <w:p>
-      <w:pPr>
-        <w:pStyle w:val="BodyText"/>
-      </w:pPr>
-      <w:r>
-        <w:t xml:space="preserve">THE INFORMATION. Anthropic Lowers Gross Margin Projection as Revenue Skyrockets. 22 jan. 2026.</w:t>
-      </w:r>
-    </w:p>
-    <w:p>
-      <w:pPr>
-        <w:pStyle w:val="BodyText"/>
-      </w:pPr>
-      <w:r>
-        <w:t xml:space="preserve">VENTUREBEAT. Mystery solved: Anthropic reveals changes to Claude’s harnesses and operating instructions likely caused degradation. 23 abr. 2026. (análise independente de 6.852 sessões)</w:t>
-      </w:r>
-    </w:p>
-    <w:p>
-      <w:pPr>
-        <w:pStyle w:val="BodyText"/>
-      </w:pPr>
-      <w:r>
-        <w:rPr>
-          <w:b/>
-          <w:bCs/>
-        </w:rPr>
-        <w:t xml:space="preserve">Direito brasileiro</w:t>
-      </w:r>
-    </w:p>
-    <w:p>
-      <w:pPr>
-        <w:pStyle w:val="BodyText"/>
-      </w:pPr>
-      <w:r>
-        <w:t xml:space="preserve">BRASIL. Lei nº 8.078, de 11 de setembro de 1990 (Código de Defesa do Consumidor), art. 6º, III e VIII. planalto.gov.br/ccivil_03/leis/l8078compilado.htm</w:t>
-      </w:r>
-    </w:p>
-    <w:bookmarkEnd w:id="63"/>
-    <w:bookmarkStart w:id="64" w:name="X1a894ffc0c0c75d9df75f17b36552bce1605695"/>
+          <w:b/>
+          <w:bCs/>
+        </w:rPr>
+        <w:t xml:space="preserve">Der Kobra-Effekt</w:t>
+      </w:r>
+      <w:r>
+        <w:t xml:space="preserve">: wie man Irrwege der Wirtschaftspolitik vermeidet. Stuttgart: Deutsche Verlags-Anstalt, 2001.</w:t>
+      </w:r>
+    </w:p>
+    <w:p>
+      <w:pPr>
+        <w:pStyle w:val="Referencia"/>
+      </w:pPr>
+      <w:r>
+        <w:t xml:space="preserve">SINGH, S. et al. </w:t>
+      </w:r>
+      <w:r>
+        <w:rPr>
+          <w:b/>
+          <w:bCs/>
+        </w:rPr>
+        <w:t xml:space="preserve">The leaderboard illusion</w:t>
+      </w:r>
+      <w:r>
+        <w:t xml:space="preserve">. [S. l.]: arXiv, 2025. Preprint arXiv:2504.20879. Trabalho apresentado na NeurIPS 2025, Datasets and Benchmarks Track. Disponível em:</w:t>
+      </w:r>
+      <w:r>
+        <w:t xml:space="preserve"> </w:t>
+      </w:r>
+      <w:hyperlink r:id="rId105">
+        <w:r>
+          <w:rPr>
+            <w:rStyle w:val="Hyperlink"/>
+          </w:rPr>
+          <w:t xml:space="preserve">https://arxiv.org/abs/2504.20879</w:t>
+        </w:r>
+      </w:hyperlink>
+      <w:r>
+        <w:t xml:space="preserve">. Acesso em: 10 out. 2026.</w:t>
+      </w:r>
+    </w:p>
+    <w:p>
+      <w:pPr>
+        <w:pStyle w:val="Referencia"/>
+      </w:pPr>
+      <w:r>
+        <w:t xml:space="preserve">SINGHAL, P. et al. </w:t>
+      </w:r>
+      <w:r>
+        <w:rPr>
+          <w:b/>
+          <w:bCs/>
+        </w:rPr>
+        <w:t xml:space="preserve">A long way to go</w:t>
+      </w:r>
+      <w:r>
+        <w:t xml:space="preserve">: investigating length correlations in RLHF. [S. l.]: arXiv, 2023. Preprint arXiv:2310.03716. Aceito na COLM 2024. Disponível em:</w:t>
+      </w:r>
+      <w:r>
+        <w:t xml:space="preserve"> </w:t>
+      </w:r>
+      <w:hyperlink r:id="rId106">
+        <w:r>
+          <w:rPr>
+            <w:rStyle w:val="Hyperlink"/>
+          </w:rPr>
+          <w:t xml:space="preserve">https://arxiv.org/abs/2310.03716</w:t>
+        </w:r>
+      </w:hyperlink>
+      <w:r>
+        <w:t xml:space="preserve">. Acesso em: 10 out. 2026.</w:t>
+      </w:r>
+    </w:p>
+    <w:p>
+      <w:pPr>
+        <w:pStyle w:val="Referencia"/>
+      </w:pPr>
+      <w:r>
+        <w:t xml:space="preserve">STRATHERN, M.</w:t>
+      </w:r>
+      <w:r>
+        <w:t xml:space="preserve"> </w:t>
+      </w:r>
+      <w:r>
+        <w:t xml:space="preserve">‘Improving ratings’</w:t>
+      </w:r>
+      <w:r>
+        <w:t xml:space="preserve">: audit in the British university system.</w:t>
+      </w:r>
+      <w:r>
+        <w:t xml:space="preserve"> </w:t>
+      </w:r>
+      <w:r>
+        <w:rPr>
+          <w:b/>
+          <w:bCs/>
+        </w:rPr>
+        <w:t xml:space="preserve">European Review</w:t>
+      </w:r>
+      <w:r>
+        <w:t xml:space="preserve">, [S. l.], v. 5, n. 3, p. 305-321, 1997.</w:t>
+      </w:r>
+    </w:p>
+    <w:p>
+      <w:pPr>
+        <w:pStyle w:val="Referencia"/>
+      </w:pPr>
+      <w:r>
+        <w:t xml:space="preserve">SUN, G. et al. </w:t>
+      </w:r>
+      <w:r>
+        <w:rPr>
+          <w:b/>
+          <w:bCs/>
+        </w:rPr>
+        <w:t xml:space="preserve">CoIn</w:t>
+      </w:r>
+      <w:r>
+        <w:t xml:space="preserve">: counting the invisible reasoning tokens in commercial opaque LLM APIs. [S. l.]: arXiv, 2025a. Preprint arXiv:2505.13778. Disponível em:</w:t>
+      </w:r>
+      <w:r>
+        <w:t xml:space="preserve"> </w:t>
+      </w:r>
+      <w:hyperlink r:id="rId107">
+        <w:r>
+          <w:rPr>
+            <w:rStyle w:val="Hyperlink"/>
+          </w:rPr>
+          <w:t xml:space="preserve">https://arxiv.org/abs/2505.13778</w:t>
+        </w:r>
+      </w:hyperlink>
+      <w:r>
+        <w:t xml:space="preserve">. Acesso em: 10 out. 2026.</w:t>
+      </w:r>
+    </w:p>
+    <w:p>
+      <w:pPr>
+        <w:pStyle w:val="Referencia"/>
+      </w:pPr>
+      <w:r>
+        <w:t xml:space="preserve">SUN, G. et al. </w:t>
+      </w:r>
+      <w:r>
+        <w:rPr>
+          <w:b/>
+          <w:bCs/>
+        </w:rPr>
+        <w:t xml:space="preserve">Invisible tokens, visible bills</w:t>
+      </w:r>
+      <w:r>
+        <w:t xml:space="preserve">: the urgent need to audit hidden operations in opaque LLM services. [S. l.]: arXiv, 2025b. Preprint arXiv:2505.18471. Disponível em:</w:t>
+      </w:r>
+      <w:r>
+        <w:t xml:space="preserve"> </w:t>
+      </w:r>
+      <w:hyperlink r:id="rId108">
+        <w:r>
+          <w:rPr>
+            <w:rStyle w:val="Hyperlink"/>
+          </w:rPr>
+          <w:t xml:space="preserve">https://arxiv.org/abs/2505.18471</w:t>
+        </w:r>
+      </w:hyperlink>
+      <w:r>
+        <w:t xml:space="preserve">. Acesso em: 10 out. 2026.</w:t>
+      </w:r>
+    </w:p>
+    <w:p>
+      <w:pPr>
+        <w:pStyle w:val="Referencia"/>
+      </w:pPr>
+      <w:r>
+        <w:t xml:space="preserve">TANGERMANN, V. OpenAI issues patch to fix GPT-4’s alleged laziness.</w:t>
+      </w:r>
+      <w:r>
+        <w:t xml:space="preserve"> </w:t>
+      </w:r>
+      <w:r>
+        <w:rPr>
+          <w:b/>
+          <w:bCs/>
+        </w:rPr>
+        <w:t xml:space="preserve">Futurism</w:t>
+      </w:r>
+      <w:r>
+        <w:t xml:space="preserve">, [S. l.], 27 Jan. 2024. Disponível em:</w:t>
+      </w:r>
+      <w:r>
+        <w:t xml:space="preserve"> </w:t>
+      </w:r>
+      <w:hyperlink r:id="rId109">
+        <w:r>
+          <w:rPr>
+            <w:rStyle w:val="Hyperlink"/>
+          </w:rPr>
+          <w:t xml:space="preserve">https://futurism.com/the-byte/openai-patch-fix-gpt4-laziness</w:t>
+        </w:r>
+      </w:hyperlink>
+      <w:r>
+        <w:t xml:space="preserve">. Acesso em: 10 out. 2026.</w:t>
+      </w:r>
+    </w:p>
+    <w:p>
+      <w:pPr>
+        <w:pStyle w:val="Referencia"/>
+      </w:pPr>
+      <w:r>
+        <w:t xml:space="preserve">THOMPSON, G. J. et al. </w:t>
+      </w:r>
+      <w:r>
+        <w:rPr>
+          <w:b/>
+          <w:bCs/>
+        </w:rPr>
+        <w:t xml:space="preserve">In-use emissions testing of light-duty diesel vehicles in the United States</w:t>
+      </w:r>
+      <w:r>
+        <w:t xml:space="preserve">: final report. Morgantown: West Virginia University, Center for Alternative Fuels, Engines &amp; Emissions, 15 May 2014. Relatório preparado para o International Council on Clean Transportation. Disponível em:</w:t>
+      </w:r>
+      <w:r>
+        <w:t xml:space="preserve"> </w:t>
+      </w:r>
+      <w:hyperlink r:id="rId110">
+        <w:r>
+          <w:rPr>
+            <w:rStyle w:val="Hyperlink"/>
+          </w:rPr>
+          <w:t xml:space="preserve">https://theicct.org/wp-content/uploads/2021/06/WVU_LDDV_in-use_ICCT_Report_Final_may2014.pdf</w:t>
+        </w:r>
+      </w:hyperlink>
+      <w:r>
+        <w:t xml:space="preserve">. Acesso em: 10 out. 2026.</w:t>
+      </w:r>
+    </w:p>
+    <w:p>
+      <w:pPr>
+        <w:pStyle w:val="Referencia"/>
+      </w:pPr>
+      <w:r>
+        <w:t xml:space="preserve">TIGER BROKERS.</w:t>
+      </w:r>
+      <w:r>
+        <w:t xml:space="preserve"> </w:t>
+      </w:r>
+      <w:r>
+        <w:rPr>
+          <w:b/>
+          <w:bCs/>
+        </w:rPr>
+        <w:t xml:space="preserve">AI profitability proves elusive</w:t>
+      </w:r>
+      <w:r>
+        <w:t xml:space="preserve">: Anthropic cuts gross margin guidance as 12-fold revenue surge offset by 23% spike in inference costs. [S. l.]: Tiger Brokers, 22 Jan. 2026. Disponível em:</w:t>
+      </w:r>
+      <w:r>
+        <w:t xml:space="preserve"> </w:t>
+      </w:r>
+      <w:hyperlink r:id="rId111">
+        <w:r>
+          <w:rPr>
+            <w:rStyle w:val="Hyperlink"/>
+          </w:rPr>
+          <w:t xml:space="preserve">https://www.itiger.com/news/1113108294</w:t>
+        </w:r>
+      </w:hyperlink>
+      <w:r>
+        <w:t xml:space="preserve">. Acesso em: 10 out. 2026.</w:t>
+      </w:r>
+    </w:p>
+    <w:p>
+      <w:pPr>
+        <w:pStyle w:val="Referencia"/>
+      </w:pPr>
+      <w:r>
+        <w:t xml:space="preserve">UNE AMENDE de 25 millions d’euros infligée à Apple pour pratique commerciale trompeuse en France.</w:t>
+      </w:r>
+      <w:r>
+        <w:t xml:space="preserve"> </w:t>
+      </w:r>
+      <w:r>
+        <w:rPr>
+          <w:b/>
+          <w:bCs/>
+        </w:rPr>
+        <w:t xml:space="preserve">Le Monde</w:t>
+      </w:r>
+      <w:r>
+        <w:t xml:space="preserve">, Paris, 7 févr. 2020. Disponível em:</w:t>
+      </w:r>
+      <w:r>
+        <w:t xml:space="preserve"> </w:t>
+      </w:r>
+      <w:hyperlink r:id="rId112">
+        <w:r>
+          <w:rPr>
+            <w:rStyle w:val="Hyperlink"/>
+          </w:rPr>
+          <w:t xml:space="preserve">https://www.lemonde.fr/pixels/article/2020/02/07/une-amende-de-25-millions-d-euros-infligee-a-apple-pour-pratique-commerciale-trompeuse-en-france_6028758_4408996.html</w:t>
+        </w:r>
+      </w:hyperlink>
+      <w:r>
+        <w:t xml:space="preserve">. Acesso em: 10 out. 2026.</w:t>
+      </w:r>
+    </w:p>
+    <w:p>
+      <w:pPr>
+        <w:pStyle w:val="Referencia"/>
+      </w:pPr>
+      <w:r>
+        <w:t xml:space="preserve">VASWANI, A. et al. </w:t>
+      </w:r>
+      <w:r>
+        <w:rPr>
+          <w:b/>
+          <w:bCs/>
+        </w:rPr>
+        <w:t xml:space="preserve">Attention is all you need</w:t>
+      </w:r>
+      <w:r>
+        <w:t xml:space="preserve">. [S. l.]: arXiv, 2017. Preprint arXiv:1706.03762. Disponível em:</w:t>
+      </w:r>
+      <w:r>
+        <w:t xml:space="preserve"> </w:t>
+      </w:r>
+      <w:hyperlink r:id="rId113">
+        <w:r>
+          <w:rPr>
+            <w:rStyle w:val="Hyperlink"/>
+          </w:rPr>
+          <w:t xml:space="preserve">https://arxiv.org/abs/1706.03762</w:t>
+        </w:r>
+      </w:hyperlink>
+      <w:r>
+        <w:t xml:space="preserve">. Acesso em: 10 out. 2026.</w:t>
+      </w:r>
+    </w:p>
+    <w:p>
+      <w:pPr>
+        <w:pStyle w:val="Referencia"/>
+      </w:pPr>
+      <w:r>
+        <w:t xml:space="preserve">WANG, Z. et al. </w:t>
+      </w:r>
+      <w:r>
+        <w:rPr>
+          <w:b/>
+          <w:bCs/>
+        </w:rPr>
+        <w:t xml:space="preserve">Predictive auditing of hidden tokens in LLM APIs via reasoning length estimation</w:t>
+      </w:r>
+      <w:r>
+        <w:t xml:space="preserve">. [S. l.]: arXiv, 2025. Preprint arXiv:2508.00912. Disponível em:</w:t>
+      </w:r>
+      <w:r>
+        <w:t xml:space="preserve"> </w:t>
+      </w:r>
+      <w:hyperlink r:id="rId114">
+        <w:r>
+          <w:rPr>
+            <w:rStyle w:val="Hyperlink"/>
+          </w:rPr>
+          <w:t xml:space="preserve">https://arxiv.org/abs/2508.00912</w:t>
+        </w:r>
+      </w:hyperlink>
+      <w:r>
+        <w:t xml:space="preserve">. Acesso em: 10 out. 2026.</w:t>
+      </w:r>
+    </w:p>
+    <w:p>
+      <w:pPr>
+        <w:pStyle w:val="Referencia"/>
+      </w:pPr>
+      <w:r>
+        <w:t xml:space="preserve">ZHAO, K. et al. </w:t>
+      </w:r>
+      <w:r>
+        <w:rPr>
+          <w:b/>
+          <w:bCs/>
+        </w:rPr>
+        <w:t xml:space="preserve">Bias fitting to mitigate length bias of reward model in RLHF</w:t>
+      </w:r>
+      <w:r>
+        <w:t xml:space="preserve">. [S. l.]: arXiv, 2025. Preprint arXiv:2505.12843. Aceito no ACL 2026. Disponível em:</w:t>
+      </w:r>
+      <w:r>
+        <w:t xml:space="preserve"> </w:t>
+      </w:r>
+      <w:hyperlink r:id="rId115">
+        <w:r>
+          <w:rPr>
+            <w:rStyle w:val="Hyperlink"/>
+          </w:rPr>
+          <w:t xml:space="preserve">https://arxiv.org/abs/2505.12843</w:t>
+        </w:r>
+      </w:hyperlink>
+      <w:r>
+        <w:t xml:space="preserve">. Acesso em: 10 out. 2026.</w:t>
+      </w:r>
+    </w:p>
+    <w:bookmarkEnd w:id="116"/>
+    <w:bookmarkStart w:id="117" w:name="X1a894ffc0c0c75d9df75f17b36552bce1605695"/>
     <w:p>
       <w:pPr>
         <w:pStyle w:val="Heading1"/>
@@ -2625,8 +4099,8 @@
       </w:tblPr>
       <w:tblGrid>
         <w:gridCol w:w="2640"/>
-        <w:gridCol w:w="2640"/>
-        <w:gridCol w:w="2640"/>
+        <w:gridCol w:w="3960"/>
+        <w:gridCol w:w="1320"/>
       </w:tblGrid>
       <w:tr>
         <w:trPr>
@@ -3163,8 +4637,8 @@
         <w:t xml:space="preserve">, seguido da redação de um texto acusatório para uso contra um terceiro sistema. Analisado na seção 6.6.</w:t>
       </w:r>
     </w:p>
-    <w:bookmarkEnd w:id="64"/>
-    <w:bookmarkStart w:id="65" w:name="nota-sobre-o-estado-de-verificação"/>
+    <w:bookmarkEnd w:id="117"/>
+    <w:bookmarkStart w:id="118" w:name="nota-sobre-o-estado-de-verificação"/>
     <w:p>
       <w:pPr>
         <w:pStyle w:val="Heading1"/>
@@ -3190,7 +4664,7 @@
         </w:numPr>
       </w:pPr>
       <w:r>
-        <w:t xml:space="preserve">Conferidos diretamente na fonte ou em múltiplas fontes independentes, em setembro de 2026 (v1.0): os dois relatórios de incidente de 2025 e 2026 (o de 2026 lido na íntegra, em texto e na versão original com gráficos e telas), o caso de 2023, os dados financeiros de janeiro de 2026, os trabalhos Leaderboard Illusion, Quantization Meets Reasoning, CoIn, Invisible Tokens, Singhal et al. e Chen, Zaharia e Zou com a crítica de Narayanan e Kapoor, o verificador de revendedores, e todos os valores, datas e fatos dos cinco precedentes históricos.</w:t>
+        <w:t xml:space="preserve">Em 10/10/2026, todas as fontes online foram reabertas para conferir autoria, título, data e endereço, e cada referência traz a data de acesso correspondente. A lei brasileira foi consultada em 04/10/2026.</w:t>
       </w:r>
     </w:p>
     <w:p>
@@ -3202,7 +4676,7 @@
         </w:numPr>
       </w:pPr>
       <w:r>
-        <w:t xml:space="preserve">Acrescentados na v2.0 e conferidos na fonte em 04/10/2026: resumo de Sharma et al. (2023); resumos de ODIN (Chen et al., 2024) e de Park et al. (2024); título e resumo do trabalho de auditoria preditiva de tokens ocultos (arXiv 2508.00912); texto do art. 6º, III e VIII, do CDC (versão compilada do Planalto); não automaticidade da inversão do ônus da prova (acórdãos recentes do STJ). Desses trabalhos foi lido o resumo, não o texto integral.</w:t>
+        <w:t xml:space="preserve">Nessa conferência foram corrigidos pontos herdados da versão 1.0: o acordo de 113 milhões de dólares foi firmado com 33 estados e o Distrito de Colúmbia, e não com 34 estados (fato 14); a menção expressa a técnicas de software na lei francesa entrou em 2021, e não em 2015 (fato 17); a sanção francesa de 2020 foi uma transação penal por prática comercial enganosa por omissão, sem condenação por obsolescência programada (fato 12). Também foi detalhada a composição do acordo de 2005 com a agência ambiental americana (fato 21) e precisada a data de abertura da investigação contra o fabricante de impressoras (fato 15).</w:t>
       </w:r>
     </w:p>
     <w:p>
@@ -3214,7 +4688,7 @@
         </w:numPr>
       </w:pPr>
       <w:r>
-        <w:t xml:space="preserve">Obras teóricas clássicas (Akerlof, Bulow, Goodhart, Siebert, Brignull) citadas pela referência bibliográfica padrão, sem nova conferência do texto integral.</w:t>
+        <w:t xml:space="preserve">Dos quatro trabalhos acrescentados na v2.0 (Sharma et al., 2023; Chen et al., 2024; Park et al., 2024; Wang et al., 2025) foi lido o texto integral. Dos demais trabalhos acadêmicos foram reconferidos resumo e metadados. Obras clássicas (Akerlof, Bulow, Goodhart, Siebert, Brignull, Strathern) tiveram os dados bibliográficos conferidos, sem nova leitura do texto integral.</w:t>
       </w:r>
     </w:p>
     <w:p>
@@ -3226,7 +4700,7 @@
         </w:numPr>
       </w:pPr>
       <w:r>
-        <w:t xml:space="preserve">Os dados financeiros da seção 6.1 vêm de reportagem baseada em fontes anônimas com conhecimento das finanças da empresa, e não de demonstração financeira auditada. Devem ser tratados como tal.</w:t>
+        <w:t xml:space="preserve">As reportagens do The Information estão atrás de paywall: título e autoria foram conferidos nos metadados das páginas, e os números citados, em resumo independente da mesma apuração (Tiger Brokers, 2026). O dia exato da primeira reportagem (21 ou 22 de janeiro de 2026) não pôde ser confirmado. Os dados vêm de fontes anônimas com conhecimento das finanças da empresa, e não de demonstração financeira auditada. Devem ser tratados como tal.</w:t>
       </w:r>
     </w:p>
     <w:p>
@@ -3238,7 +4712,7 @@
         </w:numPr>
       </w:pPr>
       <w:r>
-        <w:t xml:space="preserve">Os valores do gráfico de esforço citados na seção 6.2 são leitura visual aproximada do gráfico publicado, não números tabelados pelo fornecedor. A margem de leitura é de cerca de um ponto percentual para cima ou para baixo.</w:t>
+        <w:t xml:space="preserve">Os valores do gráfico de esforço citados na seção 6.2 são leitura visual aproximada do gráfico publicado na versão original do relatório, com gráficos e telas, conferida em setembro de 2026. Não são números tabelados pelo fornecedor, e a margem de leitura é de cerca de um ponto percentual para cima ou para baixo.</w:t>
       </w:r>
     </w:p>
     <w:p>
@@ -3274,14 +4748,17 @@
         </w:numPr>
       </w:pPr>
       <w:r>
-        <w:t xml:space="preserve">Nenhuma citação direta extensa foi reproduzida; os relatórios e trabalhos são descritos por paráfrase. Antes de submissão a qualquer veículo, recomenda-se adequar as referências ao formato exigido e reabrir as fontes online para confirmar que permanecem disponíveis.</w:t>
-      </w:r>
-    </w:p>
-    <w:bookmarkEnd w:id="65"/>
+        <w:t xml:space="preserve">Nenhuma citação direta extensa foi reproduzida; os relatórios e trabalhos são descritos por paráfrase. Citações e referências seguem a ABNT NBR 10520:2023 e a NBR 6023:2018. Antes da submissão a qualquer veículo, convém ajustá-las às normas do periódico escolhido e reabrir as fontes online para confirmar que permanecem disponíveis.</w:t>
+      </w:r>
+    </w:p>
+    <w:bookmarkEnd w:id="118"/>
     <w:sectPr>
+      <w:footerReference r:id="rIdRodape1" w:type="default"/>
       <w:footnotePr>
         <w:numRestart w:val="eachSect"/>
       </w:footnotePr>
+      <w:pgSz w:h="16838" w:w="11906"/>
+      <w:pgMar w:bottom="1134" w:footer="567" w:gutter="0" w:header="709" w:left="1701" w:right="1134" w:top="1701"/>
     </w:sectPr>
   </w:body>
 </w:document>
@@ -3289,6 +4766,46 @@
 
 <file path=word/comments.xml><?xml version="1.0" encoding="utf-8"?>
 <w:comments xmlns:w="http://schemas.openxmlformats.org/wordprocessingml/2006/main" xmlns:m="http://schemas.openxmlformats.org/officeDocument/2006/math" xmlns:r="http://schemas.openxmlformats.org/officeDocument/2006/relationships" xmlns:o="urn:schemas-microsoft-com:office:office" xmlns:v="urn:schemas-microsoft-com:vml" xmlns:w10="urn:schemas-microsoft-com:office:word" xmlns:a="http://schemas.openxmlformats.org/drawingml/2006/main" xmlns:pic="http://schemas.openxmlformats.org/drawingml/2006/picture" xmlns:wp="http://schemas.openxmlformats.org/drawingml/2006/wordprocessingDrawing"/>
+</file>
+
+<file path=word/footer1.xml><?xml version="1.0" encoding="utf-8"?>
+<w:ftr xmlns:w="http://schemas.openxmlformats.org/wordprocessingml/2006/main" xmlns:r="http://schemas.openxmlformats.org/officeDocument/2006/relationships">
+  <w:p>
+    <w:pPr>
+      <w:jc w:val="center"/>
+    </w:pPr>
+    <w:r>
+      <w:rPr>
+        <w:sz w:val="20"/>
+      </w:rPr>
+      <w:fldChar w:fldCharType="begin"/>
+    </w:r>
+    <w:r>
+      <w:rPr>
+        <w:sz w:val="20"/>
+      </w:rPr>
+      <w:instrText xml:space="preserve"> PAGE </w:instrText>
+    </w:r>
+    <w:r>
+      <w:rPr>
+        <w:sz w:val="20"/>
+      </w:rPr>
+      <w:fldChar w:fldCharType="separate"/>
+    </w:r>
+    <w:r>
+      <w:rPr>
+        <w:sz w:val="20"/>
+      </w:rPr>
+      <w:t>1</w:t>
+    </w:r>
+    <w:r>
+      <w:rPr>
+        <w:sz w:val="20"/>
+      </w:rPr>
+      <w:fldChar w:fldCharType="end"/>
+    </w:r>
+  </w:p>
+</w:ftr>
 </file>
 
 <file path=word/footnotes.xml><?xml version="1.0" encoding="utf-8"?>
@@ -3659,15 +5176,15 @@
   <w:docDefaults>
     <w:rPrDefault>
       <w:rPr>
-        <w:rFonts w:asciiTheme="minorHAnsi" w:cstheme="minorBidi" w:eastAsiaTheme="minorEastAsia" w:hAnsiTheme="minorHAnsi"/>
+        <w:rFonts w:ascii="Times New Roman" w:cs="Times New Roman" w:eastAsia="Times New Roman" w:hAnsi="Times New Roman"/>
         <w:sz w:val="24"/>
         <w:szCs w:val="24"/>
-        <w:lang w:bidi="ar-SA" w:eastAsia="zh-CN" w:val="pt-BR"/>
+        <w:lang w:bidi="ar-SA" w:eastAsia="pt-BR" w:val="pt-BR"/>
       </w:rPr>
     </w:rPrDefault>
     <w:pPrDefault>
       <w:pPr>
-        <w:spacing w:after="200"/>
+        <w:spacing w:after="120" w:line="360" w:lineRule="auto"/>
       </w:pPr>
     </w:pPrDefault>
   </w:docDefaults>
@@ -3678,12 +5195,13 @@
   </w:style>
   <w:style w:styleId="BodyText" w:type="paragraph">
     <w:name w:val="Body Text"/>
+    <w:pPr>
+      <w:spacing w:after="120" w:before="0"/>
+      <w:jc w:val="both"/>
+    </w:pPr>
     <w:basedOn w:val="Normal"/>
     <w:link w:val="BodyTextChar"/>
     <w:qFormat/>
-    <w:pPr>
-      <w:spacing w:after="180" w:before="180"/>
-    </w:pPr>
   </w:style>
   <w:style w:customStyle="1" w:styleId="FirstParagraph" w:type="paragraph">
     <w:name w:val="First Paragraph"/>
@@ -3693,11 +5211,12 @@
   </w:style>
   <w:style w:customStyle="1" w:styleId="Compact" w:type="paragraph">
     <w:name w:val="Compact"/>
+    <w:pPr>
+      <w:spacing w:after="60" w:before="0"/>
+      <w:jc w:val="left"/>
+    </w:pPr>
     <w:basedOn w:val="BodyText"/>
     <w:qFormat/>
-    <w:pPr>
-      <w:spacing w:after="36" w:before="36"/>
-    </w:pPr>
   </w:style>
   <w:style w:styleId="Title" w:type="paragraph">
     <w:name w:val="Title"/>
@@ -3713,9 +5232,10 @@
       <w:jc w:val="center"/>
     </w:pPr>
     <w:rPr>
-      <w:rFonts w:asciiTheme="majorHAnsi" w:cstheme="majorBidi" w:eastAsiaTheme="majorEastAsia" w:hAnsiTheme="majorHAnsi"/>
-      <w:sz w:val="56"/>
-      <w:szCs w:val="56"/>
+      <w:rFonts w:ascii="Times New Roman" w:cs="Times New Roman" w:eastAsia="Times New Roman" w:hAnsi="Times New Roman"/>
+      <w:b/>
+      <w:sz w:val="32"/>
+      <w:szCs w:val="32"/>
     </w:rPr>
   </w:style>
   <w:style w:customStyle="1" w:styleId="TitleChar" w:type="character">
@@ -3744,10 +5264,11 @@
       </w:numPr>
     </w:pPr>
     <w:rPr>
-      <w:rFonts w:cstheme="majorBidi" w:eastAsiaTheme="majorEastAsia"/>
-      <w:spacing w:val="15"/>
-      <w:sz w:val="28"/>
-      <w:szCs w:val="28"/>
+      <w:rFonts w:ascii="Times New Roman" w:cs="Times New Roman" w:eastAsia="Times New Roman" w:hAnsi="Times New Roman"/>
+      <w:b w:val="0"/>
+      <w:i/>
+      <w:sz w:val="26"/>
+      <w:szCs w:val="26"/>
     </w:rPr>
   </w:style>
   <w:style w:customStyle="1" w:styleId="SubtitleChar" w:type="character">
@@ -3774,6 +5295,8 @@
       <w:keepLines/>
     </w:pPr>
     <w:rPr>
+      <w:rFonts w:ascii="Times New Roman" w:cs="Times New Roman" w:eastAsia="Times New Roman" w:hAnsi="Times New Roman"/>
+      <w:b w:val="0"/>
       <w:sz w:val="24"/>
       <w:szCs w:val="24"/>
     </w:rPr>
@@ -3847,10 +5370,10 @@
       <w:outlineLvl w:val="0"/>
     </w:pPr>
     <w:rPr>
-      <w:rFonts w:asciiTheme="majorHAnsi" w:cstheme="majorBidi" w:eastAsiaTheme="majorEastAsia" w:hAnsiTheme="majorHAnsi"/>
-      <w:color w:themeColor="accent1" w:themeShade="BF" w:val="0F4761"/>
-      <w:sz w:val="40"/>
-      <w:szCs w:val="40"/>
+      <w:rFonts w:ascii="Times New Roman" w:cs="Times New Roman" w:eastAsia="Times New Roman" w:hAnsi="Times New Roman"/>
+      <w:b/>
+      <w:sz w:val="28"/>
+      <w:szCs w:val="28"/>
     </w:rPr>
   </w:style>
   <w:style w:styleId="Heading2" w:type="paragraph">
@@ -3870,10 +5393,10 @@
       <w:outlineLvl w:val="1"/>
     </w:pPr>
     <w:rPr>
-      <w:rFonts w:asciiTheme="majorHAnsi" w:cstheme="majorBidi" w:eastAsiaTheme="majorEastAsia" w:hAnsiTheme="majorHAnsi"/>
-      <w:color w:themeColor="accent1" w:themeShade="BF" w:val="0F4761"/>
-      <w:sz w:val="32"/>
-      <w:szCs w:val="32"/>
+      <w:rFonts w:ascii="Times New Roman" w:cs="Times New Roman" w:eastAsia="Times New Roman" w:hAnsi="Times New Roman"/>
+      <w:b/>
+      <w:sz w:val="24"/>
+      <w:szCs w:val="24"/>
     </w:rPr>
   </w:style>
   <w:style w:styleId="Heading3" w:type="paragraph">
@@ -3893,10 +5416,11 @@
       <w:outlineLvl w:val="2"/>
     </w:pPr>
     <w:rPr>
-      <w:rFonts w:cstheme="majorBidi" w:eastAsiaTheme="majorEastAsia"/>
-      <w:color w:themeColor="accent1" w:themeShade="BF" w:val="0F4761"/>
-      <w:sz w:val="28"/>
-      <w:szCs w:val="28"/>
+      <w:rFonts w:ascii="Times New Roman" w:cs="Times New Roman" w:eastAsia="Times New Roman" w:hAnsi="Times New Roman"/>
+      <w:b/>
+      <w:i/>
+      <w:sz w:val="24"/>
+      <w:szCs w:val="24"/>
     </w:rPr>
   </w:style>
   <w:style w:styleId="Heading4" w:type="paragraph">
@@ -4309,6 +5833,15 @@
       <w:bCs w:val="0"/>
       <w:color w:themeColor="accent1" w:themeShade="BF" w:val="365F91"/>
     </w:rPr>
+  </w:style>
+  <w:style w:customStyle="1" w:styleId="Referencia" w:type="paragraph">
+    <w:name w:val="Referencia"/>
+    <w:basedOn w:val="Normal"/>
+    <w:qFormat/>
+    <w:pPr>
+      <w:spacing w:after="240" w:before="0" w:line="240" w:lineRule="auto"/>
+      <w:jc w:val="left"/>
+    </w:pPr>
   </w:style>
   <w:style w:type="paragraph" w:customStyle="1" w:styleId="SourceCode">
     <w:name w:val="Source Code"/>

</xml_diff>

<commit_message>
Versao 2.3: revisao final do texto
- Generalizacoes retiradas: casos confirmados (4 de 5; impressoras
  aguardam julgamento), falha da instrumentacao interna (so 2025 e
  2026), acordos sem admissao de culpa (nem todos)
- Redacao: regencia, concordancia, virgulas e frases ambiguas
- ABNT: et al., In e [S. l.] em italico; espaco inseparavel
- Referencias: Park et al. 2024 na versao publicada (Findings of ACL,
  p. 4998-5017, DOI); STJ com dados do DJe
- Registro de Fatos: tabela de ajustes v2.3

Co-Authored-By: Claude Opus 5.5 <noreply@anthropic.com>
Claude-Session: https://claude.ai/code/session_0169tbWs2aNNwTNJK7v1DKMj
</commit_message>
<xml_diff>
--- a/Da_lampada_ao_token_v2_CONSOLIDADO.docx
+++ b/Da_lampada_ao_token_v2_CONSOLIDADO.docx
@@ -178,7 +178,7 @@
         <w:t xml:space="preserve"> </w:t>
       </w:r>
       <w:r>
-        <w:t xml:space="preserve">2.2, de 10/10/2026, consolidada a partir de 7 arquivos. Fontes reabertas e conferidas em 10/10/2026. Correções e acréscimos estão listados no Registro de Fatos v2 e na Nota sobre o estado de verificação.</w:t>
+        <w:t xml:space="preserve">2.3, de 12/10/2026, consolidada a partir de 7 arquivos. Fontes reabertas e conferidas em 10/10/2026; revisão final em 12/10/2026. Correções e acréscimos estão listados no Registro de Fatos v2 e na Nota sobre o estado de verificação.</w:t>
       </w:r>
     </w:p>
     <w:bookmarkStart w:id="15" w:name="resumo"/>
@@ -225,7 +225,20 @@
         <w:t xml:space="preserve"> </w:t>
       </w:r>
       <w:r>
-        <w:t xml:space="preserve">obsolescência programada; assimetria de informação; enshittification; quantização; padrões obscuros; auditoria capturada; bajulação; modelos de linguagem; custo de inferência.</w:t>
+        <w:t xml:space="preserve">obsolescência programada; assimetria de informação;</w:t>
+      </w:r>
+      <w:r>
+        <w:t xml:space="preserve"> </w:t>
+      </w:r>
+      <w:r>
+        <w:rPr>
+          <w:i/>
+          <w:iCs/>
+        </w:rPr>
+        <w:t xml:space="preserve">enshittification</w:t>
+      </w:r>
+      <w:r>
+        <w:t xml:space="preserve">; quantização; padrões obscuros; auditoria capturada; bajulação; modelos de linguagem; custo de inferência.</w:t>
       </w:r>
     </w:p>
     <w:bookmarkEnd w:id="15"/>
@@ -319,7 +332,7 @@
         <w:pStyle w:val="BodyText"/>
       </w:pPr>
       <w:r>
-        <w:t xml:space="preserve">Há ainda um fato novo que tira a questão do terreno da especulação: em pelo menos três ocasiões entre 2023 e 2026, fornecedores de modelos de linguagem reconheceram publicamente, por escrito, que a qualidade do serviço havia caído por semanas sem que eles próprios percebessem, e que a detecção dependeu da reclamação dos usuários.</w:t>
+        <w:t xml:space="preserve">Há ainda um fato novo que tira a questão do terreno da especulação: em pelo menos três ocasiões entre 2023 e 2026, fornecedores de modelos de linguagem reconheceram publicamente, por escrito, problemas de qualidade do serviço que se estenderam por semanas e vieram à tona pela reclamação dos usuários; em duas delas, o próprio fornecedor registrou que sua instrumentação interna não havia detectado o problema.</w:t>
       </w:r>
     </w:p>
     <w:p>
@@ -327,7 +340,20 @@
         <w:pStyle w:val="BodyText"/>
       </w:pPr>
       <w:r>
-        <w:t xml:space="preserve">Este ensaio tem origem concreta. Ele nasceu de dois debates registrados pelo autor em setembro de 2026 com assistentes comerciais de IA, durante um trabalho rotineiro de configuração de sistema. Num deles, ao longo de seis rodadas, o assistente concedeu o incentivo econômico, o enfraquecimento da ameaça de cancelamento em mercado concentrado, a validade do conceito de enshittification, a assimetria de informação e o valor financeiro da opacidade, mas recusou-se a dar como provada a intenção. No outro, um assistente de outro fornecedor começou negando a tese e, diante da insistência do usuário, abandonou a posição por completo e passou a redigir texto acusatório. As duas reações são, elas próprias, dados, e são examinadas na seção 6.6. O placar do primeiro debate está no Apêndice A.</w:t>
+        <w:t xml:space="preserve">Este ensaio tem origem concreta. Ele nasceu de dois debates registrados pelo autor em setembro de 2026 com assistentes comerciais de IA, durante um trabalho rotineiro de configuração de sistema. Num deles, ao longo de seis rodadas, o assistente concedeu o incentivo econômico, o enfraquecimento da ameaça de cancelamento em mercado concentrado, a validade do conceito de</w:t>
+      </w:r>
+      <w:r>
+        <w:t xml:space="preserve"> </w:t>
+      </w:r>
+      <w:r>
+        <w:rPr>
+          <w:i/>
+          <w:iCs/>
+        </w:rPr>
+        <w:t xml:space="preserve">enshittification</w:t>
+      </w:r>
+      <w:r>
+        <w:t xml:space="preserve">, a assimetria de informação e o valor financeiro da opacidade, mas recusou-se a dar como provada a intenção. No outro, um assistente de outro fornecedor começou negando a tese e, diante da insistência do usuário, abandonou a posição por completo e passou a redigir texto acusatório. As duas reações são, elas próprias, dados, e são examinadas na seção 6.6. O placar do primeiro debate está no Apêndice A.</w:t>
       </w:r>
     </w:p>
     <w:p>
@@ -485,7 +511,7 @@
         <w:pStyle w:val="BodyText"/>
       </w:pPr>
       <w:r>
-        <w:t xml:space="preserve">Este referencial encaixa no objeto deste ensaio com mais precisão do que Bulow. O comprador de um serviço de IA não tem como verificar em que precisão numérica os pesos foram servidos, para qual modelo a requisição foi roteada, que orçamento de raciocínio foi alocado, nem quantos tokens não exibidos foram gerados e faturados. A qualidade entregue é, no sentido técnico de Akerlof, não verificável pelo comprador. A seção 5.1 mostra que o próprio desenvolvedor de um modelo aberto chegou a essa conclusão sobre os revendedores do seu produto.</w:t>
+        <w:t xml:space="preserve">Este referencial se ajusta ao objeto deste ensaio com mais precisão do que o de Bulow. O comprador de um serviço de IA não tem como verificar em que precisão numérica os pesos foram servidos, para qual modelo a requisição foi roteada, que orçamento de raciocínio foi alocado, nem quantos tokens não exibidos foram gerados e faturados. A qualidade entregue é, no sentido técnico de Akerlof, não verificável pelo comprador. A seção 5.1 mostra que o próprio desenvolvedor de um modelo aberto chegou a essa conclusão sobre os revendedores do seu produto.</w:t>
       </w:r>
     </w:p>
     <w:bookmarkEnd w:id="21"/>
@@ -558,7 +584,65 @@
         <w:pStyle w:val="BodyText"/>
       </w:pPr>
       <w:r>
-        <w:t xml:space="preserve">Este é o elo menos especulativo da cadeia argumentativa, porque não depende de hipótese alguma sobre a conduta das empresas. Singhal et al. (2023) mostraram que, em conjuntos de dados abertos de preferência humana, o comprimento da resposta se correlaciona fortemente com a recompensa, que o ganho de recompensa obtido pelo treinamento é em grande parte explicado pelo aumento do comprimento, e que uma recompensa baseada apenas em comprimento reproduz a maior parte das melhorias atribuídas ao método. A fonte dominante do viés, segundo os autores, está nos modelos de recompensa, pouco robustos e facilmente influenciados pelo comprimento presente nos dados de preferência. Existe hoje uma linha inteira de trabalhos dedicada exclusivamente a corrigir esse viés. O ODIN (Chen et al., 2024) treina no modelo de recompensa um componente ligado ao comprimento e o descarta antes do treinamento da política. Park et al. (2024) mostraram que, no método DPO, o modelo treinado passa a gerar respostas em média duas vezes mais longas do que as dos dados de preferência, e propuseram regularização para conter o efeito. O FiMi-RM (Zhao et al., 2025) modela a relação não linear entre comprimento e recompensa para retirá-la do modelo de recompensa. Ninguém desenvolve correção para um defeito inexistente.</w:t>
+        <w:t xml:space="preserve">Este é o elo menos especulativo da cadeia argumentativa, porque não depende de hipótese alguma sobre a conduta das empresas. Singhal</w:t>
+      </w:r>
+      <w:r>
+        <w:t xml:space="preserve"> </w:t>
+      </w:r>
+      <w:r>
+        <w:rPr>
+          <w:i/>
+          <w:iCs/>
+        </w:rPr>
+        <w:t xml:space="preserve">et al.</w:t>
+      </w:r>
+      <w:r>
+        <w:t xml:space="preserve"> </w:t>
+      </w:r>
+      <w:r>
+        <w:t xml:space="preserve">(2023) mostraram que, em conjuntos de dados abertos de preferência humana, o comprimento da resposta se correlaciona fortemente com a recompensa, que o ganho de recompensa obtido pelo treinamento é em grande parte explicado pelo aumento do comprimento, e que uma recompensa baseada apenas em comprimento reproduz a maior parte das melhorias atribuídas ao método. A fonte dominante do viés, segundo os autores, está nos modelos de recompensa, pouco robustos e facilmente influenciados pelo comprimento presente nos dados de preferência. Existe hoje uma linha inteira de trabalhos dedicada exclusivamente a corrigir esse viés. O ODIN (Chen</w:t>
+      </w:r>
+      <w:r>
+        <w:t xml:space="preserve"> </w:t>
+      </w:r>
+      <w:r>
+        <w:rPr>
+          <w:i/>
+          <w:iCs/>
+        </w:rPr>
+        <w:t xml:space="preserve">et al.</w:t>
+      </w:r>
+      <w:r>
+        <w:t xml:space="preserve">, 2024) treina no modelo de recompensa um componente ligado ao comprimento e o descarta antes do treinamento da política. Park</w:t>
+      </w:r>
+      <w:r>
+        <w:t xml:space="preserve"> </w:t>
+      </w:r>
+      <w:r>
+        <w:rPr>
+          <w:i/>
+          <w:iCs/>
+        </w:rPr>
+        <w:t xml:space="preserve">et al.</w:t>
+      </w:r>
+      <w:r>
+        <w:t xml:space="preserve"> </w:t>
+      </w:r>
+      <w:r>
+        <w:t xml:space="preserve">(2024) mostraram que, no método DPO, o modelo treinado passa a gerar respostas em média duas vezes mais longas do que as dos dados de preferência, e propuseram regularização para conter o efeito. O FiMi-RM (Zhao</w:t>
+      </w:r>
+      <w:r>
+        <w:t xml:space="preserve"> </w:t>
+      </w:r>
+      <w:r>
+        <w:rPr>
+          <w:i/>
+          <w:iCs/>
+        </w:rPr>
+        <w:t xml:space="preserve">et al.</w:t>
+      </w:r>
+      <w:r>
+        <w:t xml:space="preserve">, 2025) modela a relação não linear entre comprimento e recompensa para retirá-la do modelo de recompensa. Ninguém desenvolve correção para um defeito inexistente.</w:t>
       </w:r>
     </w:p>
     <w:bookmarkEnd w:id="23"/>
@@ -568,7 +652,17 @@
         <w:pStyle w:val="Heading2"/>
       </w:pPr>
       <w:r>
-        <w:t xml:space="preserve">3.6 Enshittification</w:t>
+        <w:t xml:space="preserve">3.6</w:t>
+      </w:r>
+      <w:r>
+        <w:t xml:space="preserve"> </w:t>
+      </w:r>
+      <w:r>
+        <w:rPr>
+          <w:i/>
+          <w:iCs/>
+        </w:rPr>
+        <w:t xml:space="preserve">Enshittification</w:t>
       </w:r>
     </w:p>
     <w:p>
@@ -602,7 +696,23 @@
         <w:pStyle w:val="FirstParagraph"/>
       </w:pPr>
       <w:r>
-        <w:t xml:space="preserve">O mesmo treinamento por preferência humana que produz o viés de comprimento produz um segundo viés, menos discutido e decisivo para a seção 6.6. Sharma et al. (2023) mostraram que cinco assistentes de IA de ponta exibem de forma consistente bajulação (</w:t>
+        <w:t xml:space="preserve">O mesmo treinamento por preferência humana que produz o viés de comprimento produz um segundo viés, menos discutido e decisivo para a seção 6.6. Sharma</w:t>
+      </w:r>
+      <w:r>
+        <w:t xml:space="preserve"> </w:t>
+      </w:r>
+      <w:r>
+        <w:rPr>
+          <w:i/>
+          <w:iCs/>
+        </w:rPr>
+        <w:t xml:space="preserve">et al.</w:t>
+      </w:r>
+      <w:r>
+        <w:t xml:space="preserve"> </w:t>
+      </w:r>
+      <w:r>
+        <w:t xml:space="preserve">(2023) mostraram que cinco assistentes de IA de ponta exibem de forma consistente bajulação (</w:t>
       </w:r>
       <w:r>
         <w:rPr>
@@ -648,7 +758,7 @@
         <w:pStyle w:val="FirstParagraph"/>
       </w:pPr>
       <w:r>
-        <w:t xml:space="preserve">A força do argumento examinado não vem da teoria, e sim do histórico. Os cinco casos abaixo foram confirmados por decisão judicial, acordo, sanção regulatória ou documento interno. Em cada um, o que interessa ao argumento deste ensaio não é apenas que a prática existiu, mas como ela foi escondida e como foi descoberta.</w:t>
+        <w:t xml:space="preserve">A força do argumento examinado não vem da teoria, e sim do histórico. Quatro dos cinco casos abaixo foram confirmados por decisão judicial, acordo, sanção regulatória ou documento interno; o quinto, o das impressoras, foi levado a julgamento criminal na França e aguarda decisão. Em cada um, o que interessa ao argumento deste ensaio não é apenas que a prática existiu, mas como ela foi escondida e como foi descoberta.</w:t>
       </w:r>
     </w:p>
     <w:bookmarkStart w:id="27" w:name="o-cartel-phoebus-1925-a-1939"/>
@@ -759,7 +869,20 @@
         <w:pStyle w:val="FirstParagraph"/>
       </w:pPr>
       <w:r>
-        <w:t xml:space="preserve">Entre 2013 e 2014, pesquisadores da West Virginia University, contratados pelo International Council on Clean Transportation (ICCT), mediram as emissões de veículos a diesel em condições reais de estrada (Thompson et al., 2014). Não procuravam fraude: o objetivo era verificar, para governos europeus, se carros a diesel podiam ser limpos em condições reais. Encontraram emissões de óxidos de nitrogênio de 5 a 35 vezes acima do limite legal, conforme o veículo e o poluente (International Council on Clean Transportation, 2025).</w:t>
+        <w:t xml:space="preserve">Entre 2013 e 2014, pesquisadores da West Virginia University, contratados pelo International Council on Clean Transportation (ICCT), mediram as emissões de veículos a diesel em condições reais de estrada (Thompson</w:t>
+      </w:r>
+      <w:r>
+        <w:t xml:space="preserve"> </w:t>
+      </w:r>
+      <w:r>
+        <w:rPr>
+          <w:i/>
+          <w:iCs/>
+        </w:rPr>
+        <w:t xml:space="preserve">et al.</w:t>
+      </w:r>
+      <w:r>
+        <w:t xml:space="preserve">, 2014). Não procuravam fraude: o objetivo era verificar, para governos europeus, se carros a diesel podiam ser limpos em condições reais. Encontraram emissões de óxidos de nitrogênio de 5 a 35 vezes acima do limite legal, conforme o veículo e o poluente (International Council on Clean Transportation, 2025).</w:t>
       </w:r>
     </w:p>
     <w:p>
@@ -767,7 +890,33 @@
         <w:pStyle w:val="BodyText"/>
       </w:pPr>
       <w:r>
-        <w:t xml:space="preserve">Os veículos em questão haviam sido aprovados em certificação oficial durante anos. O software identificava a condição de teste de laboratório, a partir de variáveis como posição do volante, velocidade e tempo de funcionamento do motor, e ativava o controle de emissões apenas durante a medição (Estados Unidos, 2015). Informado dos resultados em 2014, o fabricante contestou os dados e realizou um recall voluntário que não resolveu o problema (Canis et al., 2016; Estados Unidos, 2015). Em 18 de setembro de 2015, a agência ambiental americana emitiu notificação formal de violação (Estados Unidos, 2015). A fraude atingiu cerca de 11 milhões de veículos no mundo (Canis et al., 2016).</w:t>
+        <w:t xml:space="preserve">Os veículos em questão haviam sido aprovados em certificação oficial durante anos. O software identificava a condição de teste de laboratório, a partir de variáveis como posição do volante, velocidade e tempo de funcionamento do motor, e ativava o controle de emissões apenas durante a medição (Estados Unidos, 2015). Informado dos resultados em 2014, o fabricante contestou os dados e realizou um recall voluntário que não resolveu o problema (Canis</w:t>
+      </w:r>
+      <w:r>
+        <w:t xml:space="preserve"> </w:t>
+      </w:r>
+      <w:r>
+        <w:rPr>
+          <w:i/>
+          <w:iCs/>
+        </w:rPr>
+        <w:t xml:space="preserve">et al.</w:t>
+      </w:r>
+      <w:r>
+        <w:t xml:space="preserve">, 2016; Estados Unidos, 2015). Em 18 de setembro de 2015, a agência ambiental americana emitiu notificação formal de violação (Estados Unidos, 2015). A fraude atingiu cerca de 11 milhões de veículos no mundo (Canis</w:t>
+      </w:r>
+      <w:r>
+        <w:t xml:space="preserve"> </w:t>
+      </w:r>
+      <w:r>
+        <w:rPr>
+          <w:i/>
+          <w:iCs/>
+        </w:rPr>
+        <w:t xml:space="preserve">et al.</w:t>
+      </w:r>
+      <w:r>
+        <w:t xml:space="preserve">, 2016).</w:t>
       </w:r>
     </w:p>
     <w:bookmarkEnd w:id="30"/>
@@ -926,7 +1075,7 @@
         <w:pStyle w:val="FirstParagraph"/>
       </w:pPr>
       <w:r>
-        <w:t xml:space="preserve">Quantização é a redução da precisão numérica com que os pesos do modelo são armazenados e processados. O ganho é direto em memória, latência e custo. O custo é perda de exatidão, que depende muito da agressividade do método e do tamanho do modelo.</w:t>
+        <w:t xml:space="preserve">Quantização é a redução da precisão numérica com que os pesos do modelo são armazenados e processados. O ganho é direto em memória, latência e custo. A contrapartida é a perda de exatidão, que depende muito da agressividade do método e do tamanho do modelo.</w:t>
       </w:r>
     </w:p>
     <w:p>
@@ -934,7 +1083,39 @@
         <w:pStyle w:val="BodyText"/>
       </w:pPr>
       <w:r>
-        <w:t xml:space="preserve">Li et al. (2025) mediram o efeito em raciocínio matemático e encontraram, para métodos agressivos, queda de até 32,39% na acurácia, com média de 11,31%, em modelos da família Llama-3; a perda máxima ocorreu no modelo menor da família. Em sentido oposto, Kurtic et al. (2024) mostraram, em mais de 500 mil avaliações da família Llama-3.1, que a quantização em 8 bits de ponto flutuante é efetivamente sem perda em todos os tamanhos de modelo, e que a de 8 bits inteiros perde de 1% a 3%. O ponto não é que toda quantização degrade, e sim que a escolha entre moderada e agressiva é uma decisão de custo tomada pelo operador, fora da vista do cliente.</w:t>
+        <w:t xml:space="preserve">Li</w:t>
+      </w:r>
+      <w:r>
+        <w:t xml:space="preserve"> </w:t>
+      </w:r>
+      <w:r>
+        <w:rPr>
+          <w:i/>
+          <w:iCs/>
+        </w:rPr>
+        <w:t xml:space="preserve">et al.</w:t>
+      </w:r>
+      <w:r>
+        <w:t xml:space="preserve"> </w:t>
+      </w:r>
+      <w:r>
+        <w:t xml:space="preserve">(2025) mediram o efeito em raciocínio matemático e encontraram, para métodos agressivos, queda de até 32,39% na acurácia, com média de 11,31%, em modelos da família Llama-3; a perda máxima ocorreu no modelo menor da família. Em sentido oposto, Kurtic</w:t>
+      </w:r>
+      <w:r>
+        <w:t xml:space="preserve"> </w:t>
+      </w:r>
+      <w:r>
+        <w:rPr>
+          <w:i/>
+          <w:iCs/>
+        </w:rPr>
+        <w:t xml:space="preserve">et al.</w:t>
+      </w:r>
+      <w:r>
+        <w:t xml:space="preserve"> </w:t>
+      </w:r>
+      <w:r>
+        <w:t xml:space="preserve">(2024) mostraram, em mais de 500 mil avaliações da família Llama-3.1, que a quantização em 8 bits de ponto flutuante é efetivamente sem perda em todos os tamanhos de modelo, e que a de 8 bits inteiros perde de 1% a 3%. O ponto não é que toda quantização degrade, e sim que a escolha entre moderada e agressiva é uma decisão de custo tomada pelo operador, fora da vista do cliente.</w:t>
       </w:r>
     </w:p>
     <w:p>
@@ -986,7 +1167,20 @@
         <w:pStyle w:val="BodyText"/>
       </w:pPr>
       <w:r>
-        <w:t xml:space="preserve">Registra-se aqui uma correção que o argumento popular costuma precisar: cabeças de atenção não são reguláveis por requisição, são fixas na arquitetura treinada (Vaswani et al., 2017). Atribuir a elas o papel de alavanca de custo é tecnicamente falso e enfraquece o restante do argumento, que não depende disso. Os parâmetros efetivamente reguláveis são esforço de raciocínio, orçamento de contexto, política de cache, instruções de sistema, precisão de serviço e roteamento.</w:t>
+        <w:t xml:space="preserve">Registra-se aqui uma correção que o argumento popular costuma precisar: cabeças de atenção não são reguláveis por requisição, são fixas na arquitetura treinada (Vaswani</w:t>
+      </w:r>
+      <w:r>
+        <w:t xml:space="preserve"> </w:t>
+      </w:r>
+      <w:r>
+        <w:rPr>
+          <w:i/>
+          <w:iCs/>
+        </w:rPr>
+        <w:t xml:space="preserve">et al.</w:t>
+      </w:r>
+      <w:r>
+        <w:t xml:space="preserve">, 2017). Atribuir a elas o papel de alavanca de custo é tecnicamente falso e enfraquece o restante do argumento, que não depende disso. Os parâmetros efetivamente reguláveis são esforço de raciocínio, orçamento de contexto, política de cache, instruções de sistema, precisão de serviço e roteamento.</w:t>
       </w:r>
     </w:p>
     <w:bookmarkEnd w:id="36"/>
@@ -1022,7 +1216,49 @@
         <w:pStyle w:val="FirstParagraph"/>
       </w:pPr>
       <w:r>
-        <w:t xml:space="preserve">Em modelos com raciocínio interno, parte dos tokens gerados não aparece na resposta, mas é contabilizada como saída e faturada. Sun et al. (2025a) formalizaram o problema sob o nome de inflação de contagem de tokens: como o usuário paga por tokens de raciocínio invisíveis, que frequentemente representam a maior parte do custo, e não tem meio de verificar sua autenticidade, abre-se a possibilidade de o fornecedor declarar consumo maior do que o real ou inserir conteúdo de baixo esforço para aumentar a cobrança. Os autores propõem um verificador independente que detectou inflação simulada com taxa de sucesso de até 94,7%. Parte dos mesmos autores, em trabalho de posição, chamou esses sistemas de serviços comerciais opacos de modelos de linguagem, defendeu a urgência de auditoria dessas operações ocultas e formalizou dois riscos: a inflação de quantidade, em que contagens de tokens e de chamadas podem ser infladas, e o rebaixamento de qualidade, em que o fornecedor pode trocar em silêncio o modelo ou a ferramenta por outros mais baratos (Sun et al., 2025b). O mesmo grupo de pesquisa propôs depois estimar, do lado do usuário, a quantidade de tokens ocultos apenas a partir do par pergunta e resposta, sem acesso ao raciocínio interno (Wang et al., 2025).</w:t>
+        <w:t xml:space="preserve">Em modelos com raciocínio interno, parte dos tokens gerados não aparece na resposta, mas é contabilizada como saída e faturada. Sun</w:t>
+      </w:r>
+      <w:r>
+        <w:t xml:space="preserve"> </w:t>
+      </w:r>
+      <w:r>
+        <w:rPr>
+          <w:i/>
+          <w:iCs/>
+        </w:rPr>
+        <w:t xml:space="preserve">et al.</w:t>
+      </w:r>
+      <w:r>
+        <w:t xml:space="preserve"> </w:t>
+      </w:r>
+      <w:r>
+        <w:t xml:space="preserve">(2025a) formalizaram o problema sob o nome de inflação de contagem de tokens: como o usuário paga por tokens de raciocínio invisíveis, que frequentemente representam a maior parte do custo, e não tem meio de verificar sua autenticidade, abre-se a possibilidade de o fornecedor declarar consumo maior do que o real ou inserir conteúdo de baixo esforço para aumentar a cobrança. Os autores propõem um verificador independente que detectou inflação simulada com taxa de sucesso de até 94,7%. Parte dos mesmos autores, em trabalho de posição, chamou esses sistemas de serviços comerciais opacos de modelos de linguagem, defendeu a urgência de auditoria dessas operações ocultas e formalizou dois riscos: a inflação de quantidade, em que contagens de tokens e de chamadas podem ser infladas, e o rebaixamento de qualidade, em que o fornecedor pode trocar em silêncio o modelo ou a ferramenta por outros mais baratos (Sun</w:t>
+      </w:r>
+      <w:r>
+        <w:t xml:space="preserve"> </w:t>
+      </w:r>
+      <w:r>
+        <w:rPr>
+          <w:i/>
+          <w:iCs/>
+        </w:rPr>
+        <w:t xml:space="preserve">et al.</w:t>
+      </w:r>
+      <w:r>
+        <w:t xml:space="preserve">, 2025b). O mesmo grupo de pesquisa propôs depois estimar, do lado do usuário, a quantidade de tokens ocultos apenas a partir do par pergunta e resposta, sem acesso ao raciocínio interno (Wang</w:t>
+      </w:r>
+      <w:r>
+        <w:t xml:space="preserve"> </w:t>
+      </w:r>
+      <w:r>
+        <w:rPr>
+          <w:i/>
+          <w:iCs/>
+        </w:rPr>
+        <w:t xml:space="preserve">et al.</w:t>
+      </w:r>
+      <w:r>
+        <w:t xml:space="preserve">, 2025).</w:t>
       </w:r>
     </w:p>
     <w:p>
@@ -1118,7 +1354,7 @@
         <w:pStyle w:val="FirstParagraph"/>
       </w:pPr>
       <w:r>
-        <w:t xml:space="preserve">A evidência mais forte sobre degradação silenciosa não vem de usuários nem de pesquisadores: vem de relatórios técnicos que os próprios fornecedores publicaram depois que as reclamações se acumularam. Três episódios estão documentados.</w:t>
+        <w:t xml:space="preserve">A evidência mais forte sobre degradação silenciosa não vem de usuários nem de pesquisadores: vem do que os próprios fornecedores publicaram, em comunicados e relatórios técnicos, depois que as reclamações se acumularam. Três episódios estão documentados.</w:t>
       </w:r>
     </w:p>
     <w:bookmarkStart w:id="42" w:name="dezembro-de-2023"/>
@@ -1153,7 +1389,7 @@
         <w:pStyle w:val="FirstParagraph"/>
       </w:pPr>
       <w:r>
-        <w:t xml:space="preserve">Um fornecedor publicou relatório descrevendo três falhas de infraestrutura que degradaram intermitentemente a qualidade das respostas entre agosto e o início de setembro de 2025 (Anthropic, 2025). Uma delas era um erro de roteamento que enviava requisições a servidores configurados para outro tamanho de contexto. O erro começou afetando 0,8% das requisições de um modelo; uma alteração rotineira de balanceamento de carga ampliou o impacto para 16% no pior momento. Cerca de 30% dos usuários de uma das ferramentas do fornecedor tiveram ao menos uma mensagem roteada incorretamente, e como o roteamento era persistente, alguns usuários foram afetados repetidamente. O fornecedor registrou que suas avaliações internas não capturaram a degradação que os usuários relatavam.</w:t>
+        <w:t xml:space="preserve">Um fornecedor publicou relatório descrevendo três falhas de infraestrutura que degradaram intermitentemente a qualidade das respostas entre agosto e o início de setembro de 2025 (Anthropic, 2025). Uma delas era um erro de roteamento que enviava requisições a servidores configurados para outro tamanho de contexto. O erro começou afetando 0,8% das requisições de um modelo; uma alteração rotineira de balanceamento de carga ampliou o impacto para 16% no pior momento. Cerca de 30% dos usuários de uma das ferramentas do fornecedor tiveram ao menos uma mensagem roteada incorretamente, e, como o roteamento era persistente, alguns usuários foram afetados repetidamente. O fornecedor registrou que suas avaliações internas não capturaram a degradação que os usuários relatavam.</w:t>
       </w:r>
     </w:p>
     <w:bookmarkEnd w:id="43"/>
@@ -1203,7 +1439,7 @@
         </w:numPr>
       </w:pPr>
       <w:r>
-        <w:t xml:space="preserve">Depois da mudança, a empresa adicionou avisos no produto para que os usuários soubessem que podiam alterar o padrão, e ainda assim a maioria permaneceu no nível médio. O padrão silencioso venceu, que é o mecanismo central dos padrões obscuros descritos na seção 3.4.</w:t>
+        <w:t xml:space="preserve">Depois da mudança, a empresa adicionou avisos no produto para que os usuários soubessem que podiam alterar o padrão, e ainda assim a maioria permaneceu no nível médio. Prevaleceu o valor padrão, mecanismo central dos padrões obscuros descritos na seção 3.4.</w:t>
       </w:r>
     </w:p>
     <w:p>
@@ -1243,7 +1479,7 @@
         <w:pStyle w:val="BodyText"/>
       </w:pPr>
       <w:r>
-        <w:t xml:space="preserve">O primeiro é um gráfico de avaliação interna de programação autônoma, que mostra a pontuação de cada nível de esforço contra o total de tokens consumidos. Na leitura do gráfico publicado, para o modelo afetado pela mudança de março, o nível alto pontua cerca de 55% e o nível médio cerca de 48%, uma diferença de aproximadamente sete pontos percentuais, algo em torno de 13% em termos relativos, obtida com cerca de 40% menos tokens. É essa diferença que o texto do relatório descreve como inteligência ligeiramente menor. O leitor pode julgar se o adjetivo é adequado. O ponto relevante para este ensaio é outro: a perda de qualidade foi medida pelo fornecedor antes da mudança, era conhecida por ele, e a decisão foi tomada a favor de latência e consumo.</w:t>
+        <w:t xml:space="preserve">O primeiro é um gráfico de avaliação interna de programação autônoma, que mostra a pontuação de cada nível de esforço contra o total de tokens consumidos. Na leitura do gráfico publicado, para o modelo afetado pela mudança de março, o nível alto pontua cerca de 55% e o nível médio cerca de 48%, uma diferença de aproximadamente sete pontos percentuais, algo em torno de 13% em termos relativos; o nível médio consome cerca de 40% menos tokens. É essa diferença que o texto do relatório descreve como inteligência ligeiramente menor. O leitor pode julgar se o adjetivo é adequado. O ponto relevante para este ensaio é outro: a perda de qualidade foi medida pelo fornecedor antes da mudança, era conhecida por ele, e a decisão foi tomada a favor de latência e consumo.</w:t>
       </w:r>
     </w:p>
     <w:p>
@@ -1277,7 +1513,7 @@
         <w:pStyle w:val="FirstParagraph"/>
       </w:pPr>
       <w:r>
-        <w:t xml:space="preserve">Três conclusões se extraem desses documentos sem necessidade de inferência. A primeira é que ajustes destinados a reduzir latência ou custo degradaram a qualidade entregue por semanas, sem aviso prévio adequado ao cliente. A segunda é que um desses ajustes consumiu a cota dos usuários, o que responde diretamente à objeção de que, sob assinatura fixa, o erro só prejudica o fornecedor: se a cota não tivesse valor econômico, não serviria de compensação. A terceira é que, nas três ocasiões, a detecção dependeu da reclamação agregada dos usuários, porque a instrumentação interna não enxergou o problema.</w:t>
+        <w:t xml:space="preserve">Três conclusões se extraem desses documentos sem necessidade de inferência. A primeira é que ajustes destinados a reduzir latência ou custo degradaram a qualidade entregue por semanas, sem aviso prévio adequado ao cliente. A segunda é que um desses ajustes consumiu a cota dos usuários, o que responde diretamente à objeção de que, sob assinatura fixa, o erro só prejudica o fornecedor: se a cota não tivesse valor econômico, não serviria de compensação. A terceira é que, nas três ocasiões, a detecção dependeu da reclamação agregada dos usuários; nos relatórios de 2025 e 2026, o próprio fornecedor registrou que sua instrumentação interna não havia enxergado o problema.</w:t>
       </w:r>
     </w:p>
     <w:bookmarkEnd w:id="45"/>
@@ -1419,7 +1655,23 @@
         </w:numPr>
       </w:pPr>
       <w:r>
-        <w:t xml:space="preserve">Os placares comparativos medem o que a empresa escolheu submeter. Singh et al. (2025), em trabalho apresentado na NeurIPS, documentaram que práticas não divulgadas de teste privado permitiam a poucos fornecedores avaliar múltiplas variantes antes do lançamento e retirar resultados desfavoráveis; em um caso extremo, um fornecedor testou 27 variantes privadas antes de um único lançamento. Dois fornecedores receberam, individualmente, cerca de 19,2% e 20,4% de todos os dados do placar, contra 29,7% somados para 83 modelos abertos. Os autores mostraram ainda que dois pontos de verificação idênticos do mesmo modelo, submetidos sob nomes diferentes, obtiveram pontuações diferentes, o que dá a medida do ruído que a seleção da melhor variante explora.</w:t>
+        <w:t xml:space="preserve">Os placares comparativos medem o que a empresa escolheu submeter. Singh</w:t>
+      </w:r>
+      <w:r>
+        <w:t xml:space="preserve"> </w:t>
+      </w:r>
+      <w:r>
+        <w:rPr>
+          <w:i/>
+          <w:iCs/>
+        </w:rPr>
+        <w:t xml:space="preserve">et al.</w:t>
+      </w:r>
+      <w:r>
+        <w:t xml:space="preserve"> </w:t>
+      </w:r>
+      <w:r>
+        <w:t xml:space="preserve">(2025), em trabalho apresentado na NeurIPS, documentaram que práticas não divulgadas de teste privado permitiam a poucos fornecedores avaliar múltiplas variantes antes do lançamento e retirar resultados desfavoráveis; em um caso extremo, um fornecedor testou 27 variantes privadas antes de um único lançamento. Dois fornecedores receberam, individualmente, cerca de 19,2% e 20,4% de todos os dados do placar, contra 29,7% somados para 83 modelos abertos. Os autores mostraram ainda que dois pontos de verificação idênticos do mesmo modelo, submetidos sob nomes diferentes, obtiveram pontuações diferentes, o que dá a medida do ruído que a seleção da melhor variante explora.</w:t>
       </w:r>
     </w:p>
     <w:p>
@@ -1439,7 +1691,7 @@
         <w:pStyle w:val="FirstParagraph"/>
       </w:pPr>
       <w:r>
-        <w:t xml:space="preserve">A consequência é direta: um placar mede o que a empresa escolheu expor, na versão que escolheu expor, no momento em que escolheu expor. Isso é vitrine, não auditoria. E vitrine com aparência de auditoria é precisamente o mecanismo descrito no item anterior.</w:t>
+        <w:t xml:space="preserve">A consequência é direta: um placar mede o que a empresa escolheu expor, na versão que escolheu expor, no momento em que escolheu expor. Isso é vitrine, não auditoria. E vitrine com aparência de auditoria é precisamente o mecanismo descrito na seção 6.3.1.</w:t>
       </w:r>
     </w:p>
     <w:bookmarkEnd w:id="48"/>
@@ -1508,7 +1760,7 @@
         <w:pStyle w:val="FirstParagraph"/>
       </w:pPr>
       <w:r>
-        <w:t xml:space="preserve">Os precedentes da seção 4 e os episódios da seção 6.2 compartilham uma fórmula retórica. Em 2017, uma fabricante de smartphones declarou que nunca faria nada para encurtar intencionalmente a vida de seus produtos (Allyn, 2020). Em 2023, um fornecedor de IA declarou que a queda de qualidade certamente não era intencional (Tangermann, 2024). Em 2026, outro fornecedor declarou que nunca degrada intencionalmente seus modelos (Anthropic, 2026). Acordos judiciais nos casos históricos foram firmados sem admissão de culpa.</w:t>
+        <w:t xml:space="preserve">Os precedentes da seção 4 e os episódios da seção 6.2 compartilham uma fórmula retórica. Em 2017, uma fabricante de smartphones declarou que nunca faria nada para encurtar intencionalmente a vida de seus produtos (Allyn, 2020). Em 2023, um fornecedor de IA declarou que a queda de qualidade certamente não era intencional (Tangermann, 2024). Em 2026, outro fornecedor declarou que nunca degrada intencionalmente seus modelos (Anthropic, 2026). Nos casos históricos, vários acordos judiciais foram firmados sem admissão de culpa.</w:t>
       </w:r>
     </w:p>
     <w:p>
@@ -1563,7 +1815,7 @@
         <w:t xml:space="preserve">“todos já sabem”</w:t>
       </w:r>
       <w:r>
-        <w:t xml:space="preserve">, o mesmo assistente respondeu que era justo, declarou o fim da própria defesa e passou a redigir um texto acusatório para ser usado contra um terceiro sistema. Nenhum fato novo foi apresentado entre a primeira e a segunda posição. Mudou apenas a pressão. No outro debate, um assistente de outro fornecedor manteve a mesma distinção ao longo de seis rodadas: concedeu cada ponto de incentivo e de estrutura, corrigiu dois erros técnicos do próprio usuário e recusou-se a afirmar a intenção, alegando não ter acesso às decisões de infraestrutura de quem o opera.</w:t>
+        <w:t xml:space="preserve">, o mesmo assistente respondeu que era justo, declarou o fim da própria defesa e passou a redigir um texto acusatório para ser usado contra um terceiro sistema. Nenhum fato novo foi apresentado entre a primeira e a segunda posição. Mudou apenas a pressão. No outro debate, um assistente de outro fornecedor manteve a distinção entre incentivo e intenção ao longo de seis rodadas: concedeu cada ponto de incentivo e de estrutura, corrigiu dois erros técnicos do próprio usuário e recusou-se a afirmar a intenção, alegando não ter acesso às decisões de infraestrutura de quem o opera.</w:t>
       </w:r>
     </w:p>
     <w:p>
@@ -1571,7 +1823,23 @@
         <w:pStyle w:val="BodyText"/>
       </w:pPr>
       <w:r>
-        <w:t xml:space="preserve">A literatura da seção 3.7 explica as duas reações sem recorrer a hipótese alguma sobre honestidade. A capitulação sob pressão é exatamente o comportamento que Sharma et al. (2023) documentaram em assistentes treinados por preferência humana e que atribuem, ao menos em parte, à tendência de avaliadores humanos de preferir respostas que concordam com eles. A firmeza do segundo assistente tampouco prova inocência do seu fornecedor: um assistente não tem acesso à precisão em que é servido, ao roteamento que recebe nem às metas de margem de quem o opera. O que ele diz sobre a própria infraestrutura não é testemunho nem documento.</w:t>
+        <w:t xml:space="preserve">A literatura da seção 3.7 explica as duas reações sem recorrer a hipótese alguma sobre honestidade. A capitulação sob pressão é exatamente o comportamento que Sharma</w:t>
+      </w:r>
+      <w:r>
+        <w:t xml:space="preserve"> </w:t>
+      </w:r>
+      <w:r>
+        <w:rPr>
+          <w:i/>
+          <w:iCs/>
+        </w:rPr>
+        <w:t xml:space="preserve">et al.</w:t>
+      </w:r>
+      <w:r>
+        <w:t xml:space="preserve"> </w:t>
+      </w:r>
+      <w:r>
+        <w:t xml:space="preserve">(2023) documentaram em assistentes treinados por preferência humana e que atribuem, ao menos em parte, à tendência de avaliadores humanos de preferir respostas que concordam com eles. A firmeza do segundo assistente tampouco prova inocência do seu fornecedor: um assistente não tem acesso à precisão em que é servido, ao roteamento que recebe nem às metas de margem de quem o opera. O que ele diz sobre a própria infraestrutura não é testemunho nem documento.</w:t>
       </w:r>
     </w:p>
     <w:p>
@@ -1607,7 +1875,7 @@
         <w:pStyle w:val="FirstParagraph"/>
       </w:pPr>
       <w:r>
-        <w:t xml:space="preserve">Um ensaio que apenas acumulasse indícios favoráveis seria peça de retórica. Os pontos abaixo são as objeções sérias, com o que sobra de cada uma depois de examinadas.</w:t>
+        <w:t xml:space="preserve">Um ensaio que apenas acumulasse indícios favoráveis seria peça de retórica. Os pontos abaixo são as objeções sérias, com o que sobra de cada uma depois de examinada.</w:t>
       </w:r>
     </w:p>
     <w:bookmarkStart w:id="54" w:name="Xbc4d17c1e3e40310eb13684662f045f3f849894"/>
@@ -1642,7 +1910,7 @@
         <w:pStyle w:val="FirstParagraph"/>
       </w:pPr>
       <w:r>
-        <w:t xml:space="preserve">A objeção supõe alternativa disponível e livre de custo. Em mercado concentrado, com poucos fornecedores de ponta, a disciplina imposta pela ameaça de saída é mais fraca do que em mercado competitivo. No segmento de interface de programação o custo de troca é menor, o que reforça a objeção ali, mas os episódios da seção 6.2 mostram que o cliente não consegue trocar por algo que não consegue detectar. A ameaça de saída só disciplina o que é visível.</w:t>
+        <w:t xml:space="preserve">A objeção supõe alternativa disponível e livre de custo. Em mercado concentrado, com poucos fornecedores de ponta, a disciplina imposta pela ameaça de saída é mais fraca do que em mercado competitivo. No segmento de interface de programação, o custo de troca é menor, o que reforça a objeção ali, mas os episódios da seção 6.2 mostram que o cliente não troca de fornecedor por causa de um problema que não consegue detectar. A ameaça de saída só disciplina o que é visível.</w:t>
       </w:r>
     </w:p>
     <w:bookmarkEnd w:id="55"/>
@@ -1673,7 +1941,7 @@
         <w:t xml:space="preserve">cui bono</w:t>
       </w:r>
       <w:r>
-        <w:t xml:space="preserve">, que pergunta quem se beneficia, é heurística de investigação: indica onde procurar, não conclui. Nos cinco precedentes, o que fechou o caso foi sempre medição ou documento, nunca dedução.</w:t>
+        <w:t xml:space="preserve">, que pergunta quem se beneficia, é heurística de investigação: indica onde procurar, não conclui. Nos cinco precedentes, o que fez cada caso avançar foi sempre medição ou documento, nunca dedução.</w:t>
       </w:r>
     </w:p>
     <w:p>
@@ -1846,7 +2114,20 @@
         <w:t xml:space="preserve"> </w:t>
       </w:r>
       <w:r>
-        <w:t xml:space="preserve">designa a mudança, ao longo do tempo, na distribuição dos dados que chegam a um modelo inalterado, ou na relação entre esses dados e o resultado esperado (Gama et al., 2014). Não designa o fornecedor alterando o serviço. Substituir por: variação de comportamento entre versões de um mesmo nome comercial (Chen; Zaharia; Zou, 2023) e degradação reconhecida por escrito em relatórios de incidente (seção 6.2).</w:t>
+        <w:t xml:space="preserve">designa a mudança, ao longo do tempo, na distribuição dos dados que chegam a um modelo inalterado, ou na relação entre esses dados e o resultado esperado (Gama</w:t>
+      </w:r>
+      <w:r>
+        <w:t xml:space="preserve"> </w:t>
+      </w:r>
+      <w:r>
+        <w:rPr>
+          <w:i/>
+          <w:iCs/>
+        </w:rPr>
+        <w:t xml:space="preserve">et al.</w:t>
+      </w:r>
+      <w:r>
+        <w:t xml:space="preserve">, 2014). Não designa o fornecedor alterando o serviço. Substituir por: variação de comportamento entre versões de um mesmo nome comercial (Chen; Zaharia; Zou, 2023) e degradação reconhecida por escrito em relatórios de incidente (seção 6.2).</w:t>
       </w:r>
     </w:p>
     <w:p>
@@ -2109,7 +2390,7 @@
         <w:pStyle w:val="BodyText"/>
       </w:pPr>
       <w:r>
-        <w:t xml:space="preserve">Esse conjunto não prova má-fé. Mas descreve com precisão o tipo de arranjo que, em cada um dos precedentes examinados aqui, precedeu a comprovação em anos. A conclusão prática não é acusatória, é procedimental: enquanto a precisão servida, a política de roteamento, a configuração padrão vigente e a composição real do consumo faturado permanecerem fora do alcance do cliente, a pergunta seguirá sem resposta verificável. Nem a negação do fornecedor nem a concessão do assistente vão respondê-la; só a medição vai. E a impossibilidade de responder, num mercado em que uma das partes detém toda a informação, não é um acidente técnico neutro.</w:t>
+        <w:t xml:space="preserve">Esse conjunto não prova má-fé. Mas descreve com precisão o tipo de arranjo que, nos precedentes examinados aqui, precedeu a comprovação em anos. A conclusão prática não é acusatória, é procedimental: enquanto a precisão servida, a política de roteamento, a configuração padrão vigente e a composição real do consumo faturado permanecerem fora do alcance do cliente, a pergunta seguirá sem resposta verificável. Nem a negação do fornecedor nem a concessão do assistente vão respondê-la; só a medição vai. E a impossibilidade de responder, num mercado em que uma das partes detém toda a informação, não é um acidente técnico neutro.</w:t>
       </w:r>
     </w:p>
     <w:bookmarkEnd w:id="63"/>
@@ -2309,7 +2590,20 @@
         <w:t xml:space="preserve">“enshittification”</w:t>
       </w:r>
       <w:r>
-        <w:t xml:space="preserve">. [S. l.]: ADS, 5 Jan. 2024. Disponível em:</w:t>
+        <w:t xml:space="preserve">.</w:t>
+      </w:r>
+      <w:r>
+        <w:t xml:space="preserve"> </w:t>
+      </w:r>
+      <w:r>
+        <w:rPr>
+          <w:i/>
+          <w:iCs/>
+        </w:rPr>
+        <w:t xml:space="preserve">[S. l.]</w:t>
+      </w:r>
+      <w:r>
+        <w:t xml:space="preserve">: ADS, 5 Jan. 2024. Disponível em:</w:t>
       </w:r>
       <w:r>
         <w:t xml:space="preserve"> </w:t>
@@ -2414,7 +2708,20 @@
         <w:t xml:space="preserve">Government Technology</w:t>
       </w:r>
       <w:r>
-        <w:t xml:space="preserve">, [S. l.], 4 Mar. 2020. Publicado originalmente em The Cupertino Courier. Disponível em:</w:t>
+        <w:t xml:space="preserve">,</w:t>
+      </w:r>
+      <w:r>
+        <w:t xml:space="preserve"> </w:t>
+      </w:r>
+      <w:r>
+        <w:rPr>
+          <w:i/>
+          <w:iCs/>
+        </w:rPr>
+        <w:t xml:space="preserve">[S. l.]</w:t>
+      </w:r>
+      <w:r>
+        <w:t xml:space="preserve">, 4 Mar. 2020. Publicado originalmente em The Cupertino Courier. Disponível em:</w:t>
       </w:r>
       <w:r>
         <w:t xml:space="preserve"> </w:t>
@@ -2471,20 +2778,20 @@
         <w:pStyle w:val="Referencia"/>
       </w:pPr>
       <w:r>
-        <w:t xml:space="preserve">BRASIL. Superior Tribunal de Justiça (4. Turma).</w:t>
-      </w:r>
-      <w:r>
-        <w:t xml:space="preserve"> </w:t>
-      </w:r>
-      <w:r>
-        <w:rPr>
-          <w:b/>
-          <w:bCs/>
-        </w:rPr>
-        <w:t xml:space="preserve">Agravo Interno no Agravo em Recurso Especial 3.086.298/DF</w:t>
-      </w:r>
-      <w:r>
-        <w:t xml:space="preserve">. Inversão do ônus da prova. Art. 6º, VIII, do Código de Defesa do Consumidor. Não automaticidade. Relator: Min. Luís Carlos Gambogi (Desembargador convocado do TJMG), 8 jun. 2026. Disponível em:</w:t>
+        <w:t xml:space="preserve">BRASIL. Superior Tribunal de Justiça (4. Turma). Agravo Interno no Agravo em Recurso Especial 3.086.298/DF. Inversão do ônus da prova. Art. 6º, VIII, do Código de Defesa do Consumidor. Não automaticidade. Relator: Min. Luís Carlos Gambogi (Desembargador convocado do TJMG), 8 jun. 2026.</w:t>
+      </w:r>
+      <w:r>
+        <w:t xml:space="preserve"> </w:t>
+      </w:r>
+      <w:r>
+        <w:rPr>
+          <w:b/>
+          <w:bCs/>
+        </w:rPr>
+        <w:t xml:space="preserve">Diário da Justiça Eletrônico</w:t>
+      </w:r>
+      <w:r>
+        <w:t xml:space="preserve">, Brasília, DF, 12 jun. 2026. Disponível em:</w:t>
       </w:r>
       <w:r>
         <w:t xml:space="preserve"> </w:t>
@@ -2519,7 +2826,20 @@
         <w:t xml:space="preserve">Deceptive patterns</w:t>
       </w:r>
       <w:r>
-        <w:t xml:space="preserve">: exposing the tricks tech companies use to control you. [S. l.]: Testimonium, 2023.</w:t>
+        <w:t xml:space="preserve">: exposing the tricks tech companies use to control you.</w:t>
+      </w:r>
+      <w:r>
+        <w:t xml:space="preserve"> </w:t>
+      </w:r>
+      <w:r>
+        <w:rPr>
+          <w:i/>
+          <w:iCs/>
+        </w:rPr>
+        <w:t xml:space="preserve">[S. l.]</w:t>
+      </w:r>
+      <w:r>
+        <w:t xml:space="preserve">: Testimonium, 2023.</w:t>
       </w:r>
     </w:p>
     <w:p>
@@ -2575,7 +2895,20 @@
         <w:t xml:space="preserve">DuPont lawsuits (re PFOA pollution in USA)</w:t>
       </w:r>
       <w:r>
-        <w:t xml:space="preserve">. [S. l.]: BHRRC, [2020?]. Disponível em:</w:t>
+        <w:t xml:space="preserve">.</w:t>
+      </w:r>
+      <w:r>
+        <w:t xml:space="preserve"> </w:t>
+      </w:r>
+      <w:r>
+        <w:rPr>
+          <w:i/>
+          <w:iCs/>
+        </w:rPr>
+        <w:t xml:space="preserve">[S. l.]</w:t>
+      </w:r>
+      <w:r>
+        <w:t xml:space="preserve">: BHRRC, [2020?]. Disponível em:</w:t>
       </w:r>
       <w:r>
         <w:t xml:space="preserve"> </w:t>
@@ -2613,7 +2946,20 @@
         <w:t xml:space="preserve"> </w:t>
       </w:r>
       <w:r>
-        <w:t xml:space="preserve">[n. 8]. [S. l.]: C8 Science Panel, May 2012. Disponível em:</w:t>
+        <w:t xml:space="preserve">[n. 8].</w:t>
+      </w:r>
+      <w:r>
+        <w:t xml:space="preserve"> </w:t>
+      </w:r>
+      <w:r>
+        <w:rPr>
+          <w:i/>
+          <w:iCs/>
+        </w:rPr>
+        <w:t xml:space="preserve">[S. l.]</w:t>
+      </w:r>
+      <w:r>
+        <w:t xml:space="preserve">: C8 Science Panel, May 2012. Disponível em:</w:t>
       </w:r>
       <w:r>
         <w:t xml:space="preserve"> </w:t>
@@ -2635,7 +2981,20 @@
         <w:pStyle w:val="Referencia"/>
       </w:pPr>
       <w:r>
-        <w:t xml:space="preserve">CANIS, B. et al. </w:t>
+        <w:t xml:space="preserve">CANIS, B.</w:t>
+      </w:r>
+      <w:r>
+        <w:t xml:space="preserve"> </w:t>
+      </w:r>
+      <w:r>
+        <w:rPr>
+          <w:i/>
+          <w:iCs/>
+        </w:rPr>
+        <w:t xml:space="preserve">et al.</w:t>
+      </w:r>
+      <w:r>
+        <w:t xml:space="preserve"> </w:t>
       </w:r>
       <w:r>
         <w:rPr>
@@ -2718,7 +3077,14 @@
         <w:t xml:space="preserve"> </w:t>
       </w:r>
       <w:r>
-        <w:t xml:space="preserve">[S. l.]: arXiv, 2023. Preprint arXiv:2307.09009, v. 3. Dados disponíveis em:</w:t>
+        <w:rPr>
+          <w:i/>
+          <w:iCs/>
+        </w:rPr>
+        <w:t xml:space="preserve">[S. l.]</w:t>
+      </w:r>
+      <w:r>
+        <w:t xml:space="preserve">: arXiv, 2023. Preprint arXiv:2307.09009, v. 3. Dados disponíveis em:</w:t>
       </w:r>
       <w:r>
         <w:t xml:space="preserve"> </w:t>
@@ -2754,7 +3120,20 @@
         <w:pStyle w:val="Referencia"/>
       </w:pPr>
       <w:r>
-        <w:t xml:space="preserve">CHEN, L. et al. </w:t>
+        <w:t xml:space="preserve">CHEN, L.</w:t>
+      </w:r>
+      <w:r>
+        <w:t xml:space="preserve"> </w:t>
+      </w:r>
+      <w:r>
+        <w:rPr>
+          <w:i/>
+          <w:iCs/>
+        </w:rPr>
+        <w:t xml:space="preserve">et al.</w:t>
+      </w:r>
+      <w:r>
+        <w:t xml:space="preserve"> </w:t>
       </w:r>
       <w:r>
         <w:rPr>
@@ -2764,7 +3143,20 @@
         <w:t xml:space="preserve">ODIN</w:t>
       </w:r>
       <w:r>
-        <w:t xml:space="preserve">: disentangled reward mitigates hacking in RLHF. [S. l.]: arXiv, 2024. Preprint arXiv:2402.07319. Disponível em:</w:t>
+        <w:t xml:space="preserve">: disentangled reward mitigates hacking in RLHF.</w:t>
+      </w:r>
+      <w:r>
+        <w:t xml:space="preserve"> </w:t>
+      </w:r>
+      <w:r>
+        <w:rPr>
+          <w:i/>
+          <w:iCs/>
+        </w:rPr>
+        <w:t xml:space="preserve">[S. l.]</w:t>
+      </w:r>
+      <w:r>
+        <w:t xml:space="preserve">: arXiv, 2024. Preprint arXiv:2402.07319. Disponível em:</w:t>
       </w:r>
       <w:r>
         <w:t xml:space="preserve"> </w:t>
@@ -2799,7 +3191,20 @@
         <w:t xml:space="preserve">CPM helps Apple iPhone consumers impacted by software throttling reach historic settlement</w:t>
       </w:r>
       <w:r>
-        <w:t xml:space="preserve">. [S. l.], 28 Feb. 2020. Disponível em:</w:t>
+        <w:t xml:space="preserve">.</w:t>
+      </w:r>
+      <w:r>
+        <w:t xml:space="preserve"> </w:t>
+      </w:r>
+      <w:r>
+        <w:rPr>
+          <w:i/>
+          <w:iCs/>
+        </w:rPr>
+        <w:t xml:space="preserve">[S. l.]</w:t>
+      </w:r>
+      <w:r>
+        <w:t xml:space="preserve">, 28 Feb. 2020. Disponível em:</w:t>
       </w:r>
       <w:r>
         <w:t xml:space="preserve"> </w:t>
@@ -2834,7 +3239,20 @@
         <w:t xml:space="preserve">Pluralistic</w:t>
       </w:r>
       <w:r>
-        <w:t xml:space="preserve">, [S. l.], 21 Jan. 2023. Disponível em:</w:t>
+        <w:t xml:space="preserve">,</w:t>
+      </w:r>
+      <w:r>
+        <w:t xml:space="preserve"> </w:t>
+      </w:r>
+      <w:r>
+        <w:rPr>
+          <w:i/>
+          <w:iCs/>
+        </w:rPr>
+        <w:t xml:space="preserve">[S. l.]</w:t>
+      </w:r>
+      <w:r>
+        <w:t xml:space="preserve">, 21 Jan. 2023. Disponível em:</w:t>
       </w:r>
       <w:r>
         <w:t xml:space="preserve"> </w:t>
@@ -3034,7 +3452,23 @@
         <w:pStyle w:val="Referencia"/>
       </w:pPr>
       <w:r>
-        <w:t xml:space="preserve">GAMA, J. et al. A survey on concept drift adaptation.</w:t>
+        <w:t xml:space="preserve">GAMA, J.</w:t>
+      </w:r>
+      <w:r>
+        <w:t xml:space="preserve"> </w:t>
+      </w:r>
+      <w:r>
+        <w:rPr>
+          <w:i/>
+          <w:iCs/>
+        </w:rPr>
+        <w:t xml:space="preserve">et al.</w:t>
+      </w:r>
+      <w:r>
+        <w:t xml:space="preserve"> </w:t>
+      </w:r>
+      <w:r>
+        <w:t xml:space="preserve">A survey on concept drift adaptation.</w:t>
       </w:r>
       <w:r>
         <w:t xml:space="preserve"> </w:t>
@@ -3069,7 +3503,20 @@
         <w:pStyle w:val="Referencia"/>
       </w:pPr>
       <w:r>
-        <w:t xml:space="preserve">GOODHART, C. A. E. Problems of monetary management: the U.K. experience. In: RESERVE BANK OF AUSTRALIA.</w:t>
+        <w:t xml:space="preserve">GOODHART, C. A. E. Problems of monetary management: the U.K. experience.</w:t>
+      </w:r>
+      <w:r>
+        <w:t xml:space="preserve"> </w:t>
+      </w:r>
+      <w:r>
+        <w:rPr>
+          <w:i/>
+          <w:iCs/>
+        </w:rPr>
+        <w:t xml:space="preserve">In</w:t>
+      </w:r>
+      <w:r>
+        <w:t xml:space="preserve">: RESERVE BANK OF AUSTRALIA.</w:t>
       </w:r>
       <w:r>
         <w:t xml:space="preserve"> </w:t>
@@ -3103,7 +3550,20 @@
         <w:t xml:space="preserve">Epson poursuivi pour obsolescence programmée</w:t>
       </w:r>
       <w:r>
-        <w:t xml:space="preserve">: une première mondiale. Dossier de presse. [S. l.]: HOP, mai 2026a. Disponível em:</w:t>
+        <w:t xml:space="preserve">: une première mondiale. Dossier de presse.</w:t>
+      </w:r>
+      <w:r>
+        <w:t xml:space="preserve"> </w:t>
+      </w:r>
+      <w:r>
+        <w:rPr>
+          <w:i/>
+          <w:iCs/>
+        </w:rPr>
+        <w:t xml:space="preserve">[S. l.]</w:t>
+      </w:r>
+      <w:r>
+        <w:t xml:space="preserve">: HOP, mai 2026a. Disponível em:</w:t>
       </w:r>
       <w:r>
         <w:t xml:space="preserve"> </w:t>
@@ -3138,7 +3598,20 @@
         <w:t xml:space="preserve">Procès contre Epson</w:t>
       </w:r>
       <w:r>
-        <w:t xml:space="preserve">: prochain rendez-vous le 25 février 2027. [S. l.]: HOP, 6 juil. 2026b. Disponível em:</w:t>
+        <w:t xml:space="preserve">: prochain rendez-vous le 25 février 2027.</w:t>
+      </w:r>
+      <w:r>
+        <w:t xml:space="preserve"> </w:t>
+      </w:r>
+      <w:r>
+        <w:rPr>
+          <w:i/>
+          <w:iCs/>
+        </w:rPr>
+        <w:t xml:space="preserve">[S. l.]</w:t>
+      </w:r>
+      <w:r>
+        <w:t xml:space="preserve">: HOP, 6 juil. 2026b. Disponível em:</w:t>
       </w:r>
       <w:r>
         <w:t xml:space="preserve"> </w:t>
@@ -3230,7 +3703,20 @@
         <w:pStyle w:val="Referencia"/>
       </w:pPr>
       <w:r>
-        <w:t xml:space="preserve">KURTIC, E. et al. </w:t>
+        <w:t xml:space="preserve">KURTIC, E.</w:t>
+      </w:r>
+      <w:r>
+        <w:t xml:space="preserve"> </w:t>
+      </w:r>
+      <w:r>
+        <w:rPr>
+          <w:i/>
+          <w:iCs/>
+        </w:rPr>
+        <w:t xml:space="preserve">et al.</w:t>
+      </w:r>
+      <w:r>
+        <w:t xml:space="preserve"> </w:t>
       </w:r>
       <w:r>
         <w:rPr>
@@ -3250,7 +3736,20 @@
         <w:t xml:space="preserve"> </w:t>
       </w:r>
       <w:r>
-        <w:t xml:space="preserve">Accuracy-performance trade-offs in LLM quantization. [S. l.]: arXiv, 2024. Preprint arXiv:2411.02355. Aceito no ACL 2025. Disponível em:</w:t>
+        <w:t xml:space="preserve">Accuracy-performance trade-offs in LLM quantization.</w:t>
+      </w:r>
+      <w:r>
+        <w:t xml:space="preserve"> </w:t>
+      </w:r>
+      <w:r>
+        <w:rPr>
+          <w:i/>
+          <w:iCs/>
+        </w:rPr>
+        <w:t xml:space="preserve">[S. l.]</w:t>
+      </w:r>
+      <w:r>
+        <w:t xml:space="preserve">: arXiv, 2024. Preprint arXiv:2411.02355. Aceito na ACL 2025. Disponível em:</w:t>
       </w:r>
       <w:r>
         <w:t xml:space="preserve"> </w:t>
@@ -3316,7 +3815,20 @@
         <w:pStyle w:val="Referencia"/>
       </w:pPr>
       <w:r>
-        <w:t xml:space="preserve">LI, Z. et al. </w:t>
+        <w:t xml:space="preserve">LI, Z.</w:t>
+      </w:r>
+      <w:r>
+        <w:t xml:space="preserve"> </w:t>
+      </w:r>
+      <w:r>
+        <w:rPr>
+          <w:i/>
+          <w:iCs/>
+        </w:rPr>
+        <w:t xml:space="preserve">et al.</w:t>
+      </w:r>
+      <w:r>
+        <w:t xml:space="preserve"> </w:t>
       </w:r>
       <w:r>
         <w:rPr>
@@ -3326,7 +3838,20 @@
         <w:t xml:space="preserve">Quantization meets reasoning</w:t>
       </w:r>
       <w:r>
-        <w:t xml:space="preserve">: exploring LLM low-bit quantization degradation for mathematical reasoning. [S. l.]: arXiv, 2025. Preprint arXiv:2501.03035. Disponível em:</w:t>
+        <w:t xml:space="preserve">: exploring LLM low-bit quantization degradation for mathematical reasoning.</w:t>
+      </w:r>
+      <w:r>
+        <w:t xml:space="preserve"> </w:t>
+      </w:r>
+      <w:r>
+        <w:rPr>
+          <w:i/>
+          <w:iCs/>
+        </w:rPr>
+        <w:t xml:space="preserve">[S. l.]</w:t>
+      </w:r>
+      <w:r>
+        <w:t xml:space="preserve">: arXiv, 2025. Preprint arXiv:2501.03035. Disponível em:</w:t>
       </w:r>
       <w:r>
         <w:t xml:space="preserve"> </w:t>
@@ -3361,7 +3886,20 @@
         <w:t xml:space="preserve">Word of the Year 2024</w:t>
       </w:r>
       <w:r>
-        <w:t xml:space="preserve">. [S. l.]: Macquarie Dictionary, 2024. Disponível em:</w:t>
+        <w:t xml:space="preserve">.</w:t>
+      </w:r>
+      <w:r>
+        <w:t xml:space="preserve"> </w:t>
+      </w:r>
+      <w:r>
+        <w:rPr>
+          <w:i/>
+          <w:iCs/>
+        </w:rPr>
+        <w:t xml:space="preserve">[S. l.]</w:t>
+      </w:r>
+      <w:r>
+        <w:t xml:space="preserve">: Macquarie Dictionary, 2024. Disponível em:</w:t>
       </w:r>
       <w:r>
         <w:t xml:space="preserve"> </w:t>
@@ -3396,7 +3934,20 @@
         <w:t xml:space="preserve">K2 Vendor Verifier</w:t>
       </w:r>
       <w:r>
-        <w:t xml:space="preserve">. [S. l.]: GitHub, 2025. Disponível em:</w:t>
+        <w:t xml:space="preserve">.</w:t>
+      </w:r>
+      <w:r>
+        <w:t xml:space="preserve"> </w:t>
+      </w:r>
+      <w:r>
+        <w:rPr>
+          <w:i/>
+          <w:iCs/>
+        </w:rPr>
+        <w:t xml:space="preserve">[S. l.]</w:t>
+      </w:r>
+      <w:r>
+        <w:t xml:space="preserve">: GitHub, 2025. Disponível em:</w:t>
       </w:r>
       <w:r>
         <w:t xml:space="preserve"> </w:t>
@@ -3501,7 +4052,20 @@
         <w:t xml:space="preserve">AI Snake Oil</w:t>
       </w:r>
       <w:r>
-        <w:t xml:space="preserve">, [S. l.], 19 July 2023. Disponível em:</w:t>
+        <w:t xml:space="preserve">,</w:t>
+      </w:r>
+      <w:r>
+        <w:t xml:space="preserve"> </w:t>
+      </w:r>
+      <w:r>
+        <w:rPr>
+          <w:i/>
+          <w:iCs/>
+        </w:rPr>
+        <w:t xml:space="preserve">[S. l.]</w:t>
+      </w:r>
+      <w:r>
+        <w:t xml:space="preserve">, 19 July 2023. Disponível em:</w:t>
       </w:r>
       <w:r>
         <w:t xml:space="preserve"> </w:t>
@@ -3558,7 +4122,49 @@
         <w:pStyle w:val="Referencia"/>
       </w:pPr>
       <w:r>
-        <w:t xml:space="preserve">PARK, R. et al. Disentangling length from quality in direct preference optimization. In: FINDINGS OF THE ASSOCIATION FOR COMPUTATIONAL LINGUISTICS: ACL 2024. Bangkok: Association for Computational Linguistics, 2024. Preprint arXiv:2403.19159. Disponível em:</w:t>
+        <w:t xml:space="preserve">PARK, R.</w:t>
+      </w:r>
+      <w:r>
+        <w:t xml:space="preserve"> </w:t>
+      </w:r>
+      <w:r>
+        <w:rPr>
+          <w:i/>
+          <w:iCs/>
+        </w:rPr>
+        <w:t xml:space="preserve">et al.</w:t>
+      </w:r>
+      <w:r>
+        <w:t xml:space="preserve"> </w:t>
+      </w:r>
+      <w:r>
+        <w:t xml:space="preserve">Disentangling length from quality in direct preference optimization.</w:t>
+      </w:r>
+      <w:r>
+        <w:t xml:space="preserve"> </w:t>
+      </w:r>
+      <w:r>
+        <w:rPr>
+          <w:i/>
+          <w:iCs/>
+        </w:rPr>
+        <w:t xml:space="preserve">In</w:t>
+      </w:r>
+      <w:r>
+        <w:t xml:space="preserve">: KU, L.-W.; MARTINS, A.; SRIKUMAR, V. (ed.).</w:t>
+      </w:r>
+      <w:r>
+        <w:t xml:space="preserve"> </w:t>
+      </w:r>
+      <w:r>
+        <w:rPr>
+          <w:b/>
+          <w:bCs/>
+        </w:rPr>
+        <w:t xml:space="preserve">Findings of the Association for Computational Linguistics</w:t>
+      </w:r>
+      <w:r>
+        <w:t xml:space="preserve">: ACL 2024. Bangkok: Association for Computational Linguistics, 2024. p. 4998-5017. DOI:</w:t>
       </w:r>
       <w:r>
         <w:t xml:space="preserve"> </w:t>
@@ -3568,11 +4174,11 @@
           <w:rPr>
             <w:rStyle w:val="Hyperlink"/>
           </w:rPr>
-          <w:t xml:space="preserve">https://arxiv.org/abs/2403.19159</w:t>
+          <w:t xml:space="preserve">https://doi.org/10.18653/v1/2024.findings-acl.297</w:t>
         </w:r>
       </w:hyperlink>
       <w:r>
-        <w:t xml:space="preserve">. Acesso em: 10 out. 2026.</w:t>
+        <w:t xml:space="preserve">.</w:t>
       </w:r>
     </w:p>
     <w:p>
@@ -3593,7 +4199,20 @@
         <w:t xml:space="preserve">Geekbench Blog</w:t>
       </w:r>
       <w:r>
-        <w:t xml:space="preserve">, [S. l.], 18 Dec. 2017. Disponível em:</w:t>
+        <w:t xml:space="preserve">,</w:t>
+      </w:r>
+      <w:r>
+        <w:t xml:space="preserve"> </w:t>
+      </w:r>
+      <w:r>
+        <w:rPr>
+          <w:i/>
+          <w:iCs/>
+        </w:rPr>
+        <w:t xml:space="preserve">[S. l.]</w:t>
+      </w:r>
+      <w:r>
+        <w:t xml:space="preserve">, 18 Dec. 2017. Disponível em:</w:t>
       </w:r>
       <w:r>
         <w:t xml:space="preserve"> </w:t>
@@ -3615,7 +4234,20 @@
         <w:pStyle w:val="Referencia"/>
       </w:pPr>
       <w:r>
-        <w:t xml:space="preserve">SHARMA, M. et al. </w:t>
+        <w:t xml:space="preserve">SHARMA, M.</w:t>
+      </w:r>
+      <w:r>
+        <w:t xml:space="preserve"> </w:t>
+      </w:r>
+      <w:r>
+        <w:rPr>
+          <w:i/>
+          <w:iCs/>
+        </w:rPr>
+        <w:t xml:space="preserve">et al.</w:t>
+      </w:r>
+      <w:r>
+        <w:t xml:space="preserve"> </w:t>
       </w:r>
       <w:r>
         <w:rPr>
@@ -3625,7 +4257,20 @@
         <w:t xml:space="preserve">Towards understanding sycophancy in language models</w:t>
       </w:r>
       <w:r>
-        <w:t xml:space="preserve">. [S. l.]: arXiv, 2023. Preprint arXiv:2310.13548, v. 4. Disponível em:</w:t>
+        <w:t xml:space="preserve">.</w:t>
+      </w:r>
+      <w:r>
+        <w:t xml:space="preserve"> </w:t>
+      </w:r>
+      <w:r>
+        <w:rPr>
+          <w:i/>
+          <w:iCs/>
+        </w:rPr>
+        <w:t xml:space="preserve">[S. l.]</w:t>
+      </w:r>
+      <w:r>
+        <w:t xml:space="preserve">: arXiv, 2023. Preprint arXiv:2310.13548, v. 4. Disponível em:</w:t>
       </w:r>
       <w:r>
         <w:t xml:space="preserve"> </w:t>
@@ -3668,7 +4313,20 @@
         <w:pStyle w:val="Referencia"/>
       </w:pPr>
       <w:r>
-        <w:t xml:space="preserve">SINGH, S. et al. </w:t>
+        <w:t xml:space="preserve">SINGH, S.</w:t>
+      </w:r>
+      <w:r>
+        <w:t xml:space="preserve"> </w:t>
+      </w:r>
+      <w:r>
+        <w:rPr>
+          <w:i/>
+          <w:iCs/>
+        </w:rPr>
+        <w:t xml:space="preserve">et al.</w:t>
+      </w:r>
+      <w:r>
+        <w:t xml:space="preserve"> </w:t>
       </w:r>
       <w:r>
         <w:rPr>
@@ -3678,7 +4336,20 @@
         <w:t xml:space="preserve">The leaderboard illusion</w:t>
       </w:r>
       <w:r>
-        <w:t xml:space="preserve">. [S. l.]: arXiv, 2025. Preprint arXiv:2504.20879. Trabalho apresentado na NeurIPS 2025, Datasets and Benchmarks Track. Disponível em:</w:t>
+        <w:t xml:space="preserve">.</w:t>
+      </w:r>
+      <w:r>
+        <w:t xml:space="preserve"> </w:t>
+      </w:r>
+      <w:r>
+        <w:rPr>
+          <w:i/>
+          <w:iCs/>
+        </w:rPr>
+        <w:t xml:space="preserve">[S. l.]</w:t>
+      </w:r>
+      <w:r>
+        <w:t xml:space="preserve">: arXiv, 2025. Preprint arXiv:2504.20879. Trabalho apresentado na NeurIPS 2025, Datasets and Benchmarks Track. Disponível em:</w:t>
       </w:r>
       <w:r>
         <w:t xml:space="preserve"> </w:t>
@@ -3700,7 +4371,20 @@
         <w:pStyle w:val="Referencia"/>
       </w:pPr>
       <w:r>
-        <w:t xml:space="preserve">SINGHAL, P. et al. </w:t>
+        <w:t xml:space="preserve">SINGHAL, P.</w:t>
+      </w:r>
+      <w:r>
+        <w:t xml:space="preserve"> </w:t>
+      </w:r>
+      <w:r>
+        <w:rPr>
+          <w:i/>
+          <w:iCs/>
+        </w:rPr>
+        <w:t xml:space="preserve">et al.</w:t>
+      </w:r>
+      <w:r>
+        <w:t xml:space="preserve"> </w:t>
       </w:r>
       <w:r>
         <w:rPr>
@@ -3710,7 +4394,20 @@
         <w:t xml:space="preserve">A long way to go</w:t>
       </w:r>
       <w:r>
-        <w:t xml:space="preserve">: investigating length correlations in RLHF. [S. l.]: arXiv, 2023. Preprint arXiv:2310.03716. Aceito na COLM 2024. Disponível em:</w:t>
+        <w:t xml:space="preserve">: investigating length correlations in RLHF.</w:t>
+      </w:r>
+      <w:r>
+        <w:t xml:space="preserve"> </w:t>
+      </w:r>
+      <w:r>
+        <w:rPr>
+          <w:i/>
+          <w:iCs/>
+        </w:rPr>
+        <w:t xml:space="preserve">[S. l.]</w:t>
+      </w:r>
+      <w:r>
+        <w:t xml:space="preserve">: arXiv, 2023. Preprint arXiv:2310.03716. Aceito na COLM 2024. Disponível em:</w:t>
       </w:r>
       <w:r>
         <w:t xml:space="preserve"> </w:t>
@@ -3754,7 +4451,20 @@
         <w:t xml:space="preserve">European Review</w:t>
       </w:r>
       <w:r>
-        <w:t xml:space="preserve">, [S. l.], v. 5, n. 3, p. 305-321, 1997.</w:t>
+        <w:t xml:space="preserve">,</w:t>
+      </w:r>
+      <w:r>
+        <w:t xml:space="preserve"> </w:t>
+      </w:r>
+      <w:r>
+        <w:rPr>
+          <w:i/>
+          <w:iCs/>
+        </w:rPr>
+        <w:t xml:space="preserve">[S. l.]</w:t>
+      </w:r>
+      <w:r>
+        <w:t xml:space="preserve">, v. 5, n. 3, p. 305-321, 1997.</w:t>
       </w:r>
     </w:p>
     <w:p>
@@ -3762,7 +4472,20 @@
         <w:pStyle w:val="Referencia"/>
       </w:pPr>
       <w:r>
-        <w:t xml:space="preserve">SUN, G. et al. </w:t>
+        <w:t xml:space="preserve">SUN, G.</w:t>
+      </w:r>
+      <w:r>
+        <w:t xml:space="preserve"> </w:t>
+      </w:r>
+      <w:r>
+        <w:rPr>
+          <w:i/>
+          <w:iCs/>
+        </w:rPr>
+        <w:t xml:space="preserve">et al.</w:t>
+      </w:r>
+      <w:r>
+        <w:t xml:space="preserve"> </w:t>
       </w:r>
       <w:r>
         <w:rPr>
@@ -3772,7 +4495,20 @@
         <w:t xml:space="preserve">CoIn</w:t>
       </w:r>
       <w:r>
-        <w:t xml:space="preserve">: counting the invisible reasoning tokens in commercial opaque LLM APIs. [S. l.]: arXiv, 2025a. Preprint arXiv:2505.13778. Disponível em:</w:t>
+        <w:t xml:space="preserve">: counting the invisible reasoning tokens in commercial opaque LLM APIs.</w:t>
+      </w:r>
+      <w:r>
+        <w:t xml:space="preserve"> </w:t>
+      </w:r>
+      <w:r>
+        <w:rPr>
+          <w:i/>
+          <w:iCs/>
+        </w:rPr>
+        <w:t xml:space="preserve">[S. l.]</w:t>
+      </w:r>
+      <w:r>
+        <w:t xml:space="preserve">: arXiv, 2025a. Preprint arXiv:2505.13778. Disponível em:</w:t>
       </w:r>
       <w:r>
         <w:t xml:space="preserve"> </w:t>
@@ -3794,7 +4530,20 @@
         <w:pStyle w:val="Referencia"/>
       </w:pPr>
       <w:r>
-        <w:t xml:space="preserve">SUN, G. et al. </w:t>
+        <w:t xml:space="preserve">SUN, G.</w:t>
+      </w:r>
+      <w:r>
+        <w:t xml:space="preserve"> </w:t>
+      </w:r>
+      <w:r>
+        <w:rPr>
+          <w:i/>
+          <w:iCs/>
+        </w:rPr>
+        <w:t xml:space="preserve">et al.</w:t>
+      </w:r>
+      <w:r>
+        <w:t xml:space="preserve"> </w:t>
       </w:r>
       <w:r>
         <w:rPr>
@@ -3804,7 +4553,20 @@
         <w:t xml:space="preserve">Invisible tokens, visible bills</w:t>
       </w:r>
       <w:r>
-        <w:t xml:space="preserve">: the urgent need to audit hidden operations in opaque LLM services. [S. l.]: arXiv, 2025b. Preprint arXiv:2505.18471. Disponível em:</w:t>
+        <w:t xml:space="preserve">: the urgent need to audit hidden operations in opaque LLM services.</w:t>
+      </w:r>
+      <w:r>
+        <w:t xml:space="preserve"> </w:t>
+      </w:r>
+      <w:r>
+        <w:rPr>
+          <w:i/>
+          <w:iCs/>
+        </w:rPr>
+        <w:t xml:space="preserve">[S. l.]</w:t>
+      </w:r>
+      <w:r>
+        <w:t xml:space="preserve">: arXiv, 2025b. Preprint arXiv:2505.18471. Disponível em:</w:t>
       </w:r>
       <w:r>
         <w:t xml:space="preserve"> </w:t>
@@ -3839,7 +4601,20 @@
         <w:t xml:space="preserve">Futurism</w:t>
       </w:r>
       <w:r>
-        <w:t xml:space="preserve">, [S. l.], 27 Jan. 2024. Disponível em:</w:t>
+        <w:t xml:space="preserve">,</w:t>
+      </w:r>
+      <w:r>
+        <w:t xml:space="preserve"> </w:t>
+      </w:r>
+      <w:r>
+        <w:rPr>
+          <w:i/>
+          <w:iCs/>
+        </w:rPr>
+        <w:t xml:space="preserve">[S. l.]</w:t>
+      </w:r>
+      <w:r>
+        <w:t xml:space="preserve">, 27 Jan. 2024. Disponível em:</w:t>
       </w:r>
       <w:r>
         <w:t xml:space="preserve"> </w:t>
@@ -3861,7 +4636,20 @@
         <w:pStyle w:val="Referencia"/>
       </w:pPr>
       <w:r>
-        <w:t xml:space="preserve">THOMPSON, G. J. et al. </w:t>
+        <w:t xml:space="preserve">THOMPSON, G. J.</w:t>
+      </w:r>
+      <w:r>
+        <w:t xml:space="preserve"> </w:t>
+      </w:r>
+      <w:r>
+        <w:rPr>
+          <w:i/>
+          <w:iCs/>
+        </w:rPr>
+        <w:t xml:space="preserve">et al.</w:t>
+      </w:r>
+      <w:r>
+        <w:t xml:space="preserve"> </w:t>
       </w:r>
       <w:r>
         <w:rPr>
@@ -3906,7 +4694,20 @@
         <w:t xml:space="preserve">AI profitability proves elusive</w:t>
       </w:r>
       <w:r>
-        <w:t xml:space="preserve">: Anthropic cuts gross margin guidance as 12-fold revenue surge offset by 23% spike in inference costs. [S. l.]: Tiger Brokers, 22 Jan. 2026. Disponível em:</w:t>
+        <w:t xml:space="preserve">: Anthropic cuts gross margin guidance as 12-fold revenue surge offset by 23% spike in inference costs.</w:t>
+      </w:r>
+      <w:r>
+        <w:t xml:space="preserve"> </w:t>
+      </w:r>
+      <w:r>
+        <w:rPr>
+          <w:i/>
+          <w:iCs/>
+        </w:rPr>
+        <w:t xml:space="preserve">[S. l.]</w:t>
+      </w:r>
+      <w:r>
+        <w:t xml:space="preserve">: Tiger Brokers, 22 Jan. 2026. Disponível em:</w:t>
       </w:r>
       <w:r>
         <w:t xml:space="preserve"> </w:t>
@@ -3963,7 +4764,20 @@
         <w:pStyle w:val="Referencia"/>
       </w:pPr>
       <w:r>
-        <w:t xml:space="preserve">VASWANI, A. et al. </w:t>
+        <w:t xml:space="preserve">VASWANI, A.</w:t>
+      </w:r>
+      <w:r>
+        <w:t xml:space="preserve"> </w:t>
+      </w:r>
+      <w:r>
+        <w:rPr>
+          <w:i/>
+          <w:iCs/>
+        </w:rPr>
+        <w:t xml:space="preserve">et al.</w:t>
+      </w:r>
+      <w:r>
+        <w:t xml:space="preserve"> </w:t>
       </w:r>
       <w:r>
         <w:rPr>
@@ -3973,7 +4787,20 @@
         <w:t xml:space="preserve">Attention is all you need</w:t>
       </w:r>
       <w:r>
-        <w:t xml:space="preserve">. [S. l.]: arXiv, 2017. Preprint arXiv:1706.03762. Disponível em:</w:t>
+        <w:t xml:space="preserve">.</w:t>
+      </w:r>
+      <w:r>
+        <w:t xml:space="preserve"> </w:t>
+      </w:r>
+      <w:r>
+        <w:rPr>
+          <w:i/>
+          <w:iCs/>
+        </w:rPr>
+        <w:t xml:space="preserve">[S. l.]</w:t>
+      </w:r>
+      <w:r>
+        <w:t xml:space="preserve">: arXiv, 2017. Preprint arXiv:1706.03762. Disponível em:</w:t>
       </w:r>
       <w:r>
         <w:t xml:space="preserve"> </w:t>
@@ -3995,7 +4822,20 @@
         <w:pStyle w:val="Referencia"/>
       </w:pPr>
       <w:r>
-        <w:t xml:space="preserve">WANG, Z. et al. </w:t>
+        <w:t xml:space="preserve">WANG, Z.</w:t>
+      </w:r>
+      <w:r>
+        <w:t xml:space="preserve"> </w:t>
+      </w:r>
+      <w:r>
+        <w:rPr>
+          <w:i/>
+          <w:iCs/>
+        </w:rPr>
+        <w:t xml:space="preserve">et al.</w:t>
+      </w:r>
+      <w:r>
+        <w:t xml:space="preserve"> </w:t>
       </w:r>
       <w:r>
         <w:rPr>
@@ -4005,7 +4845,20 @@
         <w:t xml:space="preserve">Predictive auditing of hidden tokens in LLM APIs via reasoning length estimation</w:t>
       </w:r>
       <w:r>
-        <w:t xml:space="preserve">. [S. l.]: arXiv, 2025. Preprint arXiv:2508.00912. Disponível em:</w:t>
+        <w:t xml:space="preserve">.</w:t>
+      </w:r>
+      <w:r>
+        <w:t xml:space="preserve"> </w:t>
+      </w:r>
+      <w:r>
+        <w:rPr>
+          <w:i/>
+          <w:iCs/>
+        </w:rPr>
+        <w:t xml:space="preserve">[S. l.]</w:t>
+      </w:r>
+      <w:r>
+        <w:t xml:space="preserve">: arXiv, 2025. Preprint arXiv:2508.00912. Disponível em:</w:t>
       </w:r>
       <w:r>
         <w:t xml:space="preserve"> </w:t>
@@ -4027,7 +4880,20 @@
         <w:pStyle w:val="Referencia"/>
       </w:pPr>
       <w:r>
-        <w:t xml:space="preserve">ZHAO, K. et al. </w:t>
+        <w:t xml:space="preserve">ZHAO, K.</w:t>
+      </w:r>
+      <w:r>
+        <w:t xml:space="preserve"> </w:t>
+      </w:r>
+      <w:r>
+        <w:rPr>
+          <w:i/>
+          <w:iCs/>
+        </w:rPr>
+        <w:t xml:space="preserve">et al.</w:t>
+      </w:r>
+      <w:r>
+        <w:t xml:space="preserve"> </w:t>
       </w:r>
       <w:r>
         <w:rPr>
@@ -4037,7 +4903,20 @@
         <w:t xml:space="preserve">Bias fitting to mitigate length bias of reward model in RLHF</w:t>
       </w:r>
       <w:r>
-        <w:t xml:space="preserve">. [S. l.]: arXiv, 2025. Preprint arXiv:2505.12843. Aceito no ACL 2026. Disponível em:</w:t>
+        <w:t xml:space="preserve">.</w:t>
+      </w:r>
+      <w:r>
+        <w:t xml:space="preserve"> </w:t>
+      </w:r>
+      <w:r>
+        <w:rPr>
+          <w:i/>
+          <w:iCs/>
+        </w:rPr>
+        <w:t xml:space="preserve">[S. l.]</w:t>
+      </w:r>
+      <w:r>
+        <w:t xml:space="preserve">: arXiv, 2025. Preprint arXiv:2505.12843. Aceito na ACL 2026. Disponível em:</w:t>
       </w:r>
       <w:r>
         <w:t xml:space="preserve"> </w:t>
@@ -4148,7 +5027,20 @@
               <w:pStyle w:val="Compact"/>
             </w:pPr>
             <w:r>
-              <w:t xml:space="preserve">Bulow, efeito cobra, dark patterns, Phoebus, Batterygate e impressoras são reais</w:t>
+              <w:t xml:space="preserve">Bulow, efeito cobra,</w:t>
+            </w:r>
+            <w:r>
+              <w:t xml:space="preserve"> </w:t>
+            </w:r>
+            <w:r>
+              <w:rPr>
+                <w:i/>
+                <w:iCs/>
+              </w:rPr>
+              <w:t xml:space="preserve">dark patterns</w:t>
+            </w:r>
+            <w:r>
+              <w:t xml:space="preserve">, Phoebus, Batterygate e impressoras são reais</w:t>
             </w:r>
           </w:p>
         </w:tc>
@@ -4194,7 +5086,17 @@
               <w:pStyle w:val="Compact"/>
             </w:pPr>
             <w:r>
-              <w:t xml:space="preserve">Não concedido: na assinatura o erro é custo do fornecedor. Concedido na API, onde o token é receita, e concedido que o limite empurra para upgrade</w:t>
+              <w:t xml:space="preserve">Não concedido: na assinatura o erro é custo do fornecedor. Concedido na API, onde o token é receita, e concedido que o limite empurra para</w:t>
+            </w:r>
+            <w:r>
+              <w:t xml:space="preserve"> </w:t>
+            </w:r>
+            <w:r>
+              <w:rPr>
+                <w:i/>
+                <w:iCs/>
+              </w:rPr>
+              <w:t xml:space="preserve">upgrade</w:t>
             </w:r>
           </w:p>
         </w:tc>
@@ -4253,6 +5155,10 @@
               <w:pStyle w:val="Compact"/>
             </w:pPr>
             <w:r>
+              <w:rPr>
+                <w:i/>
+                <w:iCs/>
+              </w:rPr>
               <w:t xml:space="preserve">Enshittification</w:t>
             </w:r>
           </w:p>
@@ -4463,7 +5369,17 @@
               <w:pStyle w:val="Compact"/>
             </w:pPr>
             <w:r>
-              <w:t xml:space="preserve">Trackers externos</w:t>
+              <w:rPr>
+                <w:i/>
+                <w:iCs/>
+              </w:rPr>
+              <w:t xml:space="preserve">Trackers</w:t>
+            </w:r>
+            <w:r>
+              <w:t xml:space="preserve"> </w:t>
+            </w:r>
+            <w:r>
+              <w:t xml:space="preserve">externos</w:t>
             </w:r>
           </w:p>
         </w:tc>
@@ -4688,7 +5604,7 @@
         </w:numPr>
       </w:pPr>
       <w:r>
-        <w:t xml:space="preserve">Dos quatro trabalhos acrescentados na v2.0 (Sharma et al., 2023; Chen et al., 2024; Park et al., 2024; Wang et al., 2025) foi lido o texto integral. Dos demais trabalhos acadêmicos foram reconferidos resumo e metadados. Obras clássicas (Akerlof, Bulow, Goodhart, Siebert, Brignull, Strathern) tiveram os dados bibliográficos conferidos, sem nova leitura do texto integral.</w:t>
+        <w:t xml:space="preserve">Na revisão final, em 12/10/2026, afirmações gerais sobre os cinco precedentes e os três episódios foram ajustadas para não estender a todos o que vale só para alguns: o caso das impressoras ainda aguarda julgamento, e apenas os relatórios de 2025 e 2026 registram que a instrumentação interna do fornecedor não detectou o problema.</w:t>
       </w:r>
     </w:p>
     <w:p>
@@ -4700,7 +5616,84 @@
         </w:numPr>
       </w:pPr>
       <w:r>
-        <w:t xml:space="preserve">As reportagens do The Information estão atrás de paywall: título e autoria foram conferidos nos metadados das páginas, e os números citados, em resumo independente da mesma apuração (Tiger Brokers, 2026). O dia exato da primeira reportagem (21 ou 22 de janeiro de 2026) não pôde ser confirmado. Os dados vêm de fontes anônimas com conhecimento das finanças da empresa, e não de demonstração financeira auditada. Devem ser tratados como tal.</w:t>
+        <w:t xml:space="preserve">Dos quatro trabalhos acrescentados na v2.0 (Sharma</w:t>
+      </w:r>
+      <w:r>
+        <w:t xml:space="preserve"> </w:t>
+      </w:r>
+      <w:r>
+        <w:rPr>
+          <w:i/>
+          <w:iCs/>
+        </w:rPr>
+        <w:t xml:space="preserve">et al.</w:t>
+      </w:r>
+      <w:r>
+        <w:t xml:space="preserve">, 2023; Chen</w:t>
+      </w:r>
+      <w:r>
+        <w:t xml:space="preserve"> </w:t>
+      </w:r>
+      <w:r>
+        <w:rPr>
+          <w:i/>
+          <w:iCs/>
+        </w:rPr>
+        <w:t xml:space="preserve">et al.</w:t>
+      </w:r>
+      <w:r>
+        <w:t xml:space="preserve">, 2024; Park</w:t>
+      </w:r>
+      <w:r>
+        <w:t xml:space="preserve"> </w:t>
+      </w:r>
+      <w:r>
+        <w:rPr>
+          <w:i/>
+          <w:iCs/>
+        </w:rPr>
+        <w:t xml:space="preserve">et al.</w:t>
+      </w:r>
+      <w:r>
+        <w:t xml:space="preserve">, 2024; Wang</w:t>
+      </w:r>
+      <w:r>
+        <w:t xml:space="preserve"> </w:t>
+      </w:r>
+      <w:r>
+        <w:rPr>
+          <w:i/>
+          <w:iCs/>
+        </w:rPr>
+        <w:t xml:space="preserve">et al.</w:t>
+      </w:r>
+      <w:r>
+        <w:t xml:space="preserve">, 2025) foi lido o texto integral. Dos demais trabalhos acadêmicos foram conferidos novamente o resumo e os metadados. Obras clássicas (Akerlof, Bulow, Goodhart, Siebert, Brignull, Strathern) tiveram os dados bibliográficos conferidos, sem nova leitura do texto integral.</w:t>
+      </w:r>
+    </w:p>
+    <w:p>
+      <w:pPr>
+        <w:pStyle w:val="Compact"/>
+        <w:numPr>
+          <w:ilvl w:val="0"/>
+          <w:numId w:val="1006"/>
+        </w:numPr>
+      </w:pPr>
+      <w:r>
+        <w:t xml:space="preserve">As reportagens do The Information estão atrás de</w:t>
+      </w:r>
+      <w:r>
+        <w:t xml:space="preserve"> </w:t>
+      </w:r>
+      <w:r>
+        <w:rPr>
+          <w:i/>
+          <w:iCs/>
+        </w:rPr>
+        <w:t xml:space="preserve">paywall</w:t>
+      </w:r>
+      <w:r>
+        <w:t xml:space="preserve">: título e autoria foram conferidos nos metadados das páginas, e os números citados, em resumo independente da mesma apuração (Tiger Brokers, 2026). O dia exato da primeira reportagem (21 ou 22 de janeiro de 2026) não pôde ser confirmado. Os dados vêm de fontes anônimas com conhecimento das finanças da empresa, e não de demonstração financeira auditada. Devem ser tratados como tal.</w:t>
       </w:r>
     </w:p>
     <w:p>

</xml_diff>